<commit_message>
Changed a few Tools shortcuts Working on Danish users manual
</commit_message>
<xml_diff>
--- a/Documentation/Official Documentation/Brugervejledning for IBOS Nodelæser version 5.0.0.0.docx
+++ b/Documentation/Official Documentation/Brugervejledning for IBOS Nodelæser version 5.0.0.0.docx
@@ -2190,8 +2190,8 @@
       </w:tblPr>
       <w:tblGrid>
         <w:gridCol w:w="1585"/>
-        <w:gridCol w:w="5321"/>
-        <w:gridCol w:w="2741"/>
+        <w:gridCol w:w="5320"/>
+        <w:gridCol w:w="2742"/>
       </w:tblGrid>
       <w:tr>
         <w:trPr>
@@ -2266,7 +2266,7 @@
         </w:tc>
         <w:tc>
           <w:tcPr>
-            <w:tcW w:w="5321" w:type="dxa"/>
+            <w:tcW w:w="5320" w:type="dxa"/>
             <w:tcBorders>
               <w:top w:val="single" w:sz="2" w:space="0" w:color="000000"/>
               <w:left w:val="single" w:sz="2" w:space="0" w:color="000000"/>
@@ -2294,7 +2294,7 @@
         </w:tc>
         <w:tc>
           <w:tcPr>
-            <w:tcW w:w="2741" w:type="dxa"/>
+            <w:tcW w:w="2742" w:type="dxa"/>
             <w:tcBorders>
               <w:top w:val="single" w:sz="2" w:space="0" w:color="000000"/>
               <w:left w:val="single" w:sz="2" w:space="0" w:color="000000"/>
@@ -2353,7 +2353,7 @@
         </w:tc>
         <w:tc>
           <w:tcPr>
-            <w:tcW w:w="5321" w:type="dxa"/>
+            <w:tcW w:w="5320" w:type="dxa"/>
             <w:tcBorders>
               <w:left w:val="single" w:sz="2" w:space="0" w:color="000000"/>
               <w:bottom w:val="single" w:sz="2" w:space="0" w:color="000000"/>
@@ -2396,7 +2396,7 @@
         </w:tc>
         <w:tc>
           <w:tcPr>
-            <w:tcW w:w="2741" w:type="dxa"/>
+            <w:tcW w:w="2742" w:type="dxa"/>
             <w:tcBorders>
               <w:left w:val="single" w:sz="2" w:space="0" w:color="000000"/>
               <w:bottom w:val="single" w:sz="2" w:space="0" w:color="000000"/>
@@ -2451,19 +2451,17 @@
         </w:tc>
         <w:tc>
           <w:tcPr>
-            <w:tcW w:w="5321" w:type="dxa"/>
-            <w:tcBorders>
-              <w:left w:val="single" w:sz="2" w:space="0" w:color="000000"/>
-              <w:bottom w:val="single" w:sz="2" w:space="0" w:color="000000"/>
-            </w:tcBorders>
-            <w:shd w:fill="auto" w:val="clear"/>
-          </w:tcPr>
-          <w:p>
-            <w:pPr>
-              <w:pStyle w:val="Tabelindhold"/>
-              <w:rPr>
-                <w:color w:val="C9211E"/>
-              </w:rPr>
+            <w:tcW w:w="5320" w:type="dxa"/>
+            <w:tcBorders>
+              <w:left w:val="single" w:sz="2" w:space="0" w:color="000000"/>
+              <w:bottom w:val="single" w:sz="2" w:space="0" w:color="000000"/>
+            </w:tcBorders>
+            <w:shd w:fill="auto" w:val="clear"/>
+          </w:tcPr>
+          <w:p>
+            <w:pPr>
+              <w:pStyle w:val="Tabelindhold"/>
+              <w:rPr/>
             </w:pPr>
             <w:r>
               <w:rPr>
@@ -2488,13 +2486,21 @@
                 <w:color w:val="000000"/>
                 <w:sz w:val="22"/>
               </w:rPr>
-              <w:t>fil fra seneste placering</w:t>
-            </w:r>
-          </w:p>
-        </w:tc>
-        <w:tc>
-          <w:tcPr>
-            <w:tcW w:w="2741" w:type="dxa"/>
+              <w:t xml:space="preserve">fil fra seneste </w:t>
+            </w:r>
+            <w:r>
+              <w:rPr>
+                <w:rFonts w:cs="Verdana" w:ascii="Verdana" w:hAnsi="Verdana"/>
+                <w:color w:val="000000"/>
+                <w:sz w:val="22"/>
+              </w:rPr>
+              <w:t>sti</w:t>
+            </w:r>
+          </w:p>
+        </w:tc>
+        <w:tc>
+          <w:tcPr>
+            <w:tcW w:w="2742" w:type="dxa"/>
             <w:tcBorders>
               <w:left w:val="single" w:sz="2" w:space="0" w:color="000000"/>
               <w:bottom w:val="single" w:sz="2" w:space="0" w:color="000000"/>
@@ -2549,7 +2555,7 @@
         </w:tc>
         <w:tc>
           <w:tcPr>
-            <w:tcW w:w="5321" w:type="dxa"/>
+            <w:tcW w:w="5320" w:type="dxa"/>
             <w:tcBorders>
               <w:left w:val="single" w:sz="2" w:space="0" w:color="000000"/>
               <w:bottom w:val="single" w:sz="2" w:space="0" w:color="000000"/>
@@ -2593,7 +2599,7 @@
         </w:tc>
         <w:tc>
           <w:tcPr>
-            <w:tcW w:w="2741" w:type="dxa"/>
+            <w:tcW w:w="2742" w:type="dxa"/>
             <w:tcBorders>
               <w:left w:val="single" w:sz="2" w:space="0" w:color="000000"/>
               <w:bottom w:val="single" w:sz="2" w:space="0" w:color="000000"/>
@@ -2668,7 +2674,7 @@
         </w:tc>
         <w:tc>
           <w:tcPr>
-            <w:tcW w:w="5321" w:type="dxa"/>
+            <w:tcW w:w="5320" w:type="dxa"/>
             <w:tcBorders>
               <w:left w:val="single" w:sz="2" w:space="0" w:color="000000"/>
               <w:bottom w:val="single" w:sz="2" w:space="0" w:color="000000"/>
@@ -2695,7 +2701,7 @@
         </w:tc>
         <w:tc>
           <w:tcPr>
-            <w:tcW w:w="2741" w:type="dxa"/>
+            <w:tcW w:w="2742" w:type="dxa"/>
             <w:tcBorders>
               <w:left w:val="single" w:sz="2" w:space="0" w:color="000000"/>
               <w:bottom w:val="single" w:sz="2" w:space="0" w:color="000000"/>
@@ -2754,7 +2760,7 @@
         </w:tc>
         <w:tc>
           <w:tcPr>
-            <w:tcW w:w="5321" w:type="dxa"/>
+            <w:tcW w:w="5320" w:type="dxa"/>
             <w:tcBorders>
               <w:left w:val="single" w:sz="2" w:space="0" w:color="000000"/>
               <w:bottom w:val="single" w:sz="2" w:space="0" w:color="000000"/>
@@ -2781,7 +2787,7 @@
         </w:tc>
         <w:tc>
           <w:tcPr>
-            <w:tcW w:w="2741" w:type="dxa"/>
+            <w:tcW w:w="2742" w:type="dxa"/>
             <w:tcBorders>
               <w:left w:val="single" w:sz="2" w:space="0" w:color="000000"/>
               <w:bottom w:val="single" w:sz="2" w:space="0" w:color="000000"/>
@@ -2840,7 +2846,7 @@
         </w:tc>
         <w:tc>
           <w:tcPr>
-            <w:tcW w:w="5321" w:type="dxa"/>
+            <w:tcW w:w="5320" w:type="dxa"/>
             <w:tcBorders>
               <w:left w:val="single" w:sz="2" w:space="0" w:color="000000"/>
               <w:bottom w:val="single" w:sz="2" w:space="0" w:color="000000"/>
@@ -2867,7 +2873,7 @@
         </w:tc>
         <w:tc>
           <w:tcPr>
-            <w:tcW w:w="2741" w:type="dxa"/>
+            <w:tcW w:w="2742" w:type="dxa"/>
             <w:tcBorders>
               <w:left w:val="single" w:sz="2" w:space="0" w:color="000000"/>
               <w:bottom w:val="single" w:sz="2" w:space="0" w:color="000000"/>
@@ -2926,7 +2932,7 @@
         </w:tc>
         <w:tc>
           <w:tcPr>
-            <w:tcW w:w="5321" w:type="dxa"/>
+            <w:tcW w:w="5320" w:type="dxa"/>
             <w:tcBorders>
               <w:left w:val="single" w:sz="2" w:space="0" w:color="000000"/>
               <w:bottom w:val="single" w:sz="2" w:space="0" w:color="000000"/>
@@ -2952,7 +2958,7 @@
         </w:tc>
         <w:tc>
           <w:tcPr>
-            <w:tcW w:w="2741" w:type="dxa"/>
+            <w:tcW w:w="2742" w:type="dxa"/>
             <w:tcBorders>
               <w:left w:val="single" w:sz="2" w:space="0" w:color="000000"/>
               <w:bottom w:val="single" w:sz="2" w:space="0" w:color="000000"/>
@@ -3014,22 +3020,32 @@
         </w:tc>
         <w:tc>
           <w:tcPr>
-            <w:tcW w:w="5321" w:type="dxa"/>
-            <w:tcBorders>
-              <w:left w:val="single" w:sz="2" w:space="0" w:color="000000"/>
-              <w:bottom w:val="single" w:sz="2" w:space="0" w:color="000000"/>
-            </w:tcBorders>
-            <w:shd w:fill="auto" w:val="clear"/>
-          </w:tcPr>
-          <w:p>
-            <w:pPr>
-              <w:pStyle w:val="Tabelindhold"/>
+            <w:tcW w:w="5320" w:type="dxa"/>
+            <w:tcBorders>
+              <w:left w:val="single" w:sz="2" w:space="0" w:color="000000"/>
+              <w:bottom w:val="single" w:sz="2" w:space="0" w:color="000000"/>
+            </w:tcBorders>
+            <w:shd w:fill="auto" w:val="clear"/>
+          </w:tcPr>
+          <w:p>
+            <w:pPr>
+              <w:pStyle w:val="Tabelindhold"/>
+              <w:rPr/>
+            </w:pPr>
+            <w:r>
               <w:rPr>
                 <w:rFonts w:ascii="Verdana" w:hAnsi="Verdana"/>
-                <w:color w:val="C9211E"/>
+                <w:color w:val="000000"/>
                 <w:sz w:val="22"/>
                 <w:szCs w:val="22"/>
               </w:rPr>
+              <w:t>Udskriv punktnodefil på punktprinter</w:t>
+            </w:r>
+          </w:p>
+          <w:p>
+            <w:pPr>
+              <w:pStyle w:val="Tabelindhold"/>
+              <w:rPr/>
             </w:pPr>
             <w:r>
               <w:rPr>
@@ -3038,13 +3054,13 @@
                 <w:sz w:val="22"/>
                 <w:szCs w:val="22"/>
               </w:rPr>
-              <w:t>Udskriv punktnodefil på punktprinter via Windows printdialog</w:t>
-            </w:r>
-          </w:p>
-        </w:tc>
-        <w:tc>
-          <w:tcPr>
-            <w:tcW w:w="2741" w:type="dxa"/>
+              <w:t>via Windows printdialog</w:t>
+            </w:r>
+          </w:p>
+        </w:tc>
+        <w:tc>
+          <w:tcPr>
+            <w:tcW w:w="2742" w:type="dxa"/>
             <w:tcBorders>
               <w:left w:val="single" w:sz="2" w:space="0" w:color="000000"/>
               <w:bottom w:val="single" w:sz="2" w:space="0" w:color="000000"/>
@@ -3108,22 +3124,32 @@
         </w:tc>
         <w:tc>
           <w:tcPr>
-            <w:tcW w:w="5321" w:type="dxa"/>
-            <w:tcBorders>
-              <w:left w:val="single" w:sz="2" w:space="0" w:color="000000"/>
-              <w:bottom w:val="single" w:sz="2" w:space="0" w:color="000000"/>
-            </w:tcBorders>
-            <w:shd w:fill="auto" w:val="clear"/>
-          </w:tcPr>
-          <w:p>
-            <w:pPr>
-              <w:pStyle w:val="Tabelindhold"/>
+            <w:tcW w:w="5320" w:type="dxa"/>
+            <w:tcBorders>
+              <w:left w:val="single" w:sz="2" w:space="0" w:color="000000"/>
+              <w:bottom w:val="single" w:sz="2" w:space="0" w:color="000000"/>
+            </w:tcBorders>
+            <w:shd w:fill="auto" w:val="clear"/>
+          </w:tcPr>
+          <w:p>
+            <w:pPr>
+              <w:pStyle w:val="Tabelindhold"/>
+              <w:rPr/>
+            </w:pPr>
+            <w:r>
               <w:rPr>
                 <w:rFonts w:ascii="Verdana" w:hAnsi="Verdana"/>
-                <w:color w:val="C9211E"/>
+                <w:color w:val="000000"/>
                 <w:sz w:val="22"/>
                 <w:szCs w:val="22"/>
               </w:rPr>
+              <w:t>Udskriv punktnodefil på punktprinter</w:t>
+            </w:r>
+          </w:p>
+          <w:p>
+            <w:pPr>
+              <w:pStyle w:val="Tabelindhold"/>
+              <w:rPr/>
             </w:pPr>
             <w:r>
               <w:rPr>
@@ -3132,13 +3158,13 @@
                 <w:sz w:val="22"/>
                 <w:szCs w:val="22"/>
               </w:rPr>
-              <w:t>Udskriv punktnodefil på punktprinter via externt program</w:t>
-            </w:r>
-          </w:p>
-        </w:tc>
-        <w:tc>
-          <w:tcPr>
-            <w:tcW w:w="2741" w:type="dxa"/>
+              <w:t>via externt program</w:t>
+            </w:r>
+          </w:p>
+        </w:tc>
+        <w:tc>
+          <w:tcPr>
+            <w:tcW w:w="2742" w:type="dxa"/>
             <w:tcBorders>
               <w:left w:val="single" w:sz="2" w:space="0" w:color="000000"/>
               <w:bottom w:val="single" w:sz="2" w:space="0" w:color="000000"/>
@@ -3202,7 +3228,7 @@
         </w:tc>
         <w:tc>
           <w:tcPr>
-            <w:tcW w:w="5321" w:type="dxa"/>
+            <w:tcW w:w="5320" w:type="dxa"/>
             <w:tcBorders>
               <w:left w:val="single" w:sz="2" w:space="0" w:color="000000"/>
               <w:bottom w:val="single" w:sz="2" w:space="0" w:color="000000"/>
@@ -3232,7 +3258,7 @@
         </w:tc>
         <w:tc>
           <w:tcPr>
-            <w:tcW w:w="2741" w:type="dxa"/>
+            <w:tcW w:w="2742" w:type="dxa"/>
             <w:tcBorders>
               <w:left w:val="single" w:sz="2" w:space="0" w:color="000000"/>
               <w:bottom w:val="single" w:sz="2" w:space="0" w:color="000000"/>
@@ -3295,7 +3321,7 @@
         </w:tc>
         <w:tc>
           <w:tcPr>
-            <w:tcW w:w="5321" w:type="dxa"/>
+            <w:tcW w:w="5320" w:type="dxa"/>
             <w:tcBorders>
               <w:left w:val="single" w:sz="2" w:space="0" w:color="000000"/>
               <w:bottom w:val="single" w:sz="2" w:space="0" w:color="000000"/>
@@ -3323,7 +3349,7 @@
         </w:tc>
         <w:tc>
           <w:tcPr>
-            <w:tcW w:w="2741" w:type="dxa"/>
+            <w:tcW w:w="2742" w:type="dxa"/>
             <w:tcBorders>
               <w:left w:val="single" w:sz="2" w:space="0" w:color="000000"/>
               <w:bottom w:val="single" w:sz="2" w:space="0" w:color="000000"/>
@@ -3382,7 +3408,7 @@
         </w:tc>
         <w:tc>
           <w:tcPr>
-            <w:tcW w:w="5321" w:type="dxa"/>
+            <w:tcW w:w="5320" w:type="dxa"/>
             <w:tcBorders>
               <w:left w:val="single" w:sz="2" w:space="0" w:color="000000"/>
               <w:bottom w:val="single" w:sz="2" w:space="0" w:color="000000"/>
@@ -3409,7 +3435,7 @@
         </w:tc>
         <w:tc>
           <w:tcPr>
-            <w:tcW w:w="2741" w:type="dxa"/>
+            <w:tcW w:w="2742" w:type="dxa"/>
             <w:tcBorders>
               <w:left w:val="single" w:sz="2" w:space="0" w:color="000000"/>
               <w:bottom w:val="single" w:sz="2" w:space="0" w:color="000000"/>
@@ -3468,7 +3494,7 @@
         </w:tc>
         <w:tc>
           <w:tcPr>
-            <w:tcW w:w="5321" w:type="dxa"/>
+            <w:tcW w:w="5320" w:type="dxa"/>
             <w:tcBorders>
               <w:left w:val="single" w:sz="2" w:space="0" w:color="000000"/>
               <w:bottom w:val="single" w:sz="2" w:space="0" w:color="000000"/>
@@ -3495,7 +3521,7 @@
         </w:tc>
         <w:tc>
           <w:tcPr>
-            <w:tcW w:w="2741" w:type="dxa"/>
+            <w:tcW w:w="2742" w:type="dxa"/>
             <w:tcBorders>
               <w:left w:val="single" w:sz="2" w:space="0" w:color="000000"/>
               <w:bottom w:val="single" w:sz="2" w:space="0" w:color="000000"/>
@@ -3553,7 +3579,7 @@
         </w:tc>
         <w:tc>
           <w:tcPr>
-            <w:tcW w:w="5321" w:type="dxa"/>
+            <w:tcW w:w="5320" w:type="dxa"/>
             <w:tcBorders>
               <w:left w:val="single" w:sz="2" w:space="0" w:color="000000"/>
               <w:bottom w:val="single" w:sz="2" w:space="0" w:color="000000"/>
@@ -3580,7 +3606,7 @@
         </w:tc>
         <w:tc>
           <w:tcPr>
-            <w:tcW w:w="2741" w:type="dxa"/>
+            <w:tcW w:w="2742" w:type="dxa"/>
             <w:tcBorders>
               <w:left w:val="single" w:sz="2" w:space="0" w:color="000000"/>
               <w:bottom w:val="single" w:sz="2" w:space="0" w:color="000000"/>
@@ -3638,7 +3664,7 @@
         </w:tc>
         <w:tc>
           <w:tcPr>
-            <w:tcW w:w="5321" w:type="dxa"/>
+            <w:tcW w:w="5320" w:type="dxa"/>
             <w:tcBorders>
               <w:left w:val="single" w:sz="2" w:space="0" w:color="000000"/>
               <w:bottom w:val="single" w:sz="2" w:space="0" w:color="000000"/>
@@ -3665,7 +3691,7 @@
         </w:tc>
         <w:tc>
           <w:tcPr>
-            <w:tcW w:w="2741" w:type="dxa"/>
+            <w:tcW w:w="2742" w:type="dxa"/>
             <w:tcBorders>
               <w:left w:val="single" w:sz="2" w:space="0" w:color="000000"/>
               <w:bottom w:val="single" w:sz="2" w:space="0" w:color="000000"/>
@@ -3723,7 +3749,7 @@
         </w:tc>
         <w:tc>
           <w:tcPr>
-            <w:tcW w:w="5321" w:type="dxa"/>
+            <w:tcW w:w="5320" w:type="dxa"/>
             <w:tcBorders>
               <w:left w:val="single" w:sz="2" w:space="0" w:color="000000"/>
               <w:bottom w:val="single" w:sz="2" w:space="0" w:color="000000"/>
@@ -3749,7 +3775,7 @@
         </w:tc>
         <w:tc>
           <w:tcPr>
-            <w:tcW w:w="2741" w:type="dxa"/>
+            <w:tcW w:w="2742" w:type="dxa"/>
             <w:tcBorders>
               <w:left w:val="single" w:sz="2" w:space="0" w:color="000000"/>
               <w:bottom w:val="single" w:sz="2" w:space="0" w:color="000000"/>
@@ -3807,7 +3833,7 @@
         </w:tc>
         <w:tc>
           <w:tcPr>
-            <w:tcW w:w="5321" w:type="dxa"/>
+            <w:tcW w:w="5320" w:type="dxa"/>
             <w:tcBorders>
               <w:left w:val="single" w:sz="2" w:space="0" w:color="000000"/>
               <w:bottom w:val="single" w:sz="2" w:space="0" w:color="000000"/>
@@ -3834,7 +3860,7 @@
         </w:tc>
         <w:tc>
           <w:tcPr>
-            <w:tcW w:w="2741" w:type="dxa"/>
+            <w:tcW w:w="2742" w:type="dxa"/>
             <w:tcBorders>
               <w:left w:val="single" w:sz="2" w:space="0" w:color="000000"/>
               <w:bottom w:val="single" w:sz="2" w:space="0" w:color="000000"/>
@@ -3893,7 +3919,7 @@
         </w:tc>
         <w:tc>
           <w:tcPr>
-            <w:tcW w:w="5321" w:type="dxa"/>
+            <w:tcW w:w="5320" w:type="dxa"/>
             <w:tcBorders>
               <w:left w:val="single" w:sz="2" w:space="0" w:color="000000"/>
               <w:bottom w:val="single" w:sz="2" w:space="0" w:color="000000"/>
@@ -3920,7 +3946,7 @@
         </w:tc>
         <w:tc>
           <w:tcPr>
-            <w:tcW w:w="2741" w:type="dxa"/>
+            <w:tcW w:w="2742" w:type="dxa"/>
             <w:tcBorders>
               <w:left w:val="single" w:sz="2" w:space="0" w:color="000000"/>
               <w:bottom w:val="single" w:sz="2" w:space="0" w:color="000000"/>
@@ -3979,7 +4005,7 @@
         </w:tc>
         <w:tc>
           <w:tcPr>
-            <w:tcW w:w="5321" w:type="dxa"/>
+            <w:tcW w:w="5320" w:type="dxa"/>
             <w:tcBorders>
               <w:left w:val="single" w:sz="2" w:space="0" w:color="000000"/>
               <w:bottom w:val="single" w:sz="2" w:space="0" w:color="000000"/>
@@ -4007,7 +4033,7 @@
         </w:tc>
         <w:tc>
           <w:tcPr>
-            <w:tcW w:w="2741" w:type="dxa"/>
+            <w:tcW w:w="2742" w:type="dxa"/>
             <w:tcBorders>
               <w:left w:val="single" w:sz="2" w:space="0" w:color="000000"/>
               <w:bottom w:val="single" w:sz="2" w:space="0" w:color="000000"/>
@@ -4066,7 +4092,7 @@
         </w:tc>
         <w:tc>
           <w:tcPr>
-            <w:tcW w:w="5321" w:type="dxa"/>
+            <w:tcW w:w="5320" w:type="dxa"/>
             <w:tcBorders>
               <w:left w:val="single" w:sz="2" w:space="0" w:color="000000"/>
               <w:bottom w:val="single" w:sz="2" w:space="0" w:color="000000"/>
@@ -4094,7 +4120,7 @@
         </w:tc>
         <w:tc>
           <w:tcPr>
-            <w:tcW w:w="2741" w:type="dxa"/>
+            <w:tcW w:w="2742" w:type="dxa"/>
             <w:tcBorders>
               <w:left w:val="single" w:sz="2" w:space="0" w:color="000000"/>
               <w:bottom w:val="single" w:sz="2" w:space="0" w:color="000000"/>
@@ -4153,7 +4179,7 @@
         </w:tc>
         <w:tc>
           <w:tcPr>
-            <w:tcW w:w="5321" w:type="dxa"/>
+            <w:tcW w:w="5320" w:type="dxa"/>
             <w:tcBorders>
               <w:left w:val="single" w:sz="2" w:space="0" w:color="000000"/>
               <w:bottom w:val="single" w:sz="2" w:space="0" w:color="000000"/>
@@ -4181,7 +4207,7 @@
         </w:tc>
         <w:tc>
           <w:tcPr>
-            <w:tcW w:w="2741" w:type="dxa"/>
+            <w:tcW w:w="2742" w:type="dxa"/>
             <w:tcBorders>
               <w:left w:val="single" w:sz="2" w:space="0" w:color="000000"/>
               <w:bottom w:val="single" w:sz="2" w:space="0" w:color="000000"/>
@@ -4239,7 +4265,7 @@
         </w:tc>
         <w:tc>
           <w:tcPr>
-            <w:tcW w:w="5321" w:type="dxa"/>
+            <w:tcW w:w="5320" w:type="dxa"/>
             <w:tcBorders>
               <w:left w:val="single" w:sz="2" w:space="0" w:color="000000"/>
               <w:bottom w:val="single" w:sz="2" w:space="0" w:color="000000"/>
@@ -4267,7 +4293,7 @@
         </w:tc>
         <w:tc>
           <w:tcPr>
-            <w:tcW w:w="2741" w:type="dxa"/>
+            <w:tcW w:w="2742" w:type="dxa"/>
             <w:tcBorders>
               <w:left w:val="single" w:sz="2" w:space="0" w:color="000000"/>
               <w:bottom w:val="single" w:sz="2" w:space="0" w:color="000000"/>
@@ -4326,7 +4352,7 @@
         </w:tc>
         <w:tc>
           <w:tcPr>
-            <w:tcW w:w="5321" w:type="dxa"/>
+            <w:tcW w:w="5320" w:type="dxa"/>
             <w:tcBorders>
               <w:left w:val="single" w:sz="2" w:space="0" w:color="000000"/>
               <w:bottom w:val="single" w:sz="2" w:space="0" w:color="000000"/>
@@ -4353,7 +4379,7 @@
         </w:tc>
         <w:tc>
           <w:tcPr>
-            <w:tcW w:w="2741" w:type="dxa"/>
+            <w:tcW w:w="2742" w:type="dxa"/>
             <w:tcBorders>
               <w:left w:val="single" w:sz="2" w:space="0" w:color="000000"/>
               <w:bottom w:val="single" w:sz="2" w:space="0" w:color="000000"/>
@@ -4414,7 +4440,7 @@
         </w:tc>
         <w:tc>
           <w:tcPr>
-            <w:tcW w:w="5321" w:type="dxa"/>
+            <w:tcW w:w="5320" w:type="dxa"/>
             <w:tcBorders>
               <w:left w:val="single" w:sz="2" w:space="0" w:color="000000"/>
               <w:bottom w:val="single" w:sz="2" w:space="0" w:color="000000"/>
@@ -4443,7 +4469,7 @@
         </w:tc>
         <w:tc>
           <w:tcPr>
-            <w:tcW w:w="2741" w:type="dxa"/>
+            <w:tcW w:w="2742" w:type="dxa"/>
             <w:tcBorders>
               <w:left w:val="single" w:sz="2" w:space="0" w:color="000000"/>
               <w:bottom w:val="single" w:sz="2" w:space="0" w:color="000000"/>
@@ -4503,7 +4529,7 @@
         </w:tc>
         <w:tc>
           <w:tcPr>
-            <w:tcW w:w="5321" w:type="dxa"/>
+            <w:tcW w:w="5320" w:type="dxa"/>
             <w:tcBorders>
               <w:left w:val="single" w:sz="2" w:space="0" w:color="000000"/>
               <w:bottom w:val="single" w:sz="2" w:space="0" w:color="000000"/>
@@ -4532,7 +4558,7 @@
         </w:tc>
         <w:tc>
           <w:tcPr>
-            <w:tcW w:w="2741" w:type="dxa"/>
+            <w:tcW w:w="2742" w:type="dxa"/>
             <w:tcBorders>
               <w:left w:val="single" w:sz="2" w:space="0" w:color="000000"/>
               <w:bottom w:val="single" w:sz="2" w:space="0" w:color="000000"/>
@@ -4596,7 +4622,7 @@
         </w:tc>
         <w:tc>
           <w:tcPr>
-            <w:tcW w:w="5321" w:type="dxa"/>
+            <w:tcW w:w="5320" w:type="dxa"/>
             <w:tcBorders>
               <w:left w:val="single" w:sz="2" w:space="0" w:color="000000"/>
               <w:bottom w:val="single" w:sz="2" w:space="0" w:color="000000"/>
@@ -4626,7 +4652,7 @@
         </w:tc>
         <w:tc>
           <w:tcPr>
-            <w:tcW w:w="2741" w:type="dxa"/>
+            <w:tcW w:w="2742" w:type="dxa"/>
             <w:tcBorders>
               <w:left w:val="single" w:sz="2" w:space="0" w:color="000000"/>
               <w:bottom w:val="single" w:sz="2" w:space="0" w:color="000000"/>
@@ -4691,7 +4717,7 @@
         </w:tc>
         <w:tc>
           <w:tcPr>
-            <w:tcW w:w="5321" w:type="dxa"/>
+            <w:tcW w:w="5320" w:type="dxa"/>
             <w:tcBorders>
               <w:left w:val="single" w:sz="2" w:space="0" w:color="000000"/>
               <w:bottom w:val="single" w:sz="2" w:space="0" w:color="000000"/>
@@ -4721,7 +4747,7 @@
         </w:tc>
         <w:tc>
           <w:tcPr>
-            <w:tcW w:w="2741" w:type="dxa"/>
+            <w:tcW w:w="2742" w:type="dxa"/>
             <w:tcBorders>
               <w:left w:val="single" w:sz="2" w:space="0" w:color="000000"/>
               <w:bottom w:val="single" w:sz="2" w:space="0" w:color="000000"/>
@@ -4786,7 +4812,7 @@
         </w:tc>
         <w:tc>
           <w:tcPr>
-            <w:tcW w:w="5321" w:type="dxa"/>
+            <w:tcW w:w="5320" w:type="dxa"/>
             <w:tcBorders>
               <w:left w:val="single" w:sz="2" w:space="0" w:color="000000"/>
               <w:bottom w:val="single" w:sz="2" w:space="0" w:color="000000"/>
@@ -4816,7 +4842,7 @@
         </w:tc>
         <w:tc>
           <w:tcPr>
-            <w:tcW w:w="2741" w:type="dxa"/>
+            <w:tcW w:w="2742" w:type="dxa"/>
             <w:tcBorders>
               <w:left w:val="single" w:sz="2" w:space="0" w:color="000000"/>
               <w:bottom w:val="single" w:sz="2" w:space="0" w:color="000000"/>
@@ -4871,7 +4897,7 @@
             <w:r>
               <w:rPr>
                 <w:rFonts w:ascii="Verdana" w:hAnsi="Verdana"/>
-                <w:color w:val="000000"/>
+                <w:color w:val="C9211E"/>
                 <w:sz w:val="22"/>
                 <w:szCs w:val="22"/>
               </w:rPr>
@@ -4881,7 +4907,7 @@
         </w:tc>
         <w:tc>
           <w:tcPr>
-            <w:tcW w:w="5321" w:type="dxa"/>
+            <w:tcW w:w="5320" w:type="dxa"/>
             <w:tcBorders>
               <w:left w:val="single" w:sz="2" w:space="0" w:color="000000"/>
               <w:bottom w:val="single" w:sz="2" w:space="0" w:color="000000"/>
@@ -4894,6 +4920,38 @@
               <w:rPr>
                 <w:rFonts w:ascii="Verdana" w:hAnsi="Verdana"/>
                 <w:color w:val="C9211E"/>
+                <w:sz w:val="21"/>
+                <w:szCs w:val="21"/>
+              </w:rPr>
+            </w:pPr>
+            <w:r>
+              <w:rPr>
+                <w:rFonts w:ascii="Verdana" w:hAnsi="Verdana"/>
+                <w:color w:val="C9211E"/>
+                <w:sz w:val="21"/>
+                <w:szCs w:val="21"/>
+              </w:rPr>
+              <w:t>Indstillinger for højhastigheds punktprinter profil</w:t>
+            </w:r>
+          </w:p>
+        </w:tc>
+        <w:tc>
+          <w:tcPr>
+            <w:tcW w:w="2742" w:type="dxa"/>
+            <w:tcBorders>
+              <w:left w:val="single" w:sz="2" w:space="0" w:color="000000"/>
+              <w:bottom w:val="single" w:sz="2" w:space="0" w:color="000000"/>
+              <w:right w:val="single" w:sz="2" w:space="0" w:color="000000"/>
+            </w:tcBorders>
+            <w:shd w:fill="auto" w:val="clear"/>
+          </w:tcPr>
+          <w:p>
+            <w:pPr>
+              <w:pStyle w:val="Tabelindhold"/>
+              <w:snapToGrid w:val="false"/>
+              <w:rPr>
+                <w:rFonts w:ascii="Verdana" w:hAnsi="Verdana"/>
+                <w:color w:val="C9211E"/>
                 <w:sz w:val="22"/>
                 <w:szCs w:val="22"/>
               </w:rPr>
@@ -4901,43 +4959,11 @@
             <w:r>
               <w:rPr>
                 <w:rFonts w:ascii="Verdana" w:hAnsi="Verdana"/>
-                <w:color w:val="000000"/>
+                <w:color w:val="C9211E"/>
                 <w:sz w:val="22"/>
                 <w:szCs w:val="22"/>
               </w:rPr>
-              <w:t>Indstillinger for universel Brailleapparat profil</w:t>
-            </w:r>
-          </w:p>
-        </w:tc>
-        <w:tc>
-          <w:tcPr>
-            <w:tcW w:w="2741" w:type="dxa"/>
-            <w:tcBorders>
-              <w:left w:val="single" w:sz="2" w:space="0" w:color="000000"/>
-              <w:bottom w:val="single" w:sz="2" w:space="0" w:color="000000"/>
-              <w:right w:val="single" w:sz="2" w:space="0" w:color="000000"/>
-            </w:tcBorders>
-            <w:shd w:fill="auto" w:val="clear"/>
-          </w:tcPr>
-          <w:p>
-            <w:pPr>
-              <w:pStyle w:val="Tabelindhold"/>
-              <w:snapToGrid w:val="false"/>
-              <w:rPr>
-                <w:rFonts w:ascii="Verdana" w:hAnsi="Verdana" w:cs="Verdana"/>
-                <w:color w:val="C9211E"/>
-                <w:sz w:val="22"/>
-                <w:szCs w:val="22"/>
-              </w:rPr>
-            </w:pPr>
-            <w:r>
-              <w:rPr>
-                <w:rFonts w:cs="Verdana" w:ascii="Verdana" w:hAnsi="Verdana"/>
-                <w:color w:val="000000"/>
-                <w:sz w:val="22"/>
-                <w:szCs w:val="22"/>
-              </w:rPr>
-              <w:t xml:space="preserve">ALT + I + U </w:t>
+              <w:t>ALT + I + H</w:t>
             </w:r>
           </w:p>
         </w:tc>
@@ -4976,7 +5002,7 @@
         </w:tc>
         <w:tc>
           <w:tcPr>
-            <w:tcW w:w="5321" w:type="dxa"/>
+            <w:tcW w:w="5320" w:type="dxa"/>
             <w:tcBorders>
               <w:left w:val="single" w:sz="2" w:space="0" w:color="000000"/>
               <w:bottom w:val="single" w:sz="2" w:space="0" w:color="000000"/>
@@ -5000,13 +5026,13 @@
                 <w:sz w:val="22"/>
                 <w:szCs w:val="22"/>
               </w:rPr>
-              <w:t>Reset alle indstillinger til standard værdier</w:t>
-            </w:r>
-          </w:p>
-        </w:tc>
-        <w:tc>
-          <w:tcPr>
-            <w:tcW w:w="2741" w:type="dxa"/>
+              <w:t>Indstillinger for universel Brailleapparat profil</w:t>
+            </w:r>
+          </w:p>
+        </w:tc>
+        <w:tc>
+          <w:tcPr>
+            <w:tcW w:w="2742" w:type="dxa"/>
             <w:tcBorders>
               <w:left w:val="single" w:sz="2" w:space="0" w:color="000000"/>
               <w:bottom w:val="single" w:sz="2" w:space="0" w:color="000000"/>
@@ -5032,7 +5058,7 @@
                 <w:sz w:val="22"/>
                 <w:szCs w:val="22"/>
               </w:rPr>
-              <w:t>ALT + I + R</w:t>
+              <w:t xml:space="preserve">ALT + I + U </w:t>
             </w:r>
           </w:p>
         </w:tc>
@@ -5052,66 +5078,56 @@
             <w:pPr>
               <w:pStyle w:val="Tabelindhold"/>
               <w:rPr>
-                <w:rFonts w:ascii="Verdana" w:hAnsi="Verdana" w:cs="Verdana"/>
-                <w:sz w:val="22"/>
-              </w:rPr>
-            </w:pPr>
-            <w:r>
-              <w:rPr>
-                <w:rFonts w:cs="Verdana" w:ascii="Verdana" w:hAnsi="Verdana"/>
-                <w:color w:val="000000"/>
-                <w:sz w:val="22"/>
-              </w:rPr>
-              <w:t>Værktøjer</w:t>
-            </w:r>
-          </w:p>
-        </w:tc>
-        <w:tc>
-          <w:tcPr>
-            <w:tcW w:w="5321" w:type="dxa"/>
-            <w:tcBorders>
-              <w:left w:val="single" w:sz="2" w:space="0" w:color="000000"/>
-              <w:bottom w:val="single" w:sz="2" w:space="0" w:color="000000"/>
-            </w:tcBorders>
-            <w:shd w:fill="auto" w:val="clear"/>
-          </w:tcPr>
-          <w:p>
-            <w:pPr>
-              <w:pStyle w:val="Tabelindhold"/>
-              <w:rPr>
-                <w:color w:val="000000"/>
-              </w:rPr>
-            </w:pPr>
-            <w:r>
-              <w:rPr>
-                <w:rFonts w:cs="Verdana" w:ascii="Verdana" w:hAnsi="Verdana"/>
-                <w:color w:val="000000"/>
-                <w:sz w:val="22"/>
-              </w:rPr>
-              <w:t>Start MuseScore med valgte MusicXml</w:t>
-            </w:r>
-            <w:r>
-              <w:rPr>
-                <w:rFonts w:cs="Verdana" w:ascii="Verdana" w:hAnsi="Verdana"/>
-                <w:color w:val="000000"/>
-                <w:sz w:val="22"/>
-                <w:lang w:val="da-DK"/>
-              </w:rPr>
-              <w:t>-</w:t>
-            </w:r>
-            <w:r>
-              <w:rPr>
-                <w:rFonts w:cs="Verdana" w:ascii="Verdana" w:hAnsi="Verdana"/>
-                <w:color w:val="000000"/>
-                <w:sz w:val="22"/>
-              </w:rPr>
-              <w:t>fil</w:t>
-            </w:r>
-          </w:p>
-        </w:tc>
-        <w:tc>
-          <w:tcPr>
-            <w:tcW w:w="2741" w:type="dxa"/>
+                <w:rFonts w:ascii="Verdana" w:hAnsi="Verdana"/>
+                <w:color w:val="C9211E"/>
+                <w:sz w:val="22"/>
+                <w:szCs w:val="22"/>
+              </w:rPr>
+            </w:pPr>
+            <w:r>
+              <w:rPr>
+                <w:rFonts w:ascii="Verdana" w:hAnsi="Verdana"/>
+                <w:color w:val="000000"/>
+                <w:sz w:val="22"/>
+                <w:szCs w:val="22"/>
+              </w:rPr>
+              <w:t>Indstillinger</w:t>
+            </w:r>
+          </w:p>
+        </w:tc>
+        <w:tc>
+          <w:tcPr>
+            <w:tcW w:w="5320" w:type="dxa"/>
+            <w:tcBorders>
+              <w:left w:val="single" w:sz="2" w:space="0" w:color="000000"/>
+              <w:bottom w:val="single" w:sz="2" w:space="0" w:color="000000"/>
+            </w:tcBorders>
+            <w:shd w:fill="auto" w:val="clear"/>
+          </w:tcPr>
+          <w:p>
+            <w:pPr>
+              <w:pStyle w:val="Tabelindhold"/>
+              <w:rPr>
+                <w:rFonts w:ascii="Verdana" w:hAnsi="Verdana"/>
+                <w:color w:val="C9211E"/>
+                <w:sz w:val="22"/>
+                <w:szCs w:val="22"/>
+              </w:rPr>
+            </w:pPr>
+            <w:r>
+              <w:rPr>
+                <w:rFonts w:ascii="Verdana" w:hAnsi="Verdana"/>
+                <w:color w:val="000000"/>
+                <w:sz w:val="22"/>
+                <w:szCs w:val="22"/>
+              </w:rPr>
+              <w:t>Reset alle indstillinger til standard værdier</w:t>
+            </w:r>
+          </w:p>
+        </w:tc>
+        <w:tc>
+          <w:tcPr>
+            <w:tcW w:w="2742" w:type="dxa"/>
             <w:tcBorders>
               <w:left w:val="single" w:sz="2" w:space="0" w:color="000000"/>
               <w:bottom w:val="single" w:sz="2" w:space="0" w:color="000000"/>
@@ -5127,15 +5143,17 @@
                 <w:rFonts w:ascii="Verdana" w:hAnsi="Verdana" w:cs="Verdana"/>
                 <w:color w:val="C9211E"/>
                 <w:sz w:val="22"/>
-              </w:rPr>
-            </w:pPr>
-            <w:r>
-              <w:rPr>
-                <w:rFonts w:cs="Verdana" w:ascii="Verdana" w:hAnsi="Verdana"/>
-                <w:color w:val="000000"/>
-                <w:sz w:val="22"/>
-              </w:rPr>
-              <w:t>ALT + T + M</w:t>
+                <w:szCs w:val="22"/>
+              </w:rPr>
+            </w:pPr>
+            <w:r>
+              <w:rPr>
+                <w:rFonts w:cs="Verdana" w:ascii="Verdana" w:hAnsi="Verdana"/>
+                <w:color w:val="000000"/>
+                <w:sz w:val="22"/>
+                <w:szCs w:val="22"/>
+              </w:rPr>
+              <w:t>ALT + I + R</w:t>
             </w:r>
           </w:p>
         </w:tc>
@@ -5155,15 +5173,18 @@
             <w:pPr>
               <w:pStyle w:val="Tabelindhold"/>
               <w:rPr>
-                <w:rFonts w:ascii="Verdana" w:hAnsi="Verdana" w:cs="Verdana"/>
-                <w:sz w:val="22"/>
-              </w:rPr>
-            </w:pPr>
-            <w:r>
-              <w:rPr>
-                <w:rFonts w:cs="Verdana" w:ascii="Verdana" w:hAnsi="Verdana"/>
-                <w:color w:val="000000"/>
-                <w:sz w:val="22"/>
+                <w:rFonts w:ascii="Verdana" w:hAnsi="Verdana"/>
+                <w:color w:val="C9211E"/>
+                <w:sz w:val="22"/>
+                <w:szCs w:val="22"/>
+              </w:rPr>
+            </w:pPr>
+            <w:r>
+              <w:rPr>
+                <w:rFonts w:ascii="Verdana" w:hAnsi="Verdana"/>
+                <w:color w:val="C9211E"/>
+                <w:sz w:val="22"/>
+                <w:szCs w:val="22"/>
               </w:rPr>
               <w:t>Værktøjer</w:t>
             </w:r>
@@ -5171,50 +5192,37 @@
         </w:tc>
         <w:tc>
           <w:tcPr>
-            <w:tcW w:w="5321" w:type="dxa"/>
-            <w:tcBorders>
-              <w:left w:val="single" w:sz="2" w:space="0" w:color="000000"/>
-              <w:bottom w:val="single" w:sz="2" w:space="0" w:color="000000"/>
-            </w:tcBorders>
-            <w:shd w:fill="auto" w:val="clear"/>
-          </w:tcPr>
-          <w:p>
-            <w:pPr>
-              <w:pStyle w:val="Tabelindhold"/>
-              <w:rPr>
-                <w:color w:val="000000"/>
-              </w:rPr>
-            </w:pPr>
-            <w:r>
-              <w:rPr>
-                <w:rFonts w:cs="Verdana" w:ascii="Verdana" w:hAnsi="Verdana"/>
-                <w:color w:val="000000"/>
-                <w:sz w:val="22"/>
-              </w:rPr>
-              <w:t>Start Sibelius med valgte MusicXml</w:t>
-            </w:r>
-            <w:r>
-              <w:rPr>
-                <w:rFonts w:cs="Verdana" w:ascii="Verdana" w:hAnsi="Verdana"/>
-                <w:color w:val="000000"/>
-                <w:sz w:val="22"/>
-                <w:lang w:val="da-DK"/>
-              </w:rPr>
-              <w:t>-</w:t>
-            </w:r>
-            <w:r>
-              <w:rPr>
-                <w:rFonts w:cs="Verdana" w:ascii="Verdana" w:hAnsi="Verdana"/>
-                <w:color w:val="000000"/>
-                <w:sz w:val="22"/>
-              </w:rPr>
-              <w:t>fil</w:t>
-            </w:r>
-          </w:p>
-        </w:tc>
-        <w:tc>
-          <w:tcPr>
-            <w:tcW w:w="2741" w:type="dxa"/>
+            <w:tcW w:w="5320" w:type="dxa"/>
+            <w:tcBorders>
+              <w:left w:val="single" w:sz="2" w:space="0" w:color="000000"/>
+              <w:bottom w:val="single" w:sz="2" w:space="0" w:color="000000"/>
+            </w:tcBorders>
+            <w:shd w:fill="auto" w:val="clear"/>
+          </w:tcPr>
+          <w:p>
+            <w:pPr>
+              <w:pStyle w:val="Tabelindhold"/>
+              <w:rPr>
+                <w:rFonts w:ascii="Verdana" w:hAnsi="Verdana"/>
+                <w:color w:val="C9211E"/>
+                <w:sz w:val="22"/>
+                <w:szCs w:val="22"/>
+              </w:rPr>
+            </w:pPr>
+            <w:r>
+              <w:rPr>
+                <w:rFonts w:ascii="Verdana" w:hAnsi="Verdana"/>
+                <w:color w:val="C9211E"/>
+                <w:sz w:val="22"/>
+                <w:szCs w:val="22"/>
+              </w:rPr>
+              <w:t>Start IBOS Punktnodelæser</w:t>
+            </w:r>
+          </w:p>
+        </w:tc>
+        <w:tc>
+          <w:tcPr>
+            <w:tcW w:w="2742" w:type="dxa"/>
             <w:tcBorders>
               <w:left w:val="single" w:sz="2" w:space="0" w:color="000000"/>
               <w:bottom w:val="single" w:sz="2" w:space="0" w:color="000000"/>
@@ -5227,18 +5235,29 @@
               <w:pStyle w:val="Tabelindhold"/>
               <w:snapToGrid w:val="false"/>
               <w:rPr>
-                <w:rFonts w:ascii="Verdana" w:hAnsi="Verdana" w:cs="Verdana"/>
+                <w:rFonts w:ascii="Verdana" w:hAnsi="Verdana"/>
                 <w:color w:val="C9211E"/>
                 <w:sz w:val="22"/>
-              </w:rPr>
-            </w:pPr>
-            <w:r>
-              <w:rPr>
-                <w:rFonts w:cs="Verdana" w:ascii="Verdana" w:hAnsi="Verdana"/>
-                <w:color w:val="000000"/>
-                <w:sz w:val="22"/>
-              </w:rPr>
-              <w:t>ALT + T + S</w:t>
+                <w:szCs w:val="22"/>
+              </w:rPr>
+            </w:pPr>
+            <w:r>
+              <w:rPr>
+                <w:rFonts w:ascii="Verdana" w:hAnsi="Verdana"/>
+                <w:color w:val="C9211E"/>
+                <w:sz w:val="22"/>
+                <w:szCs w:val="22"/>
+              </w:rPr>
+              <w:t xml:space="preserve">ALT + T + </w:t>
+            </w:r>
+            <w:r>
+              <w:rPr>
+                <w:rFonts w:ascii="Verdana" w:hAnsi="Verdana"/>
+                <w:color w:val="C9211E"/>
+                <w:sz w:val="22"/>
+                <w:szCs w:val="22"/>
+              </w:rPr>
+              <w:t>I</w:t>
             </w:r>
           </w:p>
         </w:tc>
@@ -5258,89 +5277,90 @@
             <w:pPr>
               <w:pStyle w:val="Tabelindhold"/>
               <w:rPr>
+                <w:rFonts w:ascii="Verdana" w:hAnsi="Verdana" w:cs="Verdana"/>
+                <w:sz w:val="22"/>
+              </w:rPr>
+            </w:pPr>
+            <w:r>
+              <w:rPr>
+                <w:rFonts w:cs="Verdana" w:ascii="Verdana" w:hAnsi="Verdana"/>
+                <w:color w:val="000000"/>
+                <w:sz w:val="22"/>
+              </w:rPr>
+              <w:t>Værktøjer</w:t>
+            </w:r>
+          </w:p>
+        </w:tc>
+        <w:tc>
+          <w:tcPr>
+            <w:tcW w:w="5320" w:type="dxa"/>
+            <w:tcBorders>
+              <w:left w:val="single" w:sz="2" w:space="0" w:color="000000"/>
+              <w:bottom w:val="single" w:sz="2" w:space="0" w:color="000000"/>
+            </w:tcBorders>
+            <w:shd w:fill="auto" w:val="clear"/>
+          </w:tcPr>
+          <w:p>
+            <w:pPr>
+              <w:pStyle w:val="Tabelindhold"/>
+              <w:rPr>
+                <w:color w:val="000000"/>
+              </w:rPr>
+            </w:pPr>
+            <w:r>
+              <w:rPr>
+                <w:rFonts w:cs="Verdana" w:ascii="Verdana" w:hAnsi="Verdana"/>
+                <w:color w:val="000000"/>
+                <w:sz w:val="22"/>
+              </w:rPr>
+              <w:t>Start MuseScore med valgte MusicXml</w:t>
+            </w:r>
+            <w:r>
+              <w:rPr>
+                <w:rFonts w:cs="Verdana" w:ascii="Verdana" w:hAnsi="Verdana"/>
+                <w:color w:val="000000"/>
+                <w:sz w:val="22"/>
+                <w:lang w:val="da-DK"/>
+              </w:rPr>
+              <w:t>-</w:t>
+            </w:r>
+            <w:r>
+              <w:rPr>
+                <w:rFonts w:cs="Verdana" w:ascii="Verdana" w:hAnsi="Verdana"/>
+                <w:color w:val="000000"/>
+                <w:sz w:val="22"/>
+              </w:rPr>
+              <w:t>fil</w:t>
+            </w:r>
+          </w:p>
+        </w:tc>
+        <w:tc>
+          <w:tcPr>
+            <w:tcW w:w="2742" w:type="dxa"/>
+            <w:tcBorders>
+              <w:left w:val="single" w:sz="2" w:space="0" w:color="000000"/>
+              <w:bottom w:val="single" w:sz="2" w:space="0" w:color="000000"/>
+              <w:right w:val="single" w:sz="2" w:space="0" w:color="000000"/>
+            </w:tcBorders>
+            <w:shd w:fill="auto" w:val="clear"/>
+          </w:tcPr>
+          <w:p>
+            <w:pPr>
+              <w:pStyle w:val="Tabelindhold"/>
+              <w:snapToGrid w:val="false"/>
+              <w:rPr>
+                <w:rFonts w:ascii="Verdana" w:hAnsi="Verdana" w:cs="Verdana"/>
                 <w:color w:val="C9211E"/>
-              </w:rPr>
-            </w:pPr>
-            <w:r>
-              <w:rPr>
-                <w:rFonts w:cs="Verdana" w:ascii="Verdana" w:hAnsi="Verdana"/>
-                <w:color w:val="000000"/>
-                <w:sz w:val="22"/>
-              </w:rPr>
-              <w:t>Værktøjer</w:t>
-            </w:r>
-          </w:p>
-        </w:tc>
-        <w:tc>
-          <w:tcPr>
-            <w:tcW w:w="5321" w:type="dxa"/>
-            <w:tcBorders>
-              <w:left w:val="single" w:sz="2" w:space="0" w:color="000000"/>
-              <w:bottom w:val="single" w:sz="2" w:space="0" w:color="000000"/>
-            </w:tcBorders>
-            <w:shd w:fill="auto" w:val="clear"/>
-          </w:tcPr>
-          <w:p>
-            <w:pPr>
-              <w:pStyle w:val="Tabelindhold"/>
-              <w:rPr>
-                <w:color w:val="C9211E"/>
-              </w:rPr>
-            </w:pPr>
-            <w:r>
-              <w:rPr>
-                <w:rFonts w:cs="Verdana" w:ascii="Verdana" w:hAnsi="Verdana"/>
-                <w:color w:val="000000"/>
-                <w:sz w:val="22"/>
-              </w:rPr>
-              <w:t>Start Capella med valgte MusicXml</w:t>
-            </w:r>
-            <w:r>
-              <w:rPr>
-                <w:rFonts w:cs="Verdana" w:ascii="Verdana" w:hAnsi="Verdana"/>
-                <w:color w:val="000000"/>
-                <w:sz w:val="22"/>
-                <w:lang w:val="da-DK"/>
-              </w:rPr>
-              <w:t>-</w:t>
-            </w:r>
-            <w:r>
-              <w:rPr>
-                <w:rFonts w:cs="Verdana" w:ascii="Verdana" w:hAnsi="Verdana"/>
-                <w:color w:val="000000"/>
-                <w:sz w:val="22"/>
-              </w:rPr>
-              <w:t>fil</w:t>
-            </w:r>
-          </w:p>
-        </w:tc>
-        <w:tc>
-          <w:tcPr>
-            <w:tcW w:w="2741" w:type="dxa"/>
-            <w:tcBorders>
-              <w:left w:val="single" w:sz="2" w:space="0" w:color="000000"/>
-              <w:bottom w:val="single" w:sz="2" w:space="0" w:color="000000"/>
-              <w:right w:val="single" w:sz="2" w:space="0" w:color="000000"/>
-            </w:tcBorders>
-            <w:shd w:fill="auto" w:val="clear"/>
-          </w:tcPr>
-          <w:p>
-            <w:pPr>
-              <w:pStyle w:val="Tabelindhold"/>
-              <w:snapToGrid w:val="false"/>
-              <w:rPr>
-                <w:rFonts w:ascii="Verdana" w:hAnsi="Verdana" w:cs="Verdana"/>
-                <w:color w:val="C9211E"/>
-                <w:sz w:val="22"/>
-              </w:rPr>
-            </w:pPr>
-            <w:r>
-              <w:rPr>
-                <w:rFonts w:cs="Verdana" w:ascii="Verdana" w:hAnsi="Verdana"/>
-                <w:color w:val="000000"/>
-                <w:sz w:val="22"/>
-              </w:rPr>
-              <w:t>ALT + T + C</w:t>
+                <w:sz w:val="22"/>
+              </w:rPr>
+            </w:pPr>
+            <w:r>
+              <w:rPr>
+                <w:rFonts w:cs="Verdana" w:ascii="Verdana" w:hAnsi="Verdana"/>
+                <w:color w:val="000000"/>
+                <w:sz w:val="22"/>
+              </w:rPr>
+              <w:t>ALT + T + M</w:t>
             </w:r>
           </w:p>
         </w:tc>
@@ -5360,89 +5380,90 @@
             <w:pPr>
               <w:pStyle w:val="Tabelindhold"/>
               <w:rPr>
+                <w:rFonts w:ascii="Verdana" w:hAnsi="Verdana" w:cs="Verdana"/>
+                <w:sz w:val="22"/>
+              </w:rPr>
+            </w:pPr>
+            <w:r>
+              <w:rPr>
+                <w:rFonts w:cs="Verdana" w:ascii="Verdana" w:hAnsi="Verdana"/>
+                <w:color w:val="000000"/>
+                <w:sz w:val="22"/>
+              </w:rPr>
+              <w:t>Værktøjer</w:t>
+            </w:r>
+          </w:p>
+        </w:tc>
+        <w:tc>
+          <w:tcPr>
+            <w:tcW w:w="5320" w:type="dxa"/>
+            <w:tcBorders>
+              <w:left w:val="single" w:sz="2" w:space="0" w:color="000000"/>
+              <w:bottom w:val="single" w:sz="2" w:space="0" w:color="000000"/>
+            </w:tcBorders>
+            <w:shd w:fill="auto" w:val="clear"/>
+          </w:tcPr>
+          <w:p>
+            <w:pPr>
+              <w:pStyle w:val="Tabelindhold"/>
+              <w:rPr>
+                <w:color w:val="000000"/>
+              </w:rPr>
+            </w:pPr>
+            <w:r>
+              <w:rPr>
+                <w:rFonts w:cs="Verdana" w:ascii="Verdana" w:hAnsi="Verdana"/>
+                <w:color w:val="000000"/>
+                <w:sz w:val="22"/>
+              </w:rPr>
+              <w:t>Start Sibelius med valgte MusicXml</w:t>
+            </w:r>
+            <w:r>
+              <w:rPr>
+                <w:rFonts w:cs="Verdana" w:ascii="Verdana" w:hAnsi="Verdana"/>
+                <w:color w:val="000000"/>
+                <w:sz w:val="22"/>
+                <w:lang w:val="da-DK"/>
+              </w:rPr>
+              <w:t>-</w:t>
+            </w:r>
+            <w:r>
+              <w:rPr>
+                <w:rFonts w:cs="Verdana" w:ascii="Verdana" w:hAnsi="Verdana"/>
+                <w:color w:val="000000"/>
+                <w:sz w:val="22"/>
+              </w:rPr>
+              <w:t>fil</w:t>
+            </w:r>
+          </w:p>
+        </w:tc>
+        <w:tc>
+          <w:tcPr>
+            <w:tcW w:w="2742" w:type="dxa"/>
+            <w:tcBorders>
+              <w:left w:val="single" w:sz="2" w:space="0" w:color="000000"/>
+              <w:bottom w:val="single" w:sz="2" w:space="0" w:color="000000"/>
+              <w:right w:val="single" w:sz="2" w:space="0" w:color="000000"/>
+            </w:tcBorders>
+            <w:shd w:fill="auto" w:val="clear"/>
+          </w:tcPr>
+          <w:p>
+            <w:pPr>
+              <w:pStyle w:val="Tabelindhold"/>
+              <w:snapToGrid w:val="false"/>
+              <w:rPr>
+                <w:rFonts w:ascii="Verdana" w:hAnsi="Verdana" w:cs="Verdana"/>
                 <w:color w:val="C9211E"/>
-              </w:rPr>
-            </w:pPr>
-            <w:r>
-              <w:rPr>
-                <w:rFonts w:cs="Verdana" w:ascii="Verdana" w:hAnsi="Verdana"/>
-                <w:color w:val="000000"/>
-                <w:sz w:val="22"/>
-              </w:rPr>
-              <w:t>Værktøjer</w:t>
-            </w:r>
-          </w:p>
-        </w:tc>
-        <w:tc>
-          <w:tcPr>
-            <w:tcW w:w="5321" w:type="dxa"/>
-            <w:tcBorders>
-              <w:left w:val="single" w:sz="2" w:space="0" w:color="000000"/>
-              <w:bottom w:val="single" w:sz="2" w:space="0" w:color="000000"/>
-            </w:tcBorders>
-            <w:shd w:fill="auto" w:val="clear"/>
-          </w:tcPr>
-          <w:p>
-            <w:pPr>
-              <w:pStyle w:val="Tabelindhold"/>
-              <w:rPr>
-                <w:color w:val="C9211E"/>
-              </w:rPr>
-            </w:pPr>
-            <w:r>
-              <w:rPr>
-                <w:rFonts w:cs="Verdana" w:ascii="Verdana" w:hAnsi="Verdana"/>
-                <w:color w:val="000000"/>
-                <w:sz w:val="22"/>
-              </w:rPr>
-              <w:t>Start Finale med valgte MusicXml</w:t>
-            </w:r>
-            <w:r>
-              <w:rPr>
-                <w:rFonts w:cs="Verdana" w:ascii="Verdana" w:hAnsi="Verdana"/>
-                <w:color w:val="000000"/>
-                <w:sz w:val="22"/>
-                <w:lang w:val="da-DK"/>
-              </w:rPr>
-              <w:t>-</w:t>
-            </w:r>
-            <w:r>
-              <w:rPr>
-                <w:rFonts w:cs="Verdana" w:ascii="Verdana" w:hAnsi="Verdana"/>
-                <w:color w:val="000000"/>
-                <w:sz w:val="22"/>
-              </w:rPr>
-              <w:t>fil</w:t>
-            </w:r>
-          </w:p>
-        </w:tc>
-        <w:tc>
-          <w:tcPr>
-            <w:tcW w:w="2741" w:type="dxa"/>
-            <w:tcBorders>
-              <w:left w:val="single" w:sz="2" w:space="0" w:color="000000"/>
-              <w:bottom w:val="single" w:sz="2" w:space="0" w:color="000000"/>
-              <w:right w:val="single" w:sz="2" w:space="0" w:color="000000"/>
-            </w:tcBorders>
-            <w:shd w:fill="auto" w:val="clear"/>
-          </w:tcPr>
-          <w:p>
-            <w:pPr>
-              <w:pStyle w:val="Tabelindhold"/>
-              <w:snapToGrid w:val="false"/>
-              <w:rPr>
-                <w:rFonts w:ascii="Verdana" w:hAnsi="Verdana" w:cs="Verdana"/>
-                <w:color w:val="C9211E"/>
-                <w:sz w:val="22"/>
-              </w:rPr>
-            </w:pPr>
-            <w:r>
-              <w:rPr>
-                <w:rFonts w:cs="Verdana" w:ascii="Verdana" w:hAnsi="Verdana"/>
-                <w:color w:val="000000"/>
-                <w:sz w:val="22"/>
-              </w:rPr>
-              <w:t>ALT + T+ F</w:t>
+                <w:sz w:val="22"/>
+              </w:rPr>
+            </w:pPr>
+            <w:r>
+              <w:rPr>
+                <w:rFonts w:cs="Verdana" w:ascii="Verdana" w:hAnsi="Verdana"/>
+                <w:color w:val="000000"/>
+                <w:sz w:val="22"/>
+              </w:rPr>
+              <w:t>ALT + T + S</w:t>
             </w:r>
           </w:p>
         </w:tc>
@@ -5462,8 +5483,7 @@
             <w:pPr>
               <w:pStyle w:val="Tabelindhold"/>
               <w:rPr>
-                <w:rFonts w:ascii="Verdana" w:hAnsi="Verdana" w:cs="Verdana"/>
-                <w:sz w:val="22"/>
+                <w:color w:val="C9211E"/>
               </w:rPr>
             </w:pPr>
             <w:r>
@@ -5478,34 +5498,50 @@
         </w:tc>
         <w:tc>
           <w:tcPr>
-            <w:tcW w:w="5321" w:type="dxa"/>
-            <w:tcBorders>
-              <w:left w:val="single" w:sz="2" w:space="0" w:color="000000"/>
-              <w:bottom w:val="single" w:sz="2" w:space="0" w:color="000000"/>
-            </w:tcBorders>
-            <w:shd w:fill="auto" w:val="clear"/>
-          </w:tcPr>
-          <w:p>
-            <w:pPr>
-              <w:pStyle w:val="Tabelindhold"/>
-              <w:rPr>
-                <w:rFonts w:ascii="Verdana" w:hAnsi="Verdana" w:cs="Verdana"/>
-                <w:sz w:val="22"/>
-              </w:rPr>
-            </w:pPr>
-            <w:r>
-              <w:rPr>
-                <w:rFonts w:cs="Verdana" w:ascii="Verdana" w:hAnsi="Verdana"/>
-                <w:color w:val="000000"/>
-                <w:sz w:val="22"/>
-              </w:rPr>
-              <w:t>Vis Logfil</w:t>
-            </w:r>
-          </w:p>
-        </w:tc>
-        <w:tc>
-          <w:tcPr>
-            <w:tcW w:w="2741" w:type="dxa"/>
+            <w:tcW w:w="5320" w:type="dxa"/>
+            <w:tcBorders>
+              <w:left w:val="single" w:sz="2" w:space="0" w:color="000000"/>
+              <w:bottom w:val="single" w:sz="2" w:space="0" w:color="000000"/>
+            </w:tcBorders>
+            <w:shd w:fill="auto" w:val="clear"/>
+          </w:tcPr>
+          <w:p>
+            <w:pPr>
+              <w:pStyle w:val="Tabelindhold"/>
+              <w:rPr>
+                <w:color w:val="C9211E"/>
+              </w:rPr>
+            </w:pPr>
+            <w:r>
+              <w:rPr>
+                <w:rFonts w:cs="Verdana" w:ascii="Verdana" w:hAnsi="Verdana"/>
+                <w:color w:val="000000"/>
+                <w:sz w:val="22"/>
+              </w:rPr>
+              <w:t>Start Capella med valgte MusicXml</w:t>
+            </w:r>
+            <w:r>
+              <w:rPr>
+                <w:rFonts w:cs="Verdana" w:ascii="Verdana" w:hAnsi="Verdana"/>
+                <w:color w:val="000000"/>
+                <w:sz w:val="22"/>
+                <w:lang w:val="da-DK"/>
+              </w:rPr>
+              <w:t>-</w:t>
+            </w:r>
+            <w:r>
+              <w:rPr>
+                <w:rFonts w:cs="Verdana" w:ascii="Verdana" w:hAnsi="Verdana"/>
+                <w:color w:val="000000"/>
+                <w:sz w:val="22"/>
+              </w:rPr>
+              <w:t>fil</w:t>
+            </w:r>
+          </w:p>
+        </w:tc>
+        <w:tc>
+          <w:tcPr>
+            <w:tcW w:w="2742" w:type="dxa"/>
             <w:tcBorders>
               <w:left w:val="single" w:sz="2" w:space="0" w:color="000000"/>
               <w:bottom w:val="single" w:sz="2" w:space="0" w:color="000000"/>
@@ -5519,16 +5555,17 @@
               <w:snapToGrid w:val="false"/>
               <w:rPr>
                 <w:rFonts w:ascii="Verdana" w:hAnsi="Verdana" w:cs="Verdana"/>
-                <w:color w:val="000000"/>
-                <w:sz w:val="22"/>
-              </w:rPr>
-            </w:pPr>
-            <w:r>
-              <w:rPr>
-                <w:rFonts w:cs="Verdana" w:ascii="Verdana" w:hAnsi="Verdana"/>
-                <w:color w:val="000000"/>
-                <w:sz w:val="22"/>
-              </w:rPr>
+                <w:color w:val="C9211E"/>
+                <w:sz w:val="22"/>
+              </w:rPr>
+            </w:pPr>
+            <w:r>
+              <w:rPr>
+                <w:rFonts w:cs="Verdana" w:ascii="Verdana" w:hAnsi="Verdana"/>
+                <w:color w:val="000000"/>
+                <w:sz w:val="22"/>
+              </w:rPr>
+              <w:t>ALT + T + C</w:t>
             </w:r>
           </w:p>
         </w:tc>
@@ -5548,10 +5585,10 @@
             <w:pPr>
               <w:pStyle w:val="Tabelindhold"/>
               <w:rPr>
-                <w:rFonts w:ascii="Verdana" w:hAnsi="Verdana" w:cs="Verdana"/>
-                <w:sz w:val="22"/>
-              </w:rPr>
-            </w:pPr>
+                <w:color w:val="C9211E"/>
+              </w:rPr>
+            </w:pPr>
+            <w:bookmarkStart w:id="3" w:name="__DdeLink__1958_1889949375"/>
             <w:r>
               <w:rPr>
                 <w:rFonts w:cs="Verdana" w:ascii="Verdana" w:hAnsi="Verdana"/>
@@ -5560,38 +5597,55 @@
               </w:rPr>
               <w:t>Værktøjer</w:t>
             </w:r>
-          </w:p>
-        </w:tc>
-        <w:tc>
-          <w:tcPr>
-            <w:tcW w:w="5321" w:type="dxa"/>
-            <w:tcBorders>
-              <w:left w:val="single" w:sz="2" w:space="0" w:color="000000"/>
-              <w:bottom w:val="single" w:sz="2" w:space="0" w:color="000000"/>
-            </w:tcBorders>
-            <w:shd w:fill="auto" w:val="clear"/>
-          </w:tcPr>
-          <w:p>
-            <w:pPr>
-              <w:pStyle w:val="Tabelindhold"/>
-              <w:rPr>
-                <w:rFonts w:ascii="Verdana" w:hAnsi="Verdana" w:cs="Verdana"/>
-                <w:sz w:val="22"/>
-              </w:rPr>
-            </w:pPr>
-            <w:r>
-              <w:rPr>
-                <w:rFonts w:cs="Verdana" w:ascii="Verdana" w:hAnsi="Verdana"/>
-                <w:color w:val="000000"/>
-                <w:sz w:val="22"/>
-              </w:rPr>
-              <w:t>Åbn Logfil placering i Stifinder</w:t>
-            </w:r>
-          </w:p>
-        </w:tc>
-        <w:tc>
-          <w:tcPr>
-            <w:tcW w:w="2741" w:type="dxa"/>
+            <w:bookmarkEnd w:id="3"/>
+          </w:p>
+        </w:tc>
+        <w:tc>
+          <w:tcPr>
+            <w:tcW w:w="5320" w:type="dxa"/>
+            <w:tcBorders>
+              <w:left w:val="single" w:sz="2" w:space="0" w:color="000000"/>
+              <w:bottom w:val="single" w:sz="2" w:space="0" w:color="000000"/>
+            </w:tcBorders>
+            <w:shd w:fill="auto" w:val="clear"/>
+          </w:tcPr>
+          <w:p>
+            <w:pPr>
+              <w:pStyle w:val="Tabelindhold"/>
+              <w:rPr>
+                <w:color w:val="C9211E"/>
+              </w:rPr>
+            </w:pPr>
+            <w:r>
+              <w:rPr>
+                <w:rFonts w:cs="Verdana" w:ascii="Verdana" w:hAnsi="Verdana"/>
+                <w:color w:val="000000"/>
+                <w:sz w:val="22"/>
+              </w:rPr>
+              <w:t>Start Finale med valgte MusicXml</w:t>
+            </w:r>
+            <w:r>
+              <w:rPr>
+                <w:rFonts w:cs="Verdana" w:ascii="Verdana" w:hAnsi="Verdana"/>
+                <w:color w:val="000000"/>
+                <w:sz w:val="22"/>
+                <w:lang w:val="da-DK"/>
+              </w:rPr>
+              <w:t>-</w:t>
+            </w:r>
+            <w:r>
+              <w:rPr>
+                <w:rFonts w:cs="Verdana" w:ascii="Verdana" w:hAnsi="Verdana"/>
+                <w:color w:val="000000"/>
+                <w:sz w:val="22"/>
+              </w:rPr>
+              <w:t>fil</w:t>
+            </w:r>
+          </w:p>
+        </w:tc>
+        <w:tc>
+          <w:tcPr>
+            <w:tcW w:w="2742" w:type="dxa"/>
             <w:tcBorders>
               <w:left w:val="single" w:sz="2" w:space="0" w:color="000000"/>
               <w:bottom w:val="single" w:sz="2" w:space="0" w:color="000000"/>
@@ -5605,16 +5659,17 @@
               <w:snapToGrid w:val="false"/>
               <w:rPr>
                 <w:rFonts w:ascii="Verdana" w:hAnsi="Verdana" w:cs="Verdana"/>
-                <w:color w:val="000000"/>
-                <w:sz w:val="22"/>
-              </w:rPr>
-            </w:pPr>
-            <w:r>
-              <w:rPr>
-                <w:rFonts w:cs="Verdana" w:ascii="Verdana" w:hAnsi="Verdana"/>
-                <w:color w:val="000000"/>
-                <w:sz w:val="22"/>
-              </w:rPr>
+                <w:color w:val="C9211E"/>
+                <w:sz w:val="22"/>
+              </w:rPr>
+            </w:pPr>
+            <w:r>
+              <w:rPr>
+                <w:rFonts w:cs="Verdana" w:ascii="Verdana" w:hAnsi="Verdana"/>
+                <w:color w:val="000000"/>
+                <w:sz w:val="22"/>
+              </w:rPr>
+              <w:t>ALT + T+ F</w:t>
             </w:r>
           </w:p>
         </w:tc>
@@ -5634,15 +5689,18 @@
             <w:pPr>
               <w:pStyle w:val="Tabelindhold"/>
               <w:rPr>
-                <w:rFonts w:ascii="Verdana" w:hAnsi="Verdana" w:cs="Verdana"/>
-                <w:sz w:val="22"/>
-              </w:rPr>
-            </w:pPr>
-            <w:r>
-              <w:rPr>
-                <w:rFonts w:cs="Verdana" w:ascii="Verdana" w:hAnsi="Verdana"/>
-                <w:color w:val="000000"/>
-                <w:sz w:val="22"/>
+                <w:rFonts w:ascii="Verdana" w:hAnsi="Verdana"/>
+                <w:color w:val="C9211E"/>
+                <w:sz w:val="22"/>
+                <w:szCs w:val="22"/>
+              </w:rPr>
+            </w:pPr>
+            <w:r>
+              <w:rPr>
+                <w:rFonts w:cs="Verdana" w:ascii="Verdana" w:hAnsi="Verdana"/>
+                <w:color w:val="C9211E"/>
+                <w:sz w:val="22"/>
+                <w:szCs w:val="22"/>
               </w:rPr>
               <w:t>Værktøjer</w:t>
             </w:r>
@@ -5650,50 +5708,37 @@
         </w:tc>
         <w:tc>
           <w:tcPr>
-            <w:tcW w:w="5321" w:type="dxa"/>
-            <w:tcBorders>
-              <w:left w:val="single" w:sz="2" w:space="0" w:color="000000"/>
-              <w:bottom w:val="single" w:sz="2" w:space="0" w:color="000000"/>
-            </w:tcBorders>
-            <w:shd w:fill="auto" w:val="clear"/>
-          </w:tcPr>
-          <w:p>
-            <w:pPr>
-              <w:pStyle w:val="Tabelindhold"/>
-              <w:rPr>
-                <w:color w:val="000000"/>
-              </w:rPr>
-            </w:pPr>
-            <w:r>
-              <w:rPr>
-                <w:rFonts w:cs="Verdana" w:ascii="Verdana" w:hAnsi="Verdana"/>
-                <w:color w:val="000000"/>
-                <w:sz w:val="22"/>
-              </w:rPr>
-              <w:t>Vis valgte MusicXml</w:t>
-            </w:r>
-            <w:r>
-              <w:rPr>
-                <w:rFonts w:cs="Verdana" w:ascii="Verdana" w:hAnsi="Verdana"/>
-                <w:color w:val="000000"/>
-                <w:sz w:val="22"/>
-                <w:lang w:val="da-DK"/>
-              </w:rPr>
-              <w:t>-</w:t>
-            </w:r>
-            <w:r>
-              <w:rPr>
-                <w:rFonts w:cs="Verdana" w:ascii="Verdana" w:hAnsi="Verdana"/>
-                <w:color w:val="000000"/>
-                <w:sz w:val="22"/>
-              </w:rPr>
-              <w:t>fil som rå XML</w:t>
-            </w:r>
-          </w:p>
-        </w:tc>
-        <w:tc>
-          <w:tcPr>
-            <w:tcW w:w="2741" w:type="dxa"/>
+            <w:tcW w:w="5320" w:type="dxa"/>
+            <w:tcBorders>
+              <w:left w:val="single" w:sz="2" w:space="0" w:color="000000"/>
+              <w:bottom w:val="single" w:sz="2" w:space="0" w:color="000000"/>
+            </w:tcBorders>
+            <w:shd w:fill="auto" w:val="clear"/>
+          </w:tcPr>
+          <w:p>
+            <w:pPr>
+              <w:pStyle w:val="Tabelindhold"/>
+              <w:rPr>
+                <w:rFonts w:ascii="Verdana" w:hAnsi="Verdana"/>
+                <w:color w:val="C9211E"/>
+                <w:sz w:val="22"/>
+                <w:szCs w:val="22"/>
+              </w:rPr>
+            </w:pPr>
+            <w:r>
+              <w:rPr>
+                <w:rFonts w:ascii="Verdana" w:hAnsi="Verdana"/>
+                <w:color w:val="C9211E"/>
+                <w:sz w:val="22"/>
+                <w:szCs w:val="22"/>
+              </w:rPr>
+              <w:t>Start PhotoScore</w:t>
+            </w:r>
+          </w:p>
+        </w:tc>
+        <w:tc>
+          <w:tcPr>
+            <w:tcW w:w="2742" w:type="dxa"/>
             <w:tcBorders>
               <w:left w:val="single" w:sz="2" w:space="0" w:color="000000"/>
               <w:bottom w:val="single" w:sz="2" w:space="0" w:color="000000"/>
@@ -5707,16 +5752,19 @@
               <w:snapToGrid w:val="false"/>
               <w:rPr>
                 <w:rFonts w:ascii="Verdana" w:hAnsi="Verdana" w:cs="Verdana"/>
-                <w:color w:val="000000"/>
-                <w:sz w:val="22"/>
-              </w:rPr>
-            </w:pPr>
-            <w:r>
-              <w:rPr>
-                <w:rFonts w:cs="Verdana" w:ascii="Verdana" w:hAnsi="Verdana"/>
-                <w:color w:val="000000"/>
-                <w:sz w:val="22"/>
-              </w:rPr>
+                <w:color w:val="C9211E"/>
+                <w:sz w:val="22"/>
+                <w:szCs w:val="22"/>
+              </w:rPr>
+            </w:pPr>
+            <w:r>
+              <w:rPr>
+                <w:rFonts w:cs="Verdana" w:ascii="Verdana" w:hAnsi="Verdana"/>
+                <w:color w:val="C9211E"/>
+                <w:sz w:val="22"/>
+                <w:szCs w:val="22"/>
+              </w:rPr>
+              <w:t>ALT + T + P</w:t>
             </w:r>
           </w:p>
         </w:tc>
@@ -5744,8 +5792,8 @@
             </w:pPr>
             <w:r>
               <w:rPr>
-                <w:rFonts w:ascii="Verdana" w:hAnsi="Verdana"/>
-                <w:color w:val="000000"/>
+                <w:rFonts w:cs="Verdana" w:ascii="Verdana" w:hAnsi="Verdana"/>
+                <w:color w:val="C9211E"/>
                 <w:sz w:val="22"/>
                 <w:szCs w:val="22"/>
               </w:rPr>
@@ -5755,7 +5803,7 @@
         </w:tc>
         <w:tc>
           <w:tcPr>
-            <w:tcW w:w="5321" w:type="dxa"/>
+            <w:tcW w:w="5320" w:type="dxa"/>
             <w:tcBorders>
               <w:left w:val="single" w:sz="2" w:space="0" w:color="000000"/>
               <w:bottom w:val="single" w:sz="2" w:space="0" w:color="000000"/>
@@ -5774,62 +5822,44 @@
             </w:pPr>
             <w:r>
               <w:rPr>
-                <w:rFonts w:cs="Verdana" w:ascii="Verdana" w:hAnsi="Verdana"/>
-                <w:color w:val="000000"/>
+                <w:rFonts w:ascii="Verdana" w:hAnsi="Verdana"/>
+                <w:color w:val="C9211E"/>
                 <w:sz w:val="22"/>
                 <w:szCs w:val="22"/>
               </w:rPr>
-              <w:t>Vis valgte MusicXml</w:t>
-            </w:r>
-            <w:r>
-              <w:rPr>
-                <w:rFonts w:cs="Verdana" w:ascii="Verdana" w:hAnsi="Verdana"/>
-                <w:color w:val="000000"/>
+              <w:t>Start Braille Music Editor 2</w:t>
+            </w:r>
+          </w:p>
+        </w:tc>
+        <w:tc>
+          <w:tcPr>
+            <w:tcW w:w="2742" w:type="dxa"/>
+            <w:tcBorders>
+              <w:left w:val="single" w:sz="2" w:space="0" w:color="000000"/>
+              <w:bottom w:val="single" w:sz="2" w:space="0" w:color="000000"/>
+              <w:right w:val="single" w:sz="2" w:space="0" w:color="000000"/>
+            </w:tcBorders>
+            <w:shd w:fill="auto" w:val="clear"/>
+          </w:tcPr>
+          <w:p>
+            <w:pPr>
+              <w:pStyle w:val="Tabelindhold"/>
+              <w:snapToGrid w:val="false"/>
+              <w:rPr>
+                <w:rFonts w:ascii="Verdana" w:hAnsi="Verdana" w:cs="Verdana"/>
+                <w:color w:val="C9211E"/>
                 <w:sz w:val="22"/>
                 <w:szCs w:val="22"/>
-                <w:lang w:val="da-DK"/>
-              </w:rPr>
-              <w:t>-</w:t>
-            </w:r>
-            <w:r>
-              <w:rPr>
-                <w:rFonts w:cs="Verdana" w:ascii="Verdana" w:hAnsi="Verdana"/>
-                <w:color w:val="000000"/>
+              </w:rPr>
+            </w:pPr>
+            <w:r>
+              <w:rPr>
+                <w:rFonts w:cs="Verdana" w:ascii="Verdana" w:hAnsi="Verdana"/>
+                <w:color w:val="C9211E"/>
                 <w:sz w:val="22"/>
                 <w:szCs w:val="22"/>
               </w:rPr>
-              <w:t>fil som rå XML med Google Chrome</w:t>
-            </w:r>
-          </w:p>
-        </w:tc>
-        <w:tc>
-          <w:tcPr>
-            <w:tcW w:w="2741" w:type="dxa"/>
-            <w:tcBorders>
-              <w:left w:val="single" w:sz="2" w:space="0" w:color="000000"/>
-              <w:bottom w:val="single" w:sz="2" w:space="0" w:color="000000"/>
-              <w:right w:val="single" w:sz="2" w:space="0" w:color="000000"/>
-            </w:tcBorders>
-            <w:shd w:fill="auto" w:val="clear"/>
-          </w:tcPr>
-          <w:p>
-            <w:pPr>
-              <w:pStyle w:val="Tabelindhold"/>
-              <w:snapToGrid w:val="false"/>
-              <w:rPr>
-                <w:rFonts w:ascii="Verdana" w:hAnsi="Verdana" w:cs="Verdana"/>
-                <w:color w:val="000000"/>
-                <w:sz w:val="22"/>
-                <w:szCs w:val="22"/>
-              </w:rPr>
-            </w:pPr>
-            <w:r>
-              <w:rPr>
-                <w:rFonts w:cs="Verdana" w:ascii="Verdana" w:hAnsi="Verdana"/>
-                <w:color w:val="000000"/>
-                <w:sz w:val="22"/>
-                <w:szCs w:val="22"/>
-              </w:rPr>
+              <w:t>ALT + T + B</w:t>
             </w:r>
           </w:p>
         </w:tc>
@@ -5865,33 +5895,34 @@
         </w:tc>
         <w:tc>
           <w:tcPr>
-            <w:tcW w:w="5321" w:type="dxa"/>
-            <w:tcBorders>
-              <w:left w:val="single" w:sz="2" w:space="0" w:color="000000"/>
-              <w:bottom w:val="single" w:sz="2" w:space="0" w:color="000000"/>
-            </w:tcBorders>
-            <w:shd w:fill="auto" w:val="clear"/>
-          </w:tcPr>
-          <w:p>
-            <w:pPr>
-              <w:pStyle w:val="Tabelindhold"/>
-              <w:rPr>
-                <w:color w:val="000000"/>
-              </w:rPr>
-            </w:pPr>
-            <w:r>
-              <w:rPr>
-                <w:rFonts w:cs="Verdana" w:ascii="Verdana" w:hAnsi="Verdana"/>
-                <w:color w:val="000000"/>
-                <w:sz w:val="22"/>
-              </w:rPr>
-              <w:t>Vis JAWS indstillinger for IBOS Nodelæser</w:t>
-            </w:r>
-          </w:p>
-        </w:tc>
-        <w:tc>
-          <w:tcPr>
-            <w:tcW w:w="2741" w:type="dxa"/>
+            <w:tcW w:w="5320" w:type="dxa"/>
+            <w:tcBorders>
+              <w:left w:val="single" w:sz="2" w:space="0" w:color="000000"/>
+              <w:bottom w:val="single" w:sz="2" w:space="0" w:color="000000"/>
+            </w:tcBorders>
+            <w:shd w:fill="auto" w:val="clear"/>
+          </w:tcPr>
+          <w:p>
+            <w:pPr>
+              <w:pStyle w:val="Tabelindhold"/>
+              <w:rPr>
+                <w:rFonts w:ascii="Verdana" w:hAnsi="Verdana" w:cs="Verdana"/>
+                <w:sz w:val="22"/>
+              </w:rPr>
+            </w:pPr>
+            <w:r>
+              <w:rPr>
+                <w:rFonts w:cs="Verdana" w:ascii="Verdana" w:hAnsi="Verdana"/>
+                <w:color w:val="000000"/>
+                <w:sz w:val="22"/>
+              </w:rPr>
+              <w:t>Vis Logfil</w:t>
+            </w:r>
+          </w:p>
+        </w:tc>
+        <w:tc>
+          <w:tcPr>
+            <w:tcW w:w="2742" w:type="dxa"/>
             <w:tcBorders>
               <w:left w:val="single" w:sz="2" w:space="0" w:color="000000"/>
               <w:bottom w:val="single" w:sz="2" w:space="0" w:color="000000"/>
@@ -5905,16 +5936,17 @@
               <w:snapToGrid w:val="false"/>
               <w:rPr>
                 <w:rFonts w:ascii="Verdana" w:hAnsi="Verdana" w:cs="Verdana"/>
-                <w:color w:val="000000"/>
-                <w:sz w:val="22"/>
-              </w:rPr>
-            </w:pPr>
-            <w:r>
-              <w:rPr>
-                <w:rFonts w:cs="Verdana" w:ascii="Verdana" w:hAnsi="Verdana"/>
-                <w:color w:val="000000"/>
-                <w:sz w:val="22"/>
-              </w:rPr>
+                <w:color w:val="C9211E"/>
+                <w:sz w:val="22"/>
+              </w:rPr>
+            </w:pPr>
+            <w:r>
+              <w:rPr>
+                <w:rFonts w:cs="Verdana" w:ascii="Verdana" w:hAnsi="Verdana"/>
+                <w:color w:val="C9211E"/>
+                <w:sz w:val="22"/>
+              </w:rPr>
+              <w:t>ALT + T + L</w:t>
             </w:r>
           </w:p>
         </w:tc>
@@ -5950,33 +5982,34 @@
         </w:tc>
         <w:tc>
           <w:tcPr>
-            <w:tcW w:w="5321" w:type="dxa"/>
-            <w:tcBorders>
-              <w:left w:val="single" w:sz="2" w:space="0" w:color="000000"/>
-              <w:bottom w:val="single" w:sz="2" w:space="0" w:color="000000"/>
-            </w:tcBorders>
-            <w:shd w:fill="auto" w:val="clear"/>
-          </w:tcPr>
-          <w:p>
-            <w:pPr>
-              <w:pStyle w:val="Tabelindhold"/>
-              <w:rPr>
-                <w:color w:val="C9211E"/>
-              </w:rPr>
-            </w:pPr>
-            <w:r>
-              <w:rPr>
-                <w:rFonts w:cs="Verdana" w:ascii="Verdana" w:hAnsi="Verdana"/>
-                <w:color w:val="000000"/>
-                <w:sz w:val="22"/>
-              </w:rPr>
-              <w:t>Vis Brugerindstillinger for denne MusicXml fil</w:t>
-            </w:r>
-          </w:p>
-        </w:tc>
-        <w:tc>
-          <w:tcPr>
-            <w:tcW w:w="2741" w:type="dxa"/>
+            <w:tcW w:w="5320" w:type="dxa"/>
+            <w:tcBorders>
+              <w:left w:val="single" w:sz="2" w:space="0" w:color="000000"/>
+              <w:bottom w:val="single" w:sz="2" w:space="0" w:color="000000"/>
+            </w:tcBorders>
+            <w:shd w:fill="auto" w:val="clear"/>
+          </w:tcPr>
+          <w:p>
+            <w:pPr>
+              <w:pStyle w:val="Tabelindhold"/>
+              <w:rPr>
+                <w:rFonts w:ascii="Verdana" w:hAnsi="Verdana" w:cs="Verdana"/>
+                <w:sz w:val="22"/>
+              </w:rPr>
+            </w:pPr>
+            <w:r>
+              <w:rPr>
+                <w:rFonts w:cs="Verdana" w:ascii="Verdana" w:hAnsi="Verdana"/>
+                <w:color w:val="000000"/>
+                <w:sz w:val="22"/>
+              </w:rPr>
+              <w:t>Åbn Logfil placering i Stifinder</w:t>
+            </w:r>
+          </w:p>
+        </w:tc>
+        <w:tc>
+          <w:tcPr>
+            <w:tcW w:w="2742" w:type="dxa"/>
             <w:tcBorders>
               <w:left w:val="single" w:sz="2" w:space="0" w:color="000000"/>
               <w:bottom w:val="single" w:sz="2" w:space="0" w:color="000000"/>
@@ -6029,13 +6062,398 @@
                 <w:color w:val="000000"/>
                 <w:sz w:val="22"/>
               </w:rPr>
+              <w:t>Værktøjer</w:t>
+            </w:r>
+          </w:p>
+        </w:tc>
+        <w:tc>
+          <w:tcPr>
+            <w:tcW w:w="5320" w:type="dxa"/>
+            <w:tcBorders>
+              <w:left w:val="single" w:sz="2" w:space="0" w:color="000000"/>
+              <w:bottom w:val="single" w:sz="2" w:space="0" w:color="000000"/>
+            </w:tcBorders>
+            <w:shd w:fill="auto" w:val="clear"/>
+          </w:tcPr>
+          <w:p>
+            <w:pPr>
+              <w:pStyle w:val="Tabelindhold"/>
+              <w:rPr>
+                <w:color w:val="000000"/>
+              </w:rPr>
+            </w:pPr>
+            <w:r>
+              <w:rPr>
+                <w:rFonts w:cs="Verdana" w:ascii="Verdana" w:hAnsi="Verdana"/>
+                <w:color w:val="000000"/>
+                <w:sz w:val="22"/>
+              </w:rPr>
+              <w:t>Vis valgte MusicXml</w:t>
+            </w:r>
+            <w:r>
+              <w:rPr>
+                <w:rFonts w:cs="Verdana" w:ascii="Verdana" w:hAnsi="Verdana"/>
+                <w:color w:val="000000"/>
+                <w:sz w:val="22"/>
+                <w:lang w:val="da-DK"/>
+              </w:rPr>
+              <w:t>-</w:t>
+            </w:r>
+            <w:r>
+              <w:rPr>
+                <w:rFonts w:cs="Verdana" w:ascii="Verdana" w:hAnsi="Verdana"/>
+                <w:color w:val="000000"/>
+                <w:sz w:val="22"/>
+              </w:rPr>
+              <w:t>fil som rå XML</w:t>
+            </w:r>
+          </w:p>
+        </w:tc>
+        <w:tc>
+          <w:tcPr>
+            <w:tcW w:w="2742" w:type="dxa"/>
+            <w:tcBorders>
+              <w:left w:val="single" w:sz="2" w:space="0" w:color="000000"/>
+              <w:bottom w:val="single" w:sz="2" w:space="0" w:color="000000"/>
+              <w:right w:val="single" w:sz="2" w:space="0" w:color="000000"/>
+            </w:tcBorders>
+            <w:shd w:fill="auto" w:val="clear"/>
+          </w:tcPr>
+          <w:p>
+            <w:pPr>
+              <w:pStyle w:val="Tabelindhold"/>
+              <w:snapToGrid w:val="false"/>
+              <w:rPr>
+                <w:rFonts w:ascii="Verdana" w:hAnsi="Verdana" w:cs="Verdana"/>
+                <w:color w:val="000000"/>
+                <w:sz w:val="22"/>
+              </w:rPr>
+            </w:pPr>
+            <w:r>
+              <w:rPr>
+                <w:rFonts w:cs="Verdana" w:ascii="Verdana" w:hAnsi="Verdana"/>
+                <w:color w:val="000000"/>
+                <w:sz w:val="22"/>
+              </w:rPr>
+            </w:r>
+          </w:p>
+        </w:tc>
+      </w:tr>
+      <w:tr>
+        <w:trPr/>
+        <w:tc>
+          <w:tcPr>
+            <w:tcW w:w="1585" w:type="dxa"/>
+            <w:tcBorders>
+              <w:left w:val="single" w:sz="2" w:space="0" w:color="000000"/>
+              <w:bottom w:val="single" w:sz="2" w:space="0" w:color="000000"/>
+            </w:tcBorders>
+            <w:shd w:fill="auto" w:val="clear"/>
+          </w:tcPr>
+          <w:p>
+            <w:pPr>
+              <w:pStyle w:val="Tabelindhold"/>
+              <w:rPr>
+                <w:rFonts w:ascii="Verdana" w:hAnsi="Verdana"/>
+                <w:color w:val="C9211E"/>
+                <w:sz w:val="22"/>
+                <w:szCs w:val="22"/>
+              </w:rPr>
+            </w:pPr>
+            <w:r>
+              <w:rPr>
+                <w:rFonts w:ascii="Verdana" w:hAnsi="Verdana"/>
+                <w:color w:val="000000"/>
+                <w:sz w:val="22"/>
+                <w:szCs w:val="22"/>
+              </w:rPr>
+              <w:t>Værktøjer</w:t>
+            </w:r>
+          </w:p>
+        </w:tc>
+        <w:tc>
+          <w:tcPr>
+            <w:tcW w:w="5320" w:type="dxa"/>
+            <w:tcBorders>
+              <w:left w:val="single" w:sz="2" w:space="0" w:color="000000"/>
+              <w:bottom w:val="single" w:sz="2" w:space="0" w:color="000000"/>
+            </w:tcBorders>
+            <w:shd w:fill="auto" w:val="clear"/>
+          </w:tcPr>
+          <w:p>
+            <w:pPr>
+              <w:pStyle w:val="Tabelindhold"/>
+              <w:rPr>
+                <w:rFonts w:ascii="Verdana" w:hAnsi="Verdana"/>
+                <w:color w:val="C9211E"/>
+                <w:sz w:val="22"/>
+                <w:szCs w:val="22"/>
+              </w:rPr>
+            </w:pPr>
+            <w:r>
+              <w:rPr>
+                <w:rFonts w:cs="Verdana" w:ascii="Verdana" w:hAnsi="Verdana"/>
+                <w:color w:val="000000"/>
+                <w:sz w:val="22"/>
+                <w:szCs w:val="22"/>
+              </w:rPr>
+              <w:t>Vis valgte MusicXml</w:t>
+            </w:r>
+            <w:r>
+              <w:rPr>
+                <w:rFonts w:cs="Verdana" w:ascii="Verdana" w:hAnsi="Verdana"/>
+                <w:color w:val="000000"/>
+                <w:sz w:val="22"/>
+                <w:szCs w:val="22"/>
+                <w:lang w:val="da-DK"/>
+              </w:rPr>
+              <w:t>-</w:t>
+            </w:r>
+            <w:r>
+              <w:rPr>
+                <w:rFonts w:cs="Verdana" w:ascii="Verdana" w:hAnsi="Verdana"/>
+                <w:color w:val="000000"/>
+                <w:sz w:val="22"/>
+                <w:szCs w:val="22"/>
+              </w:rPr>
+              <w:t>fil som rå XML med Google Chrome</w:t>
+            </w:r>
+          </w:p>
+        </w:tc>
+        <w:tc>
+          <w:tcPr>
+            <w:tcW w:w="2742" w:type="dxa"/>
+            <w:tcBorders>
+              <w:left w:val="single" w:sz="2" w:space="0" w:color="000000"/>
+              <w:bottom w:val="single" w:sz="2" w:space="0" w:color="000000"/>
+              <w:right w:val="single" w:sz="2" w:space="0" w:color="000000"/>
+            </w:tcBorders>
+            <w:shd w:fill="auto" w:val="clear"/>
+          </w:tcPr>
+          <w:p>
+            <w:pPr>
+              <w:pStyle w:val="Tabelindhold"/>
+              <w:snapToGrid w:val="false"/>
+              <w:rPr>
+                <w:rFonts w:ascii="Verdana" w:hAnsi="Verdana" w:cs="Verdana"/>
+                <w:color w:val="000000"/>
+                <w:sz w:val="22"/>
+                <w:szCs w:val="22"/>
+              </w:rPr>
+            </w:pPr>
+            <w:r>
+              <w:rPr>
+                <w:rFonts w:cs="Verdana" w:ascii="Verdana" w:hAnsi="Verdana"/>
+                <w:color w:val="000000"/>
+                <w:sz w:val="22"/>
+                <w:szCs w:val="22"/>
+              </w:rPr>
+            </w:r>
+          </w:p>
+        </w:tc>
+      </w:tr>
+      <w:tr>
+        <w:trPr/>
+        <w:tc>
+          <w:tcPr>
+            <w:tcW w:w="1585" w:type="dxa"/>
+            <w:tcBorders>
+              <w:left w:val="single" w:sz="2" w:space="0" w:color="000000"/>
+              <w:bottom w:val="single" w:sz="2" w:space="0" w:color="000000"/>
+            </w:tcBorders>
+            <w:shd w:fill="auto" w:val="clear"/>
+          </w:tcPr>
+          <w:p>
+            <w:pPr>
+              <w:pStyle w:val="Tabelindhold"/>
+              <w:rPr>
+                <w:rFonts w:ascii="Verdana" w:hAnsi="Verdana" w:cs="Verdana"/>
+                <w:sz w:val="22"/>
+              </w:rPr>
+            </w:pPr>
+            <w:r>
+              <w:rPr>
+                <w:rFonts w:cs="Verdana" w:ascii="Verdana" w:hAnsi="Verdana"/>
+                <w:color w:val="000000"/>
+                <w:sz w:val="22"/>
+              </w:rPr>
+              <w:t>Værktøjer</w:t>
+            </w:r>
+          </w:p>
+        </w:tc>
+        <w:tc>
+          <w:tcPr>
+            <w:tcW w:w="5320" w:type="dxa"/>
+            <w:tcBorders>
+              <w:left w:val="single" w:sz="2" w:space="0" w:color="000000"/>
+              <w:bottom w:val="single" w:sz="2" w:space="0" w:color="000000"/>
+            </w:tcBorders>
+            <w:shd w:fill="auto" w:val="clear"/>
+          </w:tcPr>
+          <w:p>
+            <w:pPr>
+              <w:pStyle w:val="Tabelindhold"/>
+              <w:rPr>
+                <w:color w:val="000000"/>
+              </w:rPr>
+            </w:pPr>
+            <w:r>
+              <w:rPr>
+                <w:rFonts w:cs="Verdana" w:ascii="Verdana" w:hAnsi="Verdana"/>
+                <w:color w:val="000000"/>
+                <w:sz w:val="22"/>
+              </w:rPr>
+              <w:t>Vis JAWS indstillinger for IBOS Nodelæser</w:t>
+            </w:r>
+          </w:p>
+        </w:tc>
+        <w:tc>
+          <w:tcPr>
+            <w:tcW w:w="2742" w:type="dxa"/>
+            <w:tcBorders>
+              <w:left w:val="single" w:sz="2" w:space="0" w:color="000000"/>
+              <w:bottom w:val="single" w:sz="2" w:space="0" w:color="000000"/>
+              <w:right w:val="single" w:sz="2" w:space="0" w:color="000000"/>
+            </w:tcBorders>
+            <w:shd w:fill="auto" w:val="clear"/>
+          </w:tcPr>
+          <w:p>
+            <w:pPr>
+              <w:pStyle w:val="Tabelindhold"/>
+              <w:snapToGrid w:val="false"/>
+              <w:rPr>
+                <w:rFonts w:ascii="Verdana" w:hAnsi="Verdana" w:cs="Verdana"/>
+                <w:color w:val="000000"/>
+                <w:sz w:val="22"/>
+              </w:rPr>
+            </w:pPr>
+            <w:r>
+              <w:rPr>
+                <w:rFonts w:cs="Verdana" w:ascii="Verdana" w:hAnsi="Verdana"/>
+                <w:color w:val="000000"/>
+                <w:sz w:val="22"/>
+              </w:rPr>
+            </w:r>
+          </w:p>
+        </w:tc>
+      </w:tr>
+      <w:tr>
+        <w:trPr/>
+        <w:tc>
+          <w:tcPr>
+            <w:tcW w:w="1585" w:type="dxa"/>
+            <w:tcBorders>
+              <w:left w:val="single" w:sz="2" w:space="0" w:color="000000"/>
+              <w:bottom w:val="single" w:sz="2" w:space="0" w:color="000000"/>
+            </w:tcBorders>
+            <w:shd w:fill="auto" w:val="clear"/>
+          </w:tcPr>
+          <w:p>
+            <w:pPr>
+              <w:pStyle w:val="Tabelindhold"/>
+              <w:rPr>
+                <w:rFonts w:ascii="Verdana" w:hAnsi="Verdana" w:cs="Verdana"/>
+                <w:sz w:val="22"/>
+              </w:rPr>
+            </w:pPr>
+            <w:r>
+              <w:rPr>
+                <w:rFonts w:cs="Verdana" w:ascii="Verdana" w:hAnsi="Verdana"/>
+                <w:color w:val="000000"/>
+                <w:sz w:val="22"/>
+              </w:rPr>
+              <w:t>Værktøjer</w:t>
+            </w:r>
+          </w:p>
+        </w:tc>
+        <w:tc>
+          <w:tcPr>
+            <w:tcW w:w="5320" w:type="dxa"/>
+            <w:tcBorders>
+              <w:left w:val="single" w:sz="2" w:space="0" w:color="000000"/>
+              <w:bottom w:val="single" w:sz="2" w:space="0" w:color="000000"/>
+            </w:tcBorders>
+            <w:shd w:fill="auto" w:val="clear"/>
+          </w:tcPr>
+          <w:p>
+            <w:pPr>
+              <w:pStyle w:val="Tabelindhold"/>
+              <w:rPr>
+                <w:color w:val="C9211E"/>
+              </w:rPr>
+            </w:pPr>
+            <w:r>
+              <w:rPr>
+                <w:rFonts w:cs="Verdana" w:ascii="Verdana" w:hAnsi="Verdana"/>
+                <w:color w:val="000000"/>
+                <w:sz w:val="22"/>
+              </w:rPr>
+              <w:t>Vis Brugerindstillinger for denne MusicXml fil</w:t>
+            </w:r>
+          </w:p>
+        </w:tc>
+        <w:tc>
+          <w:tcPr>
+            <w:tcW w:w="2742" w:type="dxa"/>
+            <w:tcBorders>
+              <w:left w:val="single" w:sz="2" w:space="0" w:color="000000"/>
+              <w:bottom w:val="single" w:sz="2" w:space="0" w:color="000000"/>
+              <w:right w:val="single" w:sz="2" w:space="0" w:color="000000"/>
+            </w:tcBorders>
+            <w:shd w:fill="auto" w:val="clear"/>
+          </w:tcPr>
+          <w:p>
+            <w:pPr>
+              <w:pStyle w:val="Tabelindhold"/>
+              <w:snapToGrid w:val="false"/>
+              <w:rPr>
+                <w:rFonts w:ascii="Verdana" w:hAnsi="Verdana" w:cs="Verdana"/>
+                <w:color w:val="000000"/>
+                <w:sz w:val="22"/>
+              </w:rPr>
+            </w:pPr>
+            <w:r>
+              <w:rPr>
+                <w:rFonts w:cs="Verdana" w:ascii="Verdana" w:hAnsi="Verdana"/>
+                <w:color w:val="000000"/>
+                <w:sz w:val="22"/>
+              </w:rPr>
+            </w:r>
+          </w:p>
+        </w:tc>
+      </w:tr>
+      <w:tr>
+        <w:trPr/>
+        <w:tc>
+          <w:tcPr>
+            <w:tcW w:w="1585" w:type="dxa"/>
+            <w:tcBorders>
+              <w:left w:val="single" w:sz="2" w:space="0" w:color="000000"/>
+              <w:bottom w:val="single" w:sz="2" w:space="0" w:color="000000"/>
+            </w:tcBorders>
+            <w:shd w:fill="auto" w:val="clear"/>
+          </w:tcPr>
+          <w:p>
+            <w:pPr>
+              <w:pStyle w:val="Tabelindhold"/>
+              <w:rPr>
+                <w:rFonts w:ascii="Verdana" w:hAnsi="Verdana" w:cs="Verdana"/>
+                <w:sz w:val="22"/>
+              </w:rPr>
+            </w:pPr>
+            <w:r>
+              <w:rPr>
+                <w:rFonts w:cs="Verdana" w:ascii="Verdana" w:hAnsi="Verdana"/>
+                <w:color w:val="000000"/>
+                <w:sz w:val="22"/>
+              </w:rPr>
               <w:t>Nodearkiver</w:t>
             </w:r>
           </w:p>
         </w:tc>
         <w:tc>
           <w:tcPr>
-            <w:tcW w:w="5321" w:type="dxa"/>
+            <w:tcW w:w="5320" w:type="dxa"/>
             <w:tcBorders>
               <w:left w:val="single" w:sz="2" w:space="0" w:color="000000"/>
               <w:bottom w:val="single" w:sz="2" w:space="0" w:color="000000"/>
@@ -6122,7 +6540,7 @@
         </w:tc>
         <w:tc>
           <w:tcPr>
-            <w:tcW w:w="2741" w:type="dxa"/>
+            <w:tcW w:w="2742" w:type="dxa"/>
             <w:tcBorders>
               <w:left w:val="single" w:sz="2" w:space="0" w:color="000000"/>
               <w:bottom w:val="single" w:sz="2" w:space="0" w:color="000000"/>
@@ -6181,7 +6599,7 @@
         </w:tc>
         <w:tc>
           <w:tcPr>
-            <w:tcW w:w="5321" w:type="dxa"/>
+            <w:tcW w:w="5320" w:type="dxa"/>
             <w:tcBorders>
               <w:left w:val="single" w:sz="2" w:space="0" w:color="000000"/>
               <w:bottom w:val="single" w:sz="2" w:space="0" w:color="000000"/>
@@ -6262,7 +6680,7 @@
         </w:tc>
         <w:tc>
           <w:tcPr>
-            <w:tcW w:w="2741" w:type="dxa"/>
+            <w:tcW w:w="2742" w:type="dxa"/>
             <w:tcBorders>
               <w:left w:val="single" w:sz="2" w:space="0" w:color="000000"/>
               <w:bottom w:val="single" w:sz="2" w:space="0" w:color="000000"/>
@@ -6354,8 +6772,8 @@
           <w:rFonts w:ascii="Verdana" w:hAnsi="Verdana" w:cs="Verdana"/>
         </w:rPr>
       </w:pPr>
-      <w:bookmarkStart w:id="3" w:name="__RefHeading___Toc531076548"/>
-      <w:bookmarkEnd w:id="3"/>
+      <w:bookmarkStart w:id="4" w:name="__RefHeading___Toc531076548"/>
+      <w:bookmarkEnd w:id="4"/>
       <w:r>
         <w:rPr>
           <w:rFonts w:cs="Verdana" w:ascii="Verdana" w:hAnsi="Verdana"/>
@@ -6475,8 +6893,8 @@
           <w:rFonts w:ascii="Verdana" w:hAnsi="Verdana" w:cs="Verdana"/>
         </w:rPr>
       </w:pPr>
-      <w:bookmarkStart w:id="4" w:name="__RefHeading___Toc531076549"/>
-      <w:bookmarkEnd w:id="4"/>
+      <w:bookmarkStart w:id="5" w:name="__RefHeading___Toc531076549"/>
+      <w:bookmarkEnd w:id="5"/>
       <w:r>
         <w:rPr>
           <w:rFonts w:cs="Verdana" w:ascii="Verdana" w:hAnsi="Verdana"/>
@@ -6557,8 +6975,8 @@
           <w:rFonts w:ascii="Verdana" w:hAnsi="Verdana" w:cs="Verdana"/>
         </w:rPr>
       </w:pPr>
-      <w:bookmarkStart w:id="5" w:name="__RefHeading___Toc531076550"/>
-      <w:bookmarkEnd w:id="5"/>
+      <w:bookmarkStart w:id="6" w:name="__RefHeading___Toc531076550"/>
+      <w:bookmarkEnd w:id="6"/>
       <w:r>
         <w:rPr>
           <w:rFonts w:cs="Verdana" w:ascii="Verdana" w:hAnsi="Verdana"/>
@@ -6633,8 +7051,8 @@
           <w:color w:val="000000"/>
         </w:rPr>
       </w:pPr>
-      <w:bookmarkStart w:id="6" w:name="__RefHeading___Toc1586_1651833955"/>
-      <w:bookmarkEnd w:id="6"/>
+      <w:bookmarkStart w:id="7" w:name="__RefHeading___Toc1586_1651833955"/>
+      <w:bookmarkEnd w:id="7"/>
       <w:r>
         <w:rPr>
           <w:rFonts w:ascii="Verdana" w:hAnsi="Verdana"/>
@@ -7174,8 +7592,8 @@
           <w:color w:val="000000"/>
         </w:rPr>
       </w:pPr>
-      <w:bookmarkStart w:id="7" w:name="__RefHeading___Toc531076551"/>
-      <w:bookmarkEnd w:id="7"/>
+      <w:bookmarkStart w:id="8" w:name="__RefHeading___Toc531076551"/>
+      <w:bookmarkEnd w:id="8"/>
       <w:r>
         <w:rPr>
           <w:rFonts w:cs="Verdana" w:ascii="Verdana" w:hAnsi="Verdana"/>
@@ -7370,8 +7788,8 @@
           <w:rFonts w:ascii="Verdana" w:hAnsi="Verdana" w:cs="Verdana"/>
         </w:rPr>
       </w:pPr>
-      <w:bookmarkStart w:id="8" w:name="__RefHeading___Toc531076552"/>
-      <w:bookmarkEnd w:id="8"/>
+      <w:bookmarkStart w:id="9" w:name="__RefHeading___Toc531076552"/>
+      <w:bookmarkEnd w:id="9"/>
       <w:r>
         <w:rPr>
           <w:rFonts w:cs="Verdana" w:ascii="Verdana" w:hAnsi="Verdana"/>
@@ -7643,8 +8061,8 @@
           <w:color w:val="000000"/>
         </w:rPr>
       </w:pPr>
-      <w:bookmarkStart w:id="9" w:name="__RefHeading___Toc531076553"/>
-      <w:bookmarkEnd w:id="9"/>
+      <w:bookmarkStart w:id="10" w:name="__RefHeading___Toc531076553"/>
+      <w:bookmarkEnd w:id="10"/>
       <w:r>
         <w:rPr>
           <w:color w:val="000000"/>
@@ -7710,8 +8128,8 @@
           <w:color w:val="000000"/>
         </w:rPr>
       </w:pPr>
-      <w:bookmarkStart w:id="10" w:name="__RefHeading___Toc531076554"/>
-      <w:bookmarkEnd w:id="10"/>
+      <w:bookmarkStart w:id="11" w:name="__RefHeading___Toc531076554"/>
+      <w:bookmarkEnd w:id="11"/>
       <w:r>
         <w:rPr>
           <w:rFonts w:cs="Verdana" w:ascii="Verdana" w:hAnsi="Verdana"/>
@@ -7889,15 +8307,15 @@
         </w:tblCellMar>
       </w:tblPr>
       <w:tblGrid>
-        <w:gridCol w:w="3229"/>
+        <w:gridCol w:w="3228"/>
         <w:gridCol w:w="2309"/>
-        <w:gridCol w:w="4109"/>
+        <w:gridCol w:w="4110"/>
       </w:tblGrid>
       <w:tr>
         <w:trPr/>
         <w:tc>
           <w:tcPr>
-            <w:tcW w:w="3229" w:type="dxa"/>
+            <w:tcW w:w="3228" w:type="dxa"/>
             <w:tcBorders>
               <w:top w:val="single" w:sz="2" w:space="0" w:color="000000"/>
               <w:left w:val="single" w:sz="2" w:space="0" w:color="000000"/>
@@ -7949,7 +8367,7 @@
         </w:tc>
         <w:tc>
           <w:tcPr>
-            <w:tcW w:w="4109" w:type="dxa"/>
+            <w:tcW w:w="4110" w:type="dxa"/>
             <w:tcBorders>
               <w:top w:val="single" w:sz="2" w:space="0" w:color="000000"/>
               <w:left w:val="single" w:sz="2" w:space="0" w:color="000000"/>
@@ -7979,7 +8397,7 @@
         <w:trPr/>
         <w:tc>
           <w:tcPr>
-            <w:tcW w:w="3229" w:type="dxa"/>
+            <w:tcW w:w="3228" w:type="dxa"/>
             <w:tcBorders>
               <w:left w:val="single" w:sz="2" w:space="0" w:color="000000"/>
               <w:bottom w:val="single" w:sz="2" w:space="0" w:color="000000"/>
@@ -8044,7 +8462,7 @@
         </w:tc>
         <w:tc>
           <w:tcPr>
-            <w:tcW w:w="4109" w:type="dxa"/>
+            <w:tcW w:w="4110" w:type="dxa"/>
             <w:tcBorders>
               <w:left w:val="single" w:sz="2" w:space="0" w:color="000000"/>
               <w:bottom w:val="single" w:sz="2" w:space="0" w:color="000000"/>
@@ -8095,7 +8513,7 @@
         <w:trPr/>
         <w:tc>
           <w:tcPr>
-            <w:tcW w:w="3229" w:type="dxa"/>
+            <w:tcW w:w="3228" w:type="dxa"/>
             <w:tcBorders>
               <w:left w:val="single" w:sz="2" w:space="0" w:color="000000"/>
               <w:bottom w:val="single" w:sz="2" w:space="0" w:color="000000"/>
@@ -8175,7 +8593,7 @@
         </w:tc>
         <w:tc>
           <w:tcPr>
-            <w:tcW w:w="4109" w:type="dxa"/>
+            <w:tcW w:w="4110" w:type="dxa"/>
             <w:tcBorders>
               <w:left w:val="single" w:sz="2" w:space="0" w:color="000000"/>
               <w:bottom w:val="single" w:sz="2" w:space="0" w:color="000000"/>
@@ -8219,7 +8637,7 @@
         <w:trPr/>
         <w:tc>
           <w:tcPr>
-            <w:tcW w:w="3229" w:type="dxa"/>
+            <w:tcW w:w="3228" w:type="dxa"/>
             <w:tcBorders>
               <w:left w:val="single" w:sz="2" w:space="0" w:color="000000"/>
               <w:bottom w:val="single" w:sz="2" w:space="0" w:color="000000"/>
@@ -8273,7 +8691,7 @@
         </w:tc>
         <w:tc>
           <w:tcPr>
-            <w:tcW w:w="4109" w:type="dxa"/>
+            <w:tcW w:w="4110" w:type="dxa"/>
             <w:tcBorders>
               <w:left w:val="single" w:sz="2" w:space="0" w:color="000000"/>
               <w:bottom w:val="single" w:sz="2" w:space="0" w:color="000000"/>
@@ -8303,7 +8721,7 @@
         <w:trPr/>
         <w:tc>
           <w:tcPr>
-            <w:tcW w:w="3229" w:type="dxa"/>
+            <w:tcW w:w="3228" w:type="dxa"/>
             <w:tcBorders>
               <w:left w:val="single" w:sz="2" w:space="0" w:color="000000"/>
               <w:bottom w:val="single" w:sz="2" w:space="0" w:color="000000"/>
@@ -8357,7 +8775,7 @@
         </w:tc>
         <w:tc>
           <w:tcPr>
-            <w:tcW w:w="4109" w:type="dxa"/>
+            <w:tcW w:w="4110" w:type="dxa"/>
             <w:tcBorders>
               <w:left w:val="single" w:sz="2" w:space="0" w:color="000000"/>
               <w:bottom w:val="single" w:sz="2" w:space="0" w:color="000000"/>
@@ -8387,7 +8805,7 @@
         <w:trPr/>
         <w:tc>
           <w:tcPr>
-            <w:tcW w:w="3229" w:type="dxa"/>
+            <w:tcW w:w="3228" w:type="dxa"/>
             <w:tcBorders>
               <w:left w:val="single" w:sz="2" w:space="0" w:color="000000"/>
               <w:bottom w:val="single" w:sz="2" w:space="0" w:color="000000"/>
@@ -8437,7 +8855,7 @@
         </w:tc>
         <w:tc>
           <w:tcPr>
-            <w:tcW w:w="4109" w:type="dxa"/>
+            <w:tcW w:w="4110" w:type="dxa"/>
             <w:tcBorders>
               <w:left w:val="single" w:sz="2" w:space="0" w:color="000000"/>
               <w:bottom w:val="single" w:sz="2" w:space="0" w:color="000000"/>
@@ -8560,15 +8978,15 @@
         </w:tblCellMar>
       </w:tblPr>
       <w:tblGrid>
-        <w:gridCol w:w="3229"/>
+        <w:gridCol w:w="3228"/>
         <w:gridCol w:w="2338"/>
-        <w:gridCol w:w="4080"/>
+        <w:gridCol w:w="4081"/>
       </w:tblGrid>
       <w:tr>
         <w:trPr/>
         <w:tc>
           <w:tcPr>
-            <w:tcW w:w="3229" w:type="dxa"/>
+            <w:tcW w:w="3228" w:type="dxa"/>
             <w:tcBorders>
               <w:top w:val="single" w:sz="2" w:space="0" w:color="000000"/>
               <w:left w:val="single" w:sz="2" w:space="0" w:color="000000"/>
@@ -8620,7 +9038,7 @@
         </w:tc>
         <w:tc>
           <w:tcPr>
-            <w:tcW w:w="4080" w:type="dxa"/>
+            <w:tcW w:w="4081" w:type="dxa"/>
             <w:tcBorders>
               <w:top w:val="single" w:sz="2" w:space="0" w:color="000000"/>
               <w:left w:val="single" w:sz="2" w:space="0" w:color="000000"/>
@@ -8650,7 +9068,7 @@
         <w:trPr/>
         <w:tc>
           <w:tcPr>
-            <w:tcW w:w="3229" w:type="dxa"/>
+            <w:tcW w:w="3228" w:type="dxa"/>
             <w:tcBorders>
               <w:left w:val="single" w:sz="2" w:space="0" w:color="000000"/>
               <w:bottom w:val="single" w:sz="2" w:space="0" w:color="000000"/>
@@ -8700,7 +9118,7 @@
         </w:tc>
         <w:tc>
           <w:tcPr>
-            <w:tcW w:w="4080" w:type="dxa"/>
+            <w:tcW w:w="4081" w:type="dxa"/>
             <w:tcBorders>
               <w:left w:val="single" w:sz="2" w:space="0" w:color="000000"/>
               <w:bottom w:val="single" w:sz="2" w:space="0" w:color="000000"/>
@@ -9380,7 +9798,7 @@
           <w:numId w:val="0"/>
         </w:numPr>
         <w:suppressAutoHyphens w:val="true"/>
-        <w:overflowPunct w:val="false"/>
+        <w:overflowPunct w:val="true"/>
         <w:jc w:val="left"/>
         <w:outlineLvl w:val="1"/>
         <w:rPr>
@@ -9409,8 +9827,8 @@
           <w:color w:val="000000"/>
         </w:rPr>
       </w:pPr>
-      <w:bookmarkStart w:id="11" w:name="__RefHeading___Toc531076555"/>
-      <w:bookmarkEnd w:id="11"/>
+      <w:bookmarkStart w:id="12" w:name="__RefHeading___Toc531076555"/>
+      <w:bookmarkEnd w:id="12"/>
       <w:r>
         <w:rPr>
           <w:rFonts w:cs="Verdana" w:ascii="Verdana" w:hAnsi="Verdana"/>
@@ -10692,8 +11110,8 @@
         </w:tblCellMar>
       </w:tblPr>
       <w:tblGrid>
-        <w:gridCol w:w="2381"/>
-        <w:gridCol w:w="7265"/>
+        <w:gridCol w:w="2380"/>
+        <w:gridCol w:w="7266"/>
       </w:tblGrid>
       <w:tr>
         <w:trPr>
@@ -10701,7 +11119,7 @@
         </w:trPr>
         <w:tc>
           <w:tcPr>
-            <w:tcW w:w="2381" w:type="dxa"/>
+            <w:tcW w:w="2380" w:type="dxa"/>
             <w:tcBorders>
               <w:top w:val="single" w:sz="2" w:space="0" w:color="000000"/>
               <w:left w:val="single" w:sz="2" w:space="0" w:color="000000"/>
@@ -10729,7 +11147,7 @@
         </w:tc>
         <w:tc>
           <w:tcPr>
-            <w:tcW w:w="7265" w:type="dxa"/>
+            <w:tcW w:w="7266" w:type="dxa"/>
             <w:tcBorders>
               <w:top w:val="single" w:sz="2" w:space="0" w:color="000000"/>
               <w:left w:val="single" w:sz="2" w:space="0" w:color="000000"/>
@@ -10760,7 +11178,7 @@
         <w:trPr/>
         <w:tc>
           <w:tcPr>
-            <w:tcW w:w="2381" w:type="dxa"/>
+            <w:tcW w:w="2380" w:type="dxa"/>
             <w:tcBorders>
               <w:left w:val="single" w:sz="2" w:space="0" w:color="000000"/>
               <w:bottom w:val="single" w:sz="2" w:space="0" w:color="000000"/>
@@ -10786,7 +11204,7 @@
         </w:tc>
         <w:tc>
           <w:tcPr>
-            <w:tcW w:w="7265" w:type="dxa"/>
+            <w:tcW w:w="7266" w:type="dxa"/>
             <w:tcBorders>
               <w:left w:val="single" w:sz="2" w:space="0" w:color="000000"/>
               <w:bottom w:val="single" w:sz="2" w:space="0" w:color="000000"/>
@@ -10815,7 +11233,7 @@
         <w:trPr/>
         <w:tc>
           <w:tcPr>
-            <w:tcW w:w="2381" w:type="dxa"/>
+            <w:tcW w:w="2380" w:type="dxa"/>
             <w:tcBorders>
               <w:left w:val="single" w:sz="2" w:space="0" w:color="000000"/>
               <w:bottom w:val="single" w:sz="2" w:space="0" w:color="000000"/>
@@ -10841,7 +11259,7 @@
         </w:tc>
         <w:tc>
           <w:tcPr>
-            <w:tcW w:w="7265" w:type="dxa"/>
+            <w:tcW w:w="7266" w:type="dxa"/>
             <w:tcBorders>
               <w:left w:val="single" w:sz="2" w:space="0" w:color="000000"/>
               <w:bottom w:val="single" w:sz="2" w:space="0" w:color="000000"/>
@@ -10870,7 +11288,7 @@
         <w:trPr/>
         <w:tc>
           <w:tcPr>
-            <w:tcW w:w="2381" w:type="dxa"/>
+            <w:tcW w:w="2380" w:type="dxa"/>
             <w:tcBorders>
               <w:left w:val="single" w:sz="2" w:space="0" w:color="000000"/>
               <w:bottom w:val="single" w:sz="2" w:space="0" w:color="000000"/>
@@ -10896,7 +11314,7 @@
         </w:tc>
         <w:tc>
           <w:tcPr>
-            <w:tcW w:w="7265" w:type="dxa"/>
+            <w:tcW w:w="7266" w:type="dxa"/>
             <w:tcBorders>
               <w:left w:val="single" w:sz="2" w:space="0" w:color="000000"/>
               <w:bottom w:val="single" w:sz="2" w:space="0" w:color="000000"/>
@@ -10940,7 +11358,7 @@
         <w:trPr/>
         <w:tc>
           <w:tcPr>
-            <w:tcW w:w="2381" w:type="dxa"/>
+            <w:tcW w:w="2380" w:type="dxa"/>
             <w:tcBorders>
               <w:left w:val="single" w:sz="2" w:space="0" w:color="000000"/>
               <w:bottom w:val="single" w:sz="2" w:space="0" w:color="000000"/>
@@ -10966,7 +11384,7 @@
         </w:tc>
         <w:tc>
           <w:tcPr>
-            <w:tcW w:w="7265" w:type="dxa"/>
+            <w:tcW w:w="7266" w:type="dxa"/>
             <w:tcBorders>
               <w:left w:val="single" w:sz="2" w:space="0" w:color="000000"/>
               <w:bottom w:val="single" w:sz="2" w:space="0" w:color="000000"/>
@@ -10995,7 +11413,7 @@
         <w:trPr/>
         <w:tc>
           <w:tcPr>
-            <w:tcW w:w="2381" w:type="dxa"/>
+            <w:tcW w:w="2380" w:type="dxa"/>
             <w:tcBorders>
               <w:left w:val="single" w:sz="2" w:space="0" w:color="000000"/>
               <w:bottom w:val="single" w:sz="2" w:space="0" w:color="000000"/>
@@ -11021,7 +11439,7 @@
         </w:tc>
         <w:tc>
           <w:tcPr>
-            <w:tcW w:w="7265" w:type="dxa"/>
+            <w:tcW w:w="7266" w:type="dxa"/>
             <w:tcBorders>
               <w:left w:val="single" w:sz="2" w:space="0" w:color="000000"/>
               <w:bottom w:val="single" w:sz="2" w:space="0" w:color="000000"/>
@@ -11050,7 +11468,7 @@
         <w:trPr/>
         <w:tc>
           <w:tcPr>
-            <w:tcW w:w="2381" w:type="dxa"/>
+            <w:tcW w:w="2380" w:type="dxa"/>
             <w:tcBorders>
               <w:left w:val="single" w:sz="2" w:space="0" w:color="000000"/>
               <w:bottom w:val="single" w:sz="2" w:space="0" w:color="000000"/>
@@ -11076,7 +11494,7 @@
         </w:tc>
         <w:tc>
           <w:tcPr>
-            <w:tcW w:w="7265" w:type="dxa"/>
+            <w:tcW w:w="7266" w:type="dxa"/>
             <w:tcBorders>
               <w:left w:val="single" w:sz="2" w:space="0" w:color="000000"/>
               <w:bottom w:val="single" w:sz="2" w:space="0" w:color="000000"/>
@@ -11105,7 +11523,7 @@
         <w:trPr/>
         <w:tc>
           <w:tcPr>
-            <w:tcW w:w="2381" w:type="dxa"/>
+            <w:tcW w:w="2380" w:type="dxa"/>
             <w:tcBorders>
               <w:left w:val="single" w:sz="2" w:space="0" w:color="000000"/>
               <w:bottom w:val="single" w:sz="2" w:space="0" w:color="000000"/>
@@ -11131,7 +11549,7 @@
         </w:tc>
         <w:tc>
           <w:tcPr>
-            <w:tcW w:w="7265" w:type="dxa"/>
+            <w:tcW w:w="7266" w:type="dxa"/>
             <w:tcBorders>
               <w:left w:val="single" w:sz="2" w:space="0" w:color="000000"/>
               <w:bottom w:val="single" w:sz="2" w:space="0" w:color="000000"/>
@@ -11160,7 +11578,7 @@
         <w:trPr/>
         <w:tc>
           <w:tcPr>
-            <w:tcW w:w="2381" w:type="dxa"/>
+            <w:tcW w:w="2380" w:type="dxa"/>
             <w:tcBorders>
               <w:left w:val="single" w:sz="2" w:space="0" w:color="000000"/>
               <w:bottom w:val="single" w:sz="2" w:space="0" w:color="000000"/>
@@ -11188,7 +11606,7 @@
         </w:tc>
         <w:tc>
           <w:tcPr>
-            <w:tcW w:w="7265" w:type="dxa"/>
+            <w:tcW w:w="7266" w:type="dxa"/>
             <w:tcBorders>
               <w:left w:val="single" w:sz="2" w:space="0" w:color="000000"/>
               <w:bottom w:val="single" w:sz="2" w:space="0" w:color="000000"/>
@@ -11436,8 +11854,8 @@
           <w:rFonts w:ascii="Verdana" w:hAnsi="Verdana" w:cs="Verdana"/>
         </w:rPr>
       </w:pPr>
-      <w:bookmarkStart w:id="12" w:name="__RefHeading___Toc531076556"/>
-      <w:bookmarkEnd w:id="12"/>
+      <w:bookmarkStart w:id="13" w:name="__RefHeading___Toc531076556"/>
+      <w:bookmarkEnd w:id="13"/>
       <w:r>
         <w:rPr>
           <w:rFonts w:cs="Verdana" w:ascii="Verdana" w:hAnsi="Verdana"/>
@@ -11540,8 +11958,8 @@
           <w:rFonts w:ascii="Verdana" w:hAnsi="Verdana" w:cs="Verdana"/>
         </w:rPr>
       </w:pPr>
-      <w:bookmarkStart w:id="13" w:name="__RefHeading___Toc531076557"/>
-      <w:bookmarkEnd w:id="13"/>
+      <w:bookmarkStart w:id="14" w:name="__RefHeading___Toc531076557"/>
+      <w:bookmarkEnd w:id="14"/>
       <w:r>
         <w:rPr>
           <w:rFonts w:cs="Verdana" w:ascii="Verdana" w:hAnsi="Verdana"/>
@@ -11876,8 +12294,8 @@
           <w:color w:val="000000"/>
         </w:rPr>
       </w:pPr>
-      <w:bookmarkStart w:id="14" w:name="__RefHeading___Toc531076558"/>
-      <w:bookmarkEnd w:id="14"/>
+      <w:bookmarkStart w:id="15" w:name="__RefHeading___Toc531076558"/>
+      <w:bookmarkEnd w:id="15"/>
       <w:r>
         <w:rPr>
           <w:color w:val="000000"/>
@@ -11998,8 +12416,8 @@
           <w:rFonts w:ascii="Verdana" w:hAnsi="Verdana"/>
         </w:rPr>
       </w:pPr>
-      <w:bookmarkStart w:id="15" w:name="__RefHeading___Toc531076559"/>
-      <w:bookmarkEnd w:id="15"/>
+      <w:bookmarkStart w:id="16" w:name="__RefHeading___Toc531076559"/>
+      <w:bookmarkEnd w:id="16"/>
       <w:r>
         <w:rPr>
           <w:rFonts w:ascii="Verdana" w:hAnsi="Verdana"/>
@@ -12147,8 +12565,8 @@
           <w:color w:val="000000"/>
         </w:rPr>
       </w:pPr>
-      <w:bookmarkStart w:id="16" w:name="__RefHeading___Toc531076560"/>
-      <w:bookmarkEnd w:id="16"/>
+      <w:bookmarkStart w:id="17" w:name="__RefHeading___Toc531076560"/>
+      <w:bookmarkEnd w:id="17"/>
       <w:r>
         <w:rPr>
           <w:color w:val="000000"/>
@@ -12288,8 +12706,8 @@
           <w:color w:val="000000"/>
         </w:rPr>
       </w:pPr>
-      <w:bookmarkStart w:id="17" w:name="__RefHeading___Toc531076561"/>
-      <w:bookmarkEnd w:id="17"/>
+      <w:bookmarkStart w:id="18" w:name="__RefHeading___Toc531076561"/>
+      <w:bookmarkEnd w:id="18"/>
       <w:r>
         <w:rPr>
           <w:color w:val="000000"/>
@@ -12317,7 +12735,7 @@
           <w:color w:val="000000"/>
         </w:rPr>
       </w:pPr>
-      <w:bookmarkStart w:id="18" w:name="__DdeLink__3652_2495907598"/>
+      <w:bookmarkStart w:id="19" w:name="__DdeLink__3652_2495907598"/>
       <w:r>
         <w:rPr>
           <w:color w:val="000000"/>
@@ -12405,7 +12823,7 @@
         </w:rPr>
         <w:t>eller returnere med ESC.</w:t>
       </w:r>
-      <w:bookmarkEnd w:id="18"/>
+      <w:bookmarkEnd w:id="19"/>
     </w:p>
     <w:p>
       <w:pPr>
@@ -12447,8 +12865,8 @@
           <w:color w:val="000000"/>
         </w:rPr>
       </w:pPr>
-      <w:bookmarkStart w:id="19" w:name="__RefHeading___Toc531076562"/>
-      <w:bookmarkEnd w:id="19"/>
+      <w:bookmarkStart w:id="20" w:name="__RefHeading___Toc531076562"/>
+      <w:bookmarkEnd w:id="20"/>
       <w:r>
         <w:rPr>
           <w:color w:val="000000"/>
@@ -12632,8 +13050,8 @@
           <w:lang w:val="da-DK"/>
         </w:rPr>
       </w:pPr>
-      <w:bookmarkStart w:id="20" w:name="__RefHeading___Toc531076563"/>
-      <w:bookmarkEnd w:id="20"/>
+      <w:bookmarkStart w:id="21" w:name="__RefHeading___Toc531076563"/>
+      <w:bookmarkEnd w:id="21"/>
       <w:r>
         <w:rPr>
           <w:rFonts w:cs="Verdana" w:ascii="Verdana" w:hAnsi="Verdana"/>
@@ -12961,8 +13379,8 @@
           <w:rFonts w:ascii="Verdana" w:hAnsi="Verdana" w:cs="Verdana"/>
         </w:rPr>
       </w:pPr>
-      <w:bookmarkStart w:id="21" w:name="__RefHeading___Toc531076564"/>
-      <w:bookmarkEnd w:id="21"/>
+      <w:bookmarkStart w:id="22" w:name="__RefHeading___Toc531076564"/>
+      <w:bookmarkEnd w:id="22"/>
       <w:r>
         <w:rPr>
           <w:rFonts w:cs="Verdana" w:ascii="Verdana" w:hAnsi="Verdana"/>
@@ -13120,8 +13538,8 @@
           <w:color w:val="C9211E"/>
         </w:rPr>
       </w:pPr>
-      <w:bookmarkStart w:id="22" w:name="__RefHeading___Toc1942_1354692515"/>
-      <w:bookmarkEnd w:id="22"/>
+      <w:bookmarkStart w:id="23" w:name="__RefHeading___Toc1942_1354692515"/>
+      <w:bookmarkEnd w:id="23"/>
       <w:r>
         <w:rPr>
           <w:rFonts w:ascii="Verdana" w:hAnsi="Verdana"/>
@@ -13156,8 +13574,8 @@
           <w:rFonts w:ascii="Verdana" w:hAnsi="Verdana"/>
         </w:rPr>
       </w:pPr>
-      <w:bookmarkStart w:id="23" w:name="__RefHeading___Toc1944_1354692515"/>
-      <w:bookmarkEnd w:id="23"/>
+      <w:bookmarkStart w:id="24" w:name="__RefHeading___Toc1944_1354692515"/>
+      <w:bookmarkEnd w:id="24"/>
       <w:r>
         <w:rPr>
           <w:rFonts w:ascii="Verdana" w:hAnsi="Verdana"/>
@@ -13419,8 +13837,8 @@
           <w:color w:val="C9211E"/>
         </w:rPr>
       </w:pPr>
-      <w:bookmarkStart w:id="24" w:name="__RefHeading___Toc1946_1354692515"/>
-      <w:bookmarkEnd w:id="24"/>
+      <w:bookmarkStart w:id="25" w:name="__RefHeading___Toc1946_1354692515"/>
+      <w:bookmarkEnd w:id="25"/>
       <w:r>
         <w:rPr>
           <w:color w:val="000000"/>
@@ -13488,8 +13906,8 @@
           <w:color w:val="C9211E"/>
         </w:rPr>
       </w:pPr>
-      <w:bookmarkStart w:id="25" w:name="__RefHeading___Toc1948_1354692515"/>
-      <w:bookmarkEnd w:id="25"/>
+      <w:bookmarkStart w:id="26" w:name="__RefHeading___Toc1948_1354692515"/>
+      <w:bookmarkEnd w:id="26"/>
       <w:r>
         <w:rPr>
           <w:color w:val="000000"/>
@@ -13541,8 +13959,8 @@
           <w:color w:val="C9211E"/>
         </w:rPr>
       </w:pPr>
-      <w:bookmarkStart w:id="26" w:name="__RefHeading___Toc1950_1354692515"/>
-      <w:bookmarkEnd w:id="26"/>
+      <w:bookmarkStart w:id="27" w:name="__RefHeading___Toc1950_1354692515"/>
+      <w:bookmarkEnd w:id="27"/>
       <w:r>
         <w:rPr>
           <w:color w:val="000000"/>
@@ -13594,8 +14012,8 @@
           <w:color w:val="C9211E"/>
         </w:rPr>
       </w:pPr>
-      <w:bookmarkStart w:id="27" w:name="__RefHeading___Toc1952_1354692515"/>
-      <w:bookmarkEnd w:id="27"/>
+      <w:bookmarkStart w:id="28" w:name="__RefHeading___Toc1952_1354692515"/>
+      <w:bookmarkEnd w:id="28"/>
       <w:r>
         <w:rPr>
           <w:color w:val="000000"/>
@@ -13907,8 +14325,8 @@
           <w:color w:val="C9211E"/>
         </w:rPr>
       </w:pPr>
-      <w:bookmarkStart w:id="28" w:name="__RefHeading___Toc1954_1354692515"/>
-      <w:bookmarkEnd w:id="28"/>
+      <w:bookmarkStart w:id="29" w:name="__RefHeading___Toc1954_1354692515"/>
+      <w:bookmarkEnd w:id="29"/>
       <w:r>
         <w:rPr>
           <w:rFonts w:ascii="Verdana" w:hAnsi="Verdana"/>
@@ -13944,8 +14362,8 @@
           <w:color w:val="C9211E"/>
         </w:rPr>
       </w:pPr>
-      <w:bookmarkStart w:id="29" w:name="__RefHeading___Toc1956_1354692515"/>
-      <w:bookmarkEnd w:id="29"/>
+      <w:bookmarkStart w:id="30" w:name="__RefHeading___Toc1956_1354692515"/>
+      <w:bookmarkEnd w:id="30"/>
       <w:r>
         <w:rPr>
           <w:rFonts w:ascii="Verdana" w:hAnsi="Verdana"/>
@@ -14311,8 +14729,8 @@
           <w:szCs w:val="32"/>
         </w:rPr>
       </w:pPr>
-      <w:bookmarkStart w:id="30" w:name="__RefHeading___Toc1958_1354692515"/>
-      <w:bookmarkEnd w:id="30"/>
+      <w:bookmarkStart w:id="31" w:name="__RefHeading___Toc1958_1354692515"/>
+      <w:bookmarkEnd w:id="31"/>
       <w:r>
         <w:rPr>
           <w:rFonts w:ascii="Verdana" w:hAnsi="Verdana"/>
@@ -14371,14 +14789,14 @@
         </w:tblCellMar>
       </w:tblPr>
       <w:tblGrid>
-        <w:gridCol w:w="1640"/>
-        <w:gridCol w:w="8010"/>
+        <w:gridCol w:w="1639"/>
+        <w:gridCol w:w="8011"/>
       </w:tblGrid>
       <w:tr>
         <w:trPr/>
         <w:tc>
           <w:tcPr>
-            <w:tcW w:w="1640" w:type="dxa"/>
+            <w:tcW w:w="1639" w:type="dxa"/>
             <w:tcBorders>
               <w:top w:val="single" w:sz="2" w:space="0" w:color="000000"/>
               <w:left w:val="single" w:sz="2" w:space="0" w:color="000000"/>
@@ -14426,7 +14844,7 @@
         </w:tc>
         <w:tc>
           <w:tcPr>
-            <w:tcW w:w="8010" w:type="dxa"/>
+            <w:tcW w:w="8011" w:type="dxa"/>
             <w:tcBorders>
               <w:top w:val="single" w:sz="2" w:space="0" w:color="000000"/>
               <w:left w:val="single" w:sz="2" w:space="0" w:color="000000"/>
@@ -14486,7 +14904,7 @@
         <w:trPr/>
         <w:tc>
           <w:tcPr>
-            <w:tcW w:w="1640" w:type="dxa"/>
+            <w:tcW w:w="1639" w:type="dxa"/>
             <w:tcBorders>
               <w:left w:val="single" w:sz="2" w:space="0" w:color="000000"/>
               <w:bottom w:val="single" w:sz="2" w:space="0" w:color="000000"/>
@@ -14526,7 +14944,7 @@
         </w:tc>
         <w:tc>
           <w:tcPr>
-            <w:tcW w:w="8010" w:type="dxa"/>
+            <w:tcW w:w="8011" w:type="dxa"/>
             <w:tcBorders>
               <w:left w:val="single" w:sz="2" w:space="0" w:color="000000"/>
               <w:bottom w:val="single" w:sz="2" w:space="0" w:color="000000"/>
@@ -14625,7 +15043,7 @@
           <w:numId w:val="3"/>
         </w:numPr>
         <w:suppressAutoHyphens w:val="true"/>
-        <w:overflowPunct w:val="false"/>
+        <w:overflowPunct w:val="true"/>
         <w:bidi w:val="0"/>
         <w:spacing w:before="200" w:after="120"/>
         <w:ind w:left="510" w:right="0" w:hanging="578"/>
@@ -14635,8 +15053,8 @@
           <w:color w:val="000000"/>
         </w:rPr>
       </w:pPr>
-      <w:bookmarkStart w:id="31" w:name="__RefHeading___Toc1960_1354692515"/>
-      <w:bookmarkEnd w:id="31"/>
+      <w:bookmarkStart w:id="32" w:name="__RefHeading___Toc1960_1354692515"/>
+      <w:bookmarkEnd w:id="32"/>
       <w:r>
         <w:rPr>
           <w:rFonts w:cs="Verdana" w:ascii="Verdana" w:hAnsi="Verdana"/>
@@ -14767,8 +15185,8 @@
           <w:rFonts w:ascii="Verdana" w:hAnsi="Verdana" w:cs="Verdana"/>
         </w:rPr>
       </w:pPr>
-      <w:bookmarkStart w:id="32" w:name="__RefHeading___Toc531076565"/>
-      <w:bookmarkEnd w:id="32"/>
+      <w:bookmarkStart w:id="33" w:name="__RefHeading___Toc531076565"/>
+      <w:bookmarkEnd w:id="33"/>
       <w:r>
         <w:rPr>
           <w:rFonts w:cs="Verdana" w:ascii="Verdana" w:hAnsi="Verdana"/>
@@ -14827,15 +15245,7 @@
           <w:color w:val="000000"/>
           <w:lang w:val="da-DK"/>
         </w:rPr>
-        <w:t>5.0.0.0</w:t>
-      </w:r>
-      <w:r>
-        <w:rPr>
-          <w:rFonts w:cs="Verdana" w:ascii="Verdana" w:hAnsi="Verdana"/>
-          <w:color w:val="000000"/>
-          <w:lang w:val="da-DK"/>
-        </w:rPr>
-        <w:t>.</w:t>
+        <w:t>5.0.0.0.</w:t>
       </w:r>
     </w:p>
     <w:p>
@@ -16028,14 +16438,14 @@
         </w:tblCellMar>
       </w:tblPr>
       <w:tblGrid>
-        <w:gridCol w:w="3391"/>
-        <w:gridCol w:w="6255"/>
+        <w:gridCol w:w="3390"/>
+        <w:gridCol w:w="6256"/>
       </w:tblGrid>
       <w:tr>
         <w:trPr/>
         <w:tc>
           <w:tcPr>
-            <w:tcW w:w="3391" w:type="dxa"/>
+            <w:tcW w:w="3390" w:type="dxa"/>
             <w:tcBorders>
               <w:top w:val="single" w:sz="2" w:space="0" w:color="000000"/>
               <w:left w:val="single" w:sz="2" w:space="0" w:color="000000"/>
@@ -16063,7 +16473,7 @@
         </w:tc>
         <w:tc>
           <w:tcPr>
-            <w:tcW w:w="6255" w:type="dxa"/>
+            <w:tcW w:w="6256" w:type="dxa"/>
             <w:tcBorders>
               <w:top w:val="single" w:sz="2" w:space="0" w:color="000000"/>
               <w:left w:val="single" w:sz="2" w:space="0" w:color="000000"/>
@@ -16095,7 +16505,7 @@
         <w:trPr/>
         <w:tc>
           <w:tcPr>
-            <w:tcW w:w="3391" w:type="dxa"/>
+            <w:tcW w:w="3390" w:type="dxa"/>
             <w:tcBorders>
               <w:left w:val="single" w:sz="2" w:space="0" w:color="000000"/>
               <w:bottom w:val="single" w:sz="2" w:space="0" w:color="000000"/>
@@ -16120,7 +16530,7 @@
         </w:tc>
         <w:tc>
           <w:tcPr>
-            <w:tcW w:w="6255" w:type="dxa"/>
+            <w:tcW w:w="6256" w:type="dxa"/>
             <w:tcBorders>
               <w:left w:val="single" w:sz="2" w:space="0" w:color="000000"/>
               <w:bottom w:val="single" w:sz="2" w:space="0" w:color="000000"/>
@@ -16149,7 +16559,7 @@
         <w:trPr/>
         <w:tc>
           <w:tcPr>
-            <w:tcW w:w="3391" w:type="dxa"/>
+            <w:tcW w:w="3390" w:type="dxa"/>
             <w:tcBorders>
               <w:left w:val="single" w:sz="2" w:space="0" w:color="000000"/>
               <w:bottom w:val="single" w:sz="2" w:space="0" w:color="000000"/>
@@ -16174,7 +16584,7 @@
         </w:tc>
         <w:tc>
           <w:tcPr>
-            <w:tcW w:w="6255" w:type="dxa"/>
+            <w:tcW w:w="6256" w:type="dxa"/>
             <w:tcBorders>
               <w:left w:val="single" w:sz="2" w:space="0" w:color="000000"/>
               <w:bottom w:val="single" w:sz="2" w:space="0" w:color="000000"/>
@@ -16203,7 +16613,7 @@
         <w:trPr/>
         <w:tc>
           <w:tcPr>
-            <w:tcW w:w="3391" w:type="dxa"/>
+            <w:tcW w:w="3390" w:type="dxa"/>
             <w:tcBorders>
               <w:left w:val="single" w:sz="2" w:space="0" w:color="000000"/>
               <w:bottom w:val="single" w:sz="2" w:space="0" w:color="000000"/>
@@ -16229,7 +16639,7 @@
         </w:tc>
         <w:tc>
           <w:tcPr>
-            <w:tcW w:w="6255" w:type="dxa"/>
+            <w:tcW w:w="6256" w:type="dxa"/>
             <w:tcBorders>
               <w:left w:val="single" w:sz="2" w:space="0" w:color="000000"/>
               <w:bottom w:val="single" w:sz="2" w:space="0" w:color="000000"/>
@@ -16260,7 +16670,7 @@
         <w:trPr/>
         <w:tc>
           <w:tcPr>
-            <w:tcW w:w="3391" w:type="dxa"/>
+            <w:tcW w:w="3390" w:type="dxa"/>
             <w:tcBorders>
               <w:left w:val="single" w:sz="2" w:space="0" w:color="000000"/>
               <w:bottom w:val="single" w:sz="2" w:space="0" w:color="000000"/>
@@ -16287,7 +16697,7 @@
         </w:tc>
         <w:tc>
           <w:tcPr>
-            <w:tcW w:w="6255" w:type="dxa"/>
+            <w:tcW w:w="6256" w:type="dxa"/>
             <w:tcBorders>
               <w:left w:val="single" w:sz="2" w:space="0" w:color="000000"/>
               <w:bottom w:val="single" w:sz="2" w:space="0" w:color="000000"/>
@@ -16318,7 +16728,7 @@
         <w:trPr/>
         <w:tc>
           <w:tcPr>
-            <w:tcW w:w="3391" w:type="dxa"/>
+            <w:tcW w:w="3390" w:type="dxa"/>
             <w:tcBorders>
               <w:left w:val="single" w:sz="2" w:space="0" w:color="000000"/>
               <w:bottom w:val="single" w:sz="2" w:space="0" w:color="000000"/>
@@ -16343,7 +16753,7 @@
         </w:tc>
         <w:tc>
           <w:tcPr>
-            <w:tcW w:w="6255" w:type="dxa"/>
+            <w:tcW w:w="6256" w:type="dxa"/>
             <w:tcBorders>
               <w:left w:val="single" w:sz="2" w:space="0" w:color="000000"/>
               <w:bottom w:val="single" w:sz="2" w:space="0" w:color="000000"/>
@@ -16372,7 +16782,7 @@
         <w:trPr/>
         <w:tc>
           <w:tcPr>
-            <w:tcW w:w="3391" w:type="dxa"/>
+            <w:tcW w:w="3390" w:type="dxa"/>
             <w:tcBorders>
               <w:left w:val="single" w:sz="2" w:space="0" w:color="000000"/>
               <w:bottom w:val="single" w:sz="2" w:space="0" w:color="000000"/>
@@ -16397,7 +16807,7 @@
         </w:tc>
         <w:tc>
           <w:tcPr>
-            <w:tcW w:w="6255" w:type="dxa"/>
+            <w:tcW w:w="6256" w:type="dxa"/>
             <w:tcBorders>
               <w:left w:val="single" w:sz="2" w:space="0" w:color="000000"/>
               <w:bottom w:val="single" w:sz="2" w:space="0" w:color="000000"/>
@@ -16426,7 +16836,7 @@
         <w:trPr/>
         <w:tc>
           <w:tcPr>
-            <w:tcW w:w="3391" w:type="dxa"/>
+            <w:tcW w:w="3390" w:type="dxa"/>
             <w:tcBorders>
               <w:left w:val="single" w:sz="2" w:space="0" w:color="000000"/>
               <w:bottom w:val="single" w:sz="2" w:space="0" w:color="000000"/>
@@ -16451,7 +16861,7 @@
         </w:tc>
         <w:tc>
           <w:tcPr>
-            <w:tcW w:w="6255" w:type="dxa"/>
+            <w:tcW w:w="6256" w:type="dxa"/>
             <w:tcBorders>
               <w:left w:val="single" w:sz="2" w:space="0" w:color="000000"/>
               <w:bottom w:val="single" w:sz="2" w:space="0" w:color="000000"/>
@@ -16495,7 +16905,7 @@
         <w:trPr/>
         <w:tc>
           <w:tcPr>
-            <w:tcW w:w="3391" w:type="dxa"/>
+            <w:tcW w:w="3390" w:type="dxa"/>
             <w:tcBorders>
               <w:left w:val="single" w:sz="2" w:space="0" w:color="000000"/>
               <w:bottom w:val="single" w:sz="2" w:space="0" w:color="000000"/>
@@ -16520,7 +16930,7 @@
         </w:tc>
         <w:tc>
           <w:tcPr>
-            <w:tcW w:w="6255" w:type="dxa"/>
+            <w:tcW w:w="6256" w:type="dxa"/>
             <w:tcBorders>
               <w:left w:val="single" w:sz="2" w:space="0" w:color="000000"/>
               <w:bottom w:val="single" w:sz="2" w:space="0" w:color="000000"/>
@@ -16564,7 +16974,7 @@
         <w:trPr/>
         <w:tc>
           <w:tcPr>
-            <w:tcW w:w="3391" w:type="dxa"/>
+            <w:tcW w:w="3390" w:type="dxa"/>
             <w:tcBorders>
               <w:left w:val="single" w:sz="2" w:space="0" w:color="000000"/>
               <w:bottom w:val="single" w:sz="2" w:space="0" w:color="000000"/>
@@ -16591,7 +17001,7 @@
         </w:tc>
         <w:tc>
           <w:tcPr>
-            <w:tcW w:w="6255" w:type="dxa"/>
+            <w:tcW w:w="6256" w:type="dxa"/>
             <w:tcBorders>
               <w:left w:val="single" w:sz="2" w:space="0" w:color="000000"/>
               <w:bottom w:val="single" w:sz="2" w:space="0" w:color="000000"/>
@@ -16622,7 +17032,7 @@
         <w:trPr/>
         <w:tc>
           <w:tcPr>
-            <w:tcW w:w="3391" w:type="dxa"/>
+            <w:tcW w:w="3390" w:type="dxa"/>
             <w:tcBorders>
               <w:left w:val="single" w:sz="2" w:space="0" w:color="000000"/>
               <w:bottom w:val="single" w:sz="2" w:space="0" w:color="000000"/>
@@ -16649,7 +17059,7 @@
         </w:tc>
         <w:tc>
           <w:tcPr>
-            <w:tcW w:w="6255" w:type="dxa"/>
+            <w:tcW w:w="6256" w:type="dxa"/>
             <w:tcBorders>
               <w:left w:val="single" w:sz="2" w:space="0" w:color="000000"/>
               <w:bottom w:val="single" w:sz="2" w:space="0" w:color="000000"/>
@@ -16680,7 +17090,7 @@
         <w:trPr/>
         <w:tc>
           <w:tcPr>
-            <w:tcW w:w="3391" w:type="dxa"/>
+            <w:tcW w:w="3390" w:type="dxa"/>
             <w:tcBorders>
               <w:left w:val="single" w:sz="2" w:space="0" w:color="000000"/>
               <w:bottom w:val="single" w:sz="2" w:space="0" w:color="000000"/>
@@ -16707,7 +17117,7 @@
         </w:tc>
         <w:tc>
           <w:tcPr>
-            <w:tcW w:w="6255" w:type="dxa"/>
+            <w:tcW w:w="6256" w:type="dxa"/>
             <w:tcBorders>
               <w:left w:val="single" w:sz="2" w:space="0" w:color="000000"/>
               <w:bottom w:val="single" w:sz="2" w:space="0" w:color="000000"/>
@@ -16738,7 +17148,7 @@
         <w:trPr/>
         <w:tc>
           <w:tcPr>
-            <w:tcW w:w="3391" w:type="dxa"/>
+            <w:tcW w:w="3390" w:type="dxa"/>
             <w:tcBorders>
               <w:left w:val="single" w:sz="2" w:space="0" w:color="000000"/>
               <w:bottom w:val="single" w:sz="2" w:space="0" w:color="000000"/>
@@ -16765,7 +17175,7 @@
         </w:tc>
         <w:tc>
           <w:tcPr>
-            <w:tcW w:w="6255" w:type="dxa"/>
+            <w:tcW w:w="6256" w:type="dxa"/>
             <w:tcBorders>
               <w:left w:val="single" w:sz="2" w:space="0" w:color="000000"/>
               <w:bottom w:val="single" w:sz="2" w:space="0" w:color="000000"/>
@@ -16796,7 +17206,7 @@
         <w:trPr/>
         <w:tc>
           <w:tcPr>
-            <w:tcW w:w="3391" w:type="dxa"/>
+            <w:tcW w:w="3390" w:type="dxa"/>
             <w:tcBorders>
               <w:left w:val="single" w:sz="2" w:space="0" w:color="000000"/>
               <w:bottom w:val="single" w:sz="2" w:space="0" w:color="000000"/>
@@ -16821,7 +17231,7 @@
         </w:tc>
         <w:tc>
           <w:tcPr>
-            <w:tcW w:w="6255" w:type="dxa"/>
+            <w:tcW w:w="6256" w:type="dxa"/>
             <w:tcBorders>
               <w:left w:val="single" w:sz="2" w:space="0" w:color="000000"/>
               <w:bottom w:val="single" w:sz="2" w:space="0" w:color="000000"/>
@@ -16850,7 +17260,7 @@
         <w:trPr/>
         <w:tc>
           <w:tcPr>
-            <w:tcW w:w="3391" w:type="dxa"/>
+            <w:tcW w:w="3390" w:type="dxa"/>
             <w:tcBorders>
               <w:left w:val="single" w:sz="2" w:space="0" w:color="000000"/>
               <w:bottom w:val="single" w:sz="2" w:space="0" w:color="000000"/>
@@ -16890,7 +17300,7 @@
         </w:tc>
         <w:tc>
           <w:tcPr>
-            <w:tcW w:w="6255" w:type="dxa"/>
+            <w:tcW w:w="6256" w:type="dxa"/>
             <w:tcBorders>
               <w:left w:val="single" w:sz="2" w:space="0" w:color="000000"/>
               <w:bottom w:val="single" w:sz="2" w:space="0" w:color="000000"/>
@@ -16919,7 +17329,7 @@
         <w:trPr/>
         <w:tc>
           <w:tcPr>
-            <w:tcW w:w="3391" w:type="dxa"/>
+            <w:tcW w:w="3390" w:type="dxa"/>
             <w:tcBorders>
               <w:left w:val="single" w:sz="2" w:space="0" w:color="000000"/>
               <w:bottom w:val="single" w:sz="2" w:space="0" w:color="000000"/>
@@ -16959,7 +17369,7 @@
         </w:tc>
         <w:tc>
           <w:tcPr>
-            <w:tcW w:w="6255" w:type="dxa"/>
+            <w:tcW w:w="6256" w:type="dxa"/>
             <w:tcBorders>
               <w:left w:val="single" w:sz="2" w:space="0" w:color="000000"/>
               <w:bottom w:val="single" w:sz="2" w:space="0" w:color="000000"/>
@@ -16988,7 +17398,7 @@
         <w:trPr/>
         <w:tc>
           <w:tcPr>
-            <w:tcW w:w="3391" w:type="dxa"/>
+            <w:tcW w:w="3390" w:type="dxa"/>
             <w:tcBorders>
               <w:left w:val="single" w:sz="2" w:space="0" w:color="000000"/>
               <w:bottom w:val="single" w:sz="2" w:space="0" w:color="000000"/>
@@ -17013,7 +17423,7 @@
         </w:tc>
         <w:tc>
           <w:tcPr>
-            <w:tcW w:w="6255" w:type="dxa"/>
+            <w:tcW w:w="6256" w:type="dxa"/>
             <w:tcBorders>
               <w:left w:val="single" w:sz="2" w:space="0" w:color="000000"/>
               <w:bottom w:val="single" w:sz="2" w:space="0" w:color="000000"/>
@@ -17042,7 +17452,7 @@
         <w:trPr/>
         <w:tc>
           <w:tcPr>
-            <w:tcW w:w="3391" w:type="dxa"/>
+            <w:tcW w:w="3390" w:type="dxa"/>
             <w:tcBorders>
               <w:left w:val="single" w:sz="2" w:space="0" w:color="000000"/>
               <w:bottom w:val="single" w:sz="2" w:space="0" w:color="000000"/>
@@ -17067,7 +17477,7 @@
         </w:tc>
         <w:tc>
           <w:tcPr>
-            <w:tcW w:w="6255" w:type="dxa"/>
+            <w:tcW w:w="6256" w:type="dxa"/>
             <w:tcBorders>
               <w:left w:val="single" w:sz="2" w:space="0" w:color="000000"/>
               <w:bottom w:val="single" w:sz="2" w:space="0" w:color="000000"/>
@@ -17096,7 +17506,7 @@
         <w:trPr/>
         <w:tc>
           <w:tcPr>
-            <w:tcW w:w="3391" w:type="dxa"/>
+            <w:tcW w:w="3390" w:type="dxa"/>
             <w:tcBorders>
               <w:left w:val="single" w:sz="2" w:space="0" w:color="000000"/>
               <w:bottom w:val="single" w:sz="2" w:space="0" w:color="000000"/>
@@ -17121,7 +17531,7 @@
         </w:tc>
         <w:tc>
           <w:tcPr>
-            <w:tcW w:w="6255" w:type="dxa"/>
+            <w:tcW w:w="6256" w:type="dxa"/>
             <w:tcBorders>
               <w:left w:val="single" w:sz="2" w:space="0" w:color="000000"/>
               <w:bottom w:val="single" w:sz="2" w:space="0" w:color="000000"/>
@@ -17150,7 +17560,7 @@
         <w:trPr/>
         <w:tc>
           <w:tcPr>
-            <w:tcW w:w="3391" w:type="dxa"/>
+            <w:tcW w:w="3390" w:type="dxa"/>
             <w:tcBorders>
               <w:left w:val="single" w:sz="2" w:space="0" w:color="000000"/>
               <w:bottom w:val="single" w:sz="2" w:space="0" w:color="000000"/>
@@ -17175,7 +17585,7 @@
         </w:tc>
         <w:tc>
           <w:tcPr>
-            <w:tcW w:w="6255" w:type="dxa"/>
+            <w:tcW w:w="6256" w:type="dxa"/>
             <w:tcBorders>
               <w:left w:val="single" w:sz="2" w:space="0" w:color="000000"/>
               <w:bottom w:val="single" w:sz="2" w:space="0" w:color="000000"/>
@@ -17204,7 +17614,7 @@
         <w:trPr/>
         <w:tc>
           <w:tcPr>
-            <w:tcW w:w="3391" w:type="dxa"/>
+            <w:tcW w:w="3390" w:type="dxa"/>
             <w:tcBorders>
               <w:left w:val="single" w:sz="2" w:space="0" w:color="000000"/>
               <w:bottom w:val="single" w:sz="2" w:space="0" w:color="000000"/>
@@ -17229,7 +17639,7 @@
         </w:tc>
         <w:tc>
           <w:tcPr>
-            <w:tcW w:w="6255" w:type="dxa"/>
+            <w:tcW w:w="6256" w:type="dxa"/>
             <w:tcBorders>
               <w:left w:val="single" w:sz="2" w:space="0" w:color="000000"/>
               <w:bottom w:val="single" w:sz="2" w:space="0" w:color="000000"/>
@@ -17258,7 +17668,7 @@
         <w:trPr/>
         <w:tc>
           <w:tcPr>
-            <w:tcW w:w="3391" w:type="dxa"/>
+            <w:tcW w:w="3390" w:type="dxa"/>
             <w:tcBorders>
               <w:left w:val="single" w:sz="2" w:space="0" w:color="000000"/>
               <w:bottom w:val="single" w:sz="2" w:space="0" w:color="000000"/>
@@ -17284,7 +17694,7 @@
         </w:tc>
         <w:tc>
           <w:tcPr>
-            <w:tcW w:w="6255" w:type="dxa"/>
+            <w:tcW w:w="6256" w:type="dxa"/>
             <w:tcBorders>
               <w:left w:val="single" w:sz="2" w:space="0" w:color="000000"/>
               <w:bottom w:val="single" w:sz="2" w:space="0" w:color="000000"/>
@@ -17315,7 +17725,7 @@
         <w:trPr/>
         <w:tc>
           <w:tcPr>
-            <w:tcW w:w="3391" w:type="dxa"/>
+            <w:tcW w:w="3390" w:type="dxa"/>
             <w:tcBorders>
               <w:left w:val="single" w:sz="2" w:space="0" w:color="000000"/>
               <w:bottom w:val="single" w:sz="2" w:space="0" w:color="000000"/>
@@ -17342,7 +17752,7 @@
         </w:tc>
         <w:tc>
           <w:tcPr>
-            <w:tcW w:w="6255" w:type="dxa"/>
+            <w:tcW w:w="6256" w:type="dxa"/>
             <w:tcBorders>
               <w:left w:val="single" w:sz="2" w:space="0" w:color="000000"/>
               <w:bottom w:val="single" w:sz="2" w:space="0" w:color="000000"/>
@@ -18339,8 +18749,8 @@
           <w:rFonts w:ascii="Verdana" w:hAnsi="Verdana" w:cs="Verdana"/>
         </w:rPr>
       </w:pPr>
-      <w:bookmarkStart w:id="33" w:name="__RefHeading___Toc531076566"/>
-      <w:bookmarkEnd w:id="33"/>
+      <w:bookmarkStart w:id="34" w:name="__RefHeading___Toc531076566"/>
+      <w:bookmarkEnd w:id="34"/>
       <w:r>
         <w:rPr>
           <w:rFonts w:cs="Verdana" w:ascii="Verdana" w:hAnsi="Verdana"/>
@@ -18618,8 +19028,8 @@
           <w:color w:val="000000"/>
         </w:rPr>
       </w:pPr>
-      <w:bookmarkStart w:id="34" w:name="__RefHeading___Toc531076567"/>
-      <w:bookmarkEnd w:id="34"/>
+      <w:bookmarkStart w:id="35" w:name="__RefHeading___Toc531076567"/>
+      <w:bookmarkEnd w:id="35"/>
       <w:r>
         <w:rPr>
           <w:rFonts w:cs="Verdana" w:ascii="Verdana" w:hAnsi="Verdana"/>
@@ -18745,8 +19155,8 @@
           <w:color w:val="000000"/>
         </w:rPr>
       </w:pPr>
-      <w:bookmarkStart w:id="35" w:name="__RefHeading___Toc531076568"/>
-      <w:bookmarkEnd w:id="35"/>
+      <w:bookmarkStart w:id="36" w:name="__RefHeading___Toc531076568"/>
+      <w:bookmarkEnd w:id="36"/>
       <w:r>
         <w:rPr>
           <w:color w:val="000000"/>
@@ -18864,8 +19274,8 @@
         <w:spacing w:before="240" w:after="120"/>
         <w:rPr/>
       </w:pPr>
-      <w:bookmarkStart w:id="36" w:name="__RefHeading___Toc1588_1651833955"/>
-      <w:bookmarkEnd w:id="36"/>
+      <w:bookmarkStart w:id="37" w:name="__RefHeading___Toc1588_1651833955"/>
+      <w:bookmarkEnd w:id="37"/>
       <w:r>
         <w:rPr>
           <w:rFonts w:eastAsia="Arial" w:cs="Arial"/>
@@ -18908,7 +19318,7 @@
     </w:r>
     <w:r>
       <w:rPr/>
-      <w:t>9</w:t>
+      <w:t>26</w:t>
     </w:r>
     <w:r>
       <w:rPr/>
@@ -20247,7 +20657,7 @@
     <w:qFormat/>
     <w:pPr>
       <w:widowControl/>
-      <w:overflowPunct w:val="false"/>
+      <w:overflowPunct w:val="true"/>
       <w:bidi w:val="0"/>
       <w:jc w:val="left"/>
     </w:pPr>

</xml_diff>

<commit_message>
Dansih uder manual for 5.0.
</commit_message>
<xml_diff>
--- a/Documentation/Official Documentation/Brugervejledning for IBOS Nodelæser version 5.0.0.0.docx
+++ b/Documentation/Official Documentation/Brugervejledning for IBOS Nodelæser version 5.0.0.0.docx
@@ -2190,8 +2190,8 @@
       </w:tblPr>
       <w:tblGrid>
         <w:gridCol w:w="1585"/>
-        <w:gridCol w:w="5320"/>
-        <w:gridCol w:w="2742"/>
+        <w:gridCol w:w="5319"/>
+        <w:gridCol w:w="2743"/>
       </w:tblGrid>
       <w:tr>
         <w:trPr>
@@ -2266,7 +2266,7 @@
         </w:tc>
         <w:tc>
           <w:tcPr>
-            <w:tcW w:w="5320" w:type="dxa"/>
+            <w:tcW w:w="5319" w:type="dxa"/>
             <w:tcBorders>
               <w:top w:val="single" w:sz="2" w:space="0" w:color="000000"/>
               <w:left w:val="single" w:sz="2" w:space="0" w:color="000000"/>
@@ -2294,7 +2294,7 @@
         </w:tc>
         <w:tc>
           <w:tcPr>
-            <w:tcW w:w="2742" w:type="dxa"/>
+            <w:tcW w:w="2743" w:type="dxa"/>
             <w:tcBorders>
               <w:top w:val="single" w:sz="2" w:space="0" w:color="000000"/>
               <w:left w:val="single" w:sz="2" w:space="0" w:color="000000"/>
@@ -2353,7 +2353,7 @@
         </w:tc>
         <w:tc>
           <w:tcPr>
-            <w:tcW w:w="5320" w:type="dxa"/>
+            <w:tcW w:w="5319" w:type="dxa"/>
             <w:tcBorders>
               <w:left w:val="single" w:sz="2" w:space="0" w:color="000000"/>
               <w:bottom w:val="single" w:sz="2" w:space="0" w:color="000000"/>
@@ -2396,7 +2396,7 @@
         </w:tc>
         <w:tc>
           <w:tcPr>
-            <w:tcW w:w="2742" w:type="dxa"/>
+            <w:tcW w:w="2743" w:type="dxa"/>
             <w:tcBorders>
               <w:left w:val="single" w:sz="2" w:space="0" w:color="000000"/>
               <w:bottom w:val="single" w:sz="2" w:space="0" w:color="000000"/>
@@ -2451,7 +2451,7 @@
         </w:tc>
         <w:tc>
           <w:tcPr>
-            <w:tcW w:w="5320" w:type="dxa"/>
+            <w:tcW w:w="5319" w:type="dxa"/>
             <w:tcBorders>
               <w:left w:val="single" w:sz="2" w:space="0" w:color="000000"/>
               <w:bottom w:val="single" w:sz="2" w:space="0" w:color="000000"/>
@@ -2486,21 +2486,13 @@
                 <w:color w:val="000000"/>
                 <w:sz w:val="22"/>
               </w:rPr>
-              <w:t xml:space="preserve">fil fra seneste </w:t>
-            </w:r>
-            <w:r>
-              <w:rPr>
-                <w:rFonts w:cs="Verdana" w:ascii="Verdana" w:hAnsi="Verdana"/>
-                <w:color w:val="000000"/>
-                <w:sz w:val="22"/>
-              </w:rPr>
-              <w:t>sti</w:t>
-            </w:r>
-          </w:p>
-        </w:tc>
-        <w:tc>
-          <w:tcPr>
-            <w:tcW w:w="2742" w:type="dxa"/>
+              <w:t>fil fra seneste sti</w:t>
+            </w:r>
+          </w:p>
+        </w:tc>
+        <w:tc>
+          <w:tcPr>
+            <w:tcW w:w="2743" w:type="dxa"/>
             <w:tcBorders>
               <w:left w:val="single" w:sz="2" w:space="0" w:color="000000"/>
               <w:bottom w:val="single" w:sz="2" w:space="0" w:color="000000"/>
@@ -2555,7 +2547,7 @@
         </w:tc>
         <w:tc>
           <w:tcPr>
-            <w:tcW w:w="5320" w:type="dxa"/>
+            <w:tcW w:w="5319" w:type="dxa"/>
             <w:tcBorders>
               <w:left w:val="single" w:sz="2" w:space="0" w:color="000000"/>
               <w:bottom w:val="single" w:sz="2" w:space="0" w:color="000000"/>
@@ -2599,7 +2591,7 @@
         </w:tc>
         <w:tc>
           <w:tcPr>
-            <w:tcW w:w="2742" w:type="dxa"/>
+            <w:tcW w:w="2743" w:type="dxa"/>
             <w:tcBorders>
               <w:left w:val="single" w:sz="2" w:space="0" w:color="000000"/>
               <w:bottom w:val="single" w:sz="2" w:space="0" w:color="000000"/>
@@ -2674,7 +2666,7 @@
         </w:tc>
         <w:tc>
           <w:tcPr>
-            <w:tcW w:w="5320" w:type="dxa"/>
+            <w:tcW w:w="5319" w:type="dxa"/>
             <w:tcBorders>
               <w:left w:val="single" w:sz="2" w:space="0" w:color="000000"/>
               <w:bottom w:val="single" w:sz="2" w:space="0" w:color="000000"/>
@@ -2701,7 +2693,7 @@
         </w:tc>
         <w:tc>
           <w:tcPr>
-            <w:tcW w:w="2742" w:type="dxa"/>
+            <w:tcW w:w="2743" w:type="dxa"/>
             <w:tcBorders>
               <w:left w:val="single" w:sz="2" w:space="0" w:color="000000"/>
               <w:bottom w:val="single" w:sz="2" w:space="0" w:color="000000"/>
@@ -2760,7 +2752,7 @@
         </w:tc>
         <w:tc>
           <w:tcPr>
-            <w:tcW w:w="5320" w:type="dxa"/>
+            <w:tcW w:w="5319" w:type="dxa"/>
             <w:tcBorders>
               <w:left w:val="single" w:sz="2" w:space="0" w:color="000000"/>
               <w:bottom w:val="single" w:sz="2" w:space="0" w:color="000000"/>
@@ -2787,7 +2779,7 @@
         </w:tc>
         <w:tc>
           <w:tcPr>
-            <w:tcW w:w="2742" w:type="dxa"/>
+            <w:tcW w:w="2743" w:type="dxa"/>
             <w:tcBorders>
               <w:left w:val="single" w:sz="2" w:space="0" w:color="000000"/>
               <w:bottom w:val="single" w:sz="2" w:space="0" w:color="000000"/>
@@ -2846,7 +2838,7 @@
         </w:tc>
         <w:tc>
           <w:tcPr>
-            <w:tcW w:w="5320" w:type="dxa"/>
+            <w:tcW w:w="5319" w:type="dxa"/>
             <w:tcBorders>
               <w:left w:val="single" w:sz="2" w:space="0" w:color="000000"/>
               <w:bottom w:val="single" w:sz="2" w:space="0" w:color="000000"/>
@@ -2873,7 +2865,7 @@
         </w:tc>
         <w:tc>
           <w:tcPr>
-            <w:tcW w:w="2742" w:type="dxa"/>
+            <w:tcW w:w="2743" w:type="dxa"/>
             <w:tcBorders>
               <w:left w:val="single" w:sz="2" w:space="0" w:color="000000"/>
               <w:bottom w:val="single" w:sz="2" w:space="0" w:color="000000"/>
@@ -2932,7 +2924,7 @@
         </w:tc>
         <w:tc>
           <w:tcPr>
-            <w:tcW w:w="5320" w:type="dxa"/>
+            <w:tcW w:w="5319" w:type="dxa"/>
             <w:tcBorders>
               <w:left w:val="single" w:sz="2" w:space="0" w:color="000000"/>
               <w:bottom w:val="single" w:sz="2" w:space="0" w:color="000000"/>
@@ -2958,7 +2950,7 @@
         </w:tc>
         <w:tc>
           <w:tcPr>
-            <w:tcW w:w="2742" w:type="dxa"/>
+            <w:tcW w:w="2743" w:type="dxa"/>
             <w:tcBorders>
               <w:left w:val="single" w:sz="2" w:space="0" w:color="000000"/>
               <w:bottom w:val="single" w:sz="2" w:space="0" w:color="000000"/>
@@ -3020,7 +3012,7 @@
         </w:tc>
         <w:tc>
           <w:tcPr>
-            <w:tcW w:w="5320" w:type="dxa"/>
+            <w:tcW w:w="5319" w:type="dxa"/>
             <w:tcBorders>
               <w:left w:val="single" w:sz="2" w:space="0" w:color="000000"/>
               <w:bottom w:val="single" w:sz="2" w:space="0" w:color="000000"/>
@@ -3060,7 +3052,7 @@
         </w:tc>
         <w:tc>
           <w:tcPr>
-            <w:tcW w:w="2742" w:type="dxa"/>
+            <w:tcW w:w="2743" w:type="dxa"/>
             <w:tcBorders>
               <w:left w:val="single" w:sz="2" w:space="0" w:color="000000"/>
               <w:bottom w:val="single" w:sz="2" w:space="0" w:color="000000"/>
@@ -3124,7 +3116,7 @@
         </w:tc>
         <w:tc>
           <w:tcPr>
-            <w:tcW w:w="5320" w:type="dxa"/>
+            <w:tcW w:w="5319" w:type="dxa"/>
             <w:tcBorders>
               <w:left w:val="single" w:sz="2" w:space="0" w:color="000000"/>
               <w:bottom w:val="single" w:sz="2" w:space="0" w:color="000000"/>
@@ -3164,7 +3156,7 @@
         </w:tc>
         <w:tc>
           <w:tcPr>
-            <w:tcW w:w="2742" w:type="dxa"/>
+            <w:tcW w:w="2743" w:type="dxa"/>
             <w:tcBorders>
               <w:left w:val="single" w:sz="2" w:space="0" w:color="000000"/>
               <w:bottom w:val="single" w:sz="2" w:space="0" w:color="000000"/>
@@ -3228,7 +3220,7 @@
         </w:tc>
         <w:tc>
           <w:tcPr>
-            <w:tcW w:w="5320" w:type="dxa"/>
+            <w:tcW w:w="5319" w:type="dxa"/>
             <w:tcBorders>
               <w:left w:val="single" w:sz="2" w:space="0" w:color="000000"/>
               <w:bottom w:val="single" w:sz="2" w:space="0" w:color="000000"/>
@@ -3258,7 +3250,7 @@
         </w:tc>
         <w:tc>
           <w:tcPr>
-            <w:tcW w:w="2742" w:type="dxa"/>
+            <w:tcW w:w="2743" w:type="dxa"/>
             <w:tcBorders>
               <w:left w:val="single" w:sz="2" w:space="0" w:color="000000"/>
               <w:bottom w:val="single" w:sz="2" w:space="0" w:color="000000"/>
@@ -3321,7 +3313,7 @@
         </w:tc>
         <w:tc>
           <w:tcPr>
-            <w:tcW w:w="5320" w:type="dxa"/>
+            <w:tcW w:w="5319" w:type="dxa"/>
             <w:tcBorders>
               <w:left w:val="single" w:sz="2" w:space="0" w:color="000000"/>
               <w:bottom w:val="single" w:sz="2" w:space="0" w:color="000000"/>
@@ -3349,7 +3341,7 @@
         </w:tc>
         <w:tc>
           <w:tcPr>
-            <w:tcW w:w="2742" w:type="dxa"/>
+            <w:tcW w:w="2743" w:type="dxa"/>
             <w:tcBorders>
               <w:left w:val="single" w:sz="2" w:space="0" w:color="000000"/>
               <w:bottom w:val="single" w:sz="2" w:space="0" w:color="000000"/>
@@ -3408,7 +3400,7 @@
         </w:tc>
         <w:tc>
           <w:tcPr>
-            <w:tcW w:w="5320" w:type="dxa"/>
+            <w:tcW w:w="5319" w:type="dxa"/>
             <w:tcBorders>
               <w:left w:val="single" w:sz="2" w:space="0" w:color="000000"/>
               <w:bottom w:val="single" w:sz="2" w:space="0" w:color="000000"/>
@@ -3435,7 +3427,7 @@
         </w:tc>
         <w:tc>
           <w:tcPr>
-            <w:tcW w:w="2742" w:type="dxa"/>
+            <w:tcW w:w="2743" w:type="dxa"/>
             <w:tcBorders>
               <w:left w:val="single" w:sz="2" w:space="0" w:color="000000"/>
               <w:bottom w:val="single" w:sz="2" w:space="0" w:color="000000"/>
@@ -3494,7 +3486,7 @@
         </w:tc>
         <w:tc>
           <w:tcPr>
-            <w:tcW w:w="5320" w:type="dxa"/>
+            <w:tcW w:w="5319" w:type="dxa"/>
             <w:tcBorders>
               <w:left w:val="single" w:sz="2" w:space="0" w:color="000000"/>
               <w:bottom w:val="single" w:sz="2" w:space="0" w:color="000000"/>
@@ -3521,7 +3513,7 @@
         </w:tc>
         <w:tc>
           <w:tcPr>
-            <w:tcW w:w="2742" w:type="dxa"/>
+            <w:tcW w:w="2743" w:type="dxa"/>
             <w:tcBorders>
               <w:left w:val="single" w:sz="2" w:space="0" w:color="000000"/>
               <w:bottom w:val="single" w:sz="2" w:space="0" w:color="000000"/>
@@ -3579,7 +3571,7 @@
         </w:tc>
         <w:tc>
           <w:tcPr>
-            <w:tcW w:w="5320" w:type="dxa"/>
+            <w:tcW w:w="5319" w:type="dxa"/>
             <w:tcBorders>
               <w:left w:val="single" w:sz="2" w:space="0" w:color="000000"/>
               <w:bottom w:val="single" w:sz="2" w:space="0" w:color="000000"/>
@@ -3606,7 +3598,7 @@
         </w:tc>
         <w:tc>
           <w:tcPr>
-            <w:tcW w:w="2742" w:type="dxa"/>
+            <w:tcW w:w="2743" w:type="dxa"/>
             <w:tcBorders>
               <w:left w:val="single" w:sz="2" w:space="0" w:color="000000"/>
               <w:bottom w:val="single" w:sz="2" w:space="0" w:color="000000"/>
@@ -3664,7 +3656,7 @@
         </w:tc>
         <w:tc>
           <w:tcPr>
-            <w:tcW w:w="5320" w:type="dxa"/>
+            <w:tcW w:w="5319" w:type="dxa"/>
             <w:tcBorders>
               <w:left w:val="single" w:sz="2" w:space="0" w:color="000000"/>
               <w:bottom w:val="single" w:sz="2" w:space="0" w:color="000000"/>
@@ -3691,7 +3683,7 @@
         </w:tc>
         <w:tc>
           <w:tcPr>
-            <w:tcW w:w="2742" w:type="dxa"/>
+            <w:tcW w:w="2743" w:type="dxa"/>
             <w:tcBorders>
               <w:left w:val="single" w:sz="2" w:space="0" w:color="000000"/>
               <w:bottom w:val="single" w:sz="2" w:space="0" w:color="000000"/>
@@ -3749,7 +3741,7 @@
         </w:tc>
         <w:tc>
           <w:tcPr>
-            <w:tcW w:w="5320" w:type="dxa"/>
+            <w:tcW w:w="5319" w:type="dxa"/>
             <w:tcBorders>
               <w:left w:val="single" w:sz="2" w:space="0" w:color="000000"/>
               <w:bottom w:val="single" w:sz="2" w:space="0" w:color="000000"/>
@@ -3775,7 +3767,7 @@
         </w:tc>
         <w:tc>
           <w:tcPr>
-            <w:tcW w:w="2742" w:type="dxa"/>
+            <w:tcW w:w="2743" w:type="dxa"/>
             <w:tcBorders>
               <w:left w:val="single" w:sz="2" w:space="0" w:color="000000"/>
               <w:bottom w:val="single" w:sz="2" w:space="0" w:color="000000"/>
@@ -3833,7 +3825,7 @@
         </w:tc>
         <w:tc>
           <w:tcPr>
-            <w:tcW w:w="5320" w:type="dxa"/>
+            <w:tcW w:w="5319" w:type="dxa"/>
             <w:tcBorders>
               <w:left w:val="single" w:sz="2" w:space="0" w:color="000000"/>
               <w:bottom w:val="single" w:sz="2" w:space="0" w:color="000000"/>
@@ -3860,7 +3852,7 @@
         </w:tc>
         <w:tc>
           <w:tcPr>
-            <w:tcW w:w="2742" w:type="dxa"/>
+            <w:tcW w:w="2743" w:type="dxa"/>
             <w:tcBorders>
               <w:left w:val="single" w:sz="2" w:space="0" w:color="000000"/>
               <w:bottom w:val="single" w:sz="2" w:space="0" w:color="000000"/>
@@ -3919,7 +3911,7 @@
         </w:tc>
         <w:tc>
           <w:tcPr>
-            <w:tcW w:w="5320" w:type="dxa"/>
+            <w:tcW w:w="5319" w:type="dxa"/>
             <w:tcBorders>
               <w:left w:val="single" w:sz="2" w:space="0" w:color="000000"/>
               <w:bottom w:val="single" w:sz="2" w:space="0" w:color="000000"/>
@@ -3946,7 +3938,7 @@
         </w:tc>
         <w:tc>
           <w:tcPr>
-            <w:tcW w:w="2742" w:type="dxa"/>
+            <w:tcW w:w="2743" w:type="dxa"/>
             <w:tcBorders>
               <w:left w:val="single" w:sz="2" w:space="0" w:color="000000"/>
               <w:bottom w:val="single" w:sz="2" w:space="0" w:color="000000"/>
@@ -4005,7 +3997,7 @@
         </w:tc>
         <w:tc>
           <w:tcPr>
-            <w:tcW w:w="5320" w:type="dxa"/>
+            <w:tcW w:w="5319" w:type="dxa"/>
             <w:tcBorders>
               <w:left w:val="single" w:sz="2" w:space="0" w:color="000000"/>
               <w:bottom w:val="single" w:sz="2" w:space="0" w:color="000000"/>
@@ -4033,7 +4025,7 @@
         </w:tc>
         <w:tc>
           <w:tcPr>
-            <w:tcW w:w="2742" w:type="dxa"/>
+            <w:tcW w:w="2743" w:type="dxa"/>
             <w:tcBorders>
               <w:left w:val="single" w:sz="2" w:space="0" w:color="000000"/>
               <w:bottom w:val="single" w:sz="2" w:space="0" w:color="000000"/>
@@ -4092,7 +4084,7 @@
         </w:tc>
         <w:tc>
           <w:tcPr>
-            <w:tcW w:w="5320" w:type="dxa"/>
+            <w:tcW w:w="5319" w:type="dxa"/>
             <w:tcBorders>
               <w:left w:val="single" w:sz="2" w:space="0" w:color="000000"/>
               <w:bottom w:val="single" w:sz="2" w:space="0" w:color="000000"/>
@@ -4120,7 +4112,7 @@
         </w:tc>
         <w:tc>
           <w:tcPr>
-            <w:tcW w:w="2742" w:type="dxa"/>
+            <w:tcW w:w="2743" w:type="dxa"/>
             <w:tcBorders>
               <w:left w:val="single" w:sz="2" w:space="0" w:color="000000"/>
               <w:bottom w:val="single" w:sz="2" w:space="0" w:color="000000"/>
@@ -4179,7 +4171,7 @@
         </w:tc>
         <w:tc>
           <w:tcPr>
-            <w:tcW w:w="5320" w:type="dxa"/>
+            <w:tcW w:w="5319" w:type="dxa"/>
             <w:tcBorders>
               <w:left w:val="single" w:sz="2" w:space="0" w:color="000000"/>
               <w:bottom w:val="single" w:sz="2" w:space="0" w:color="000000"/>
@@ -4207,7 +4199,7 @@
         </w:tc>
         <w:tc>
           <w:tcPr>
-            <w:tcW w:w="2742" w:type="dxa"/>
+            <w:tcW w:w="2743" w:type="dxa"/>
             <w:tcBorders>
               <w:left w:val="single" w:sz="2" w:space="0" w:color="000000"/>
               <w:bottom w:val="single" w:sz="2" w:space="0" w:color="000000"/>
@@ -4265,7 +4257,7 @@
         </w:tc>
         <w:tc>
           <w:tcPr>
-            <w:tcW w:w="5320" w:type="dxa"/>
+            <w:tcW w:w="5319" w:type="dxa"/>
             <w:tcBorders>
               <w:left w:val="single" w:sz="2" w:space="0" w:color="000000"/>
               <w:bottom w:val="single" w:sz="2" w:space="0" w:color="000000"/>
@@ -4293,7 +4285,7 @@
         </w:tc>
         <w:tc>
           <w:tcPr>
-            <w:tcW w:w="2742" w:type="dxa"/>
+            <w:tcW w:w="2743" w:type="dxa"/>
             <w:tcBorders>
               <w:left w:val="single" w:sz="2" w:space="0" w:color="000000"/>
               <w:bottom w:val="single" w:sz="2" w:space="0" w:color="000000"/>
@@ -4352,7 +4344,7 @@
         </w:tc>
         <w:tc>
           <w:tcPr>
-            <w:tcW w:w="5320" w:type="dxa"/>
+            <w:tcW w:w="5319" w:type="dxa"/>
             <w:tcBorders>
               <w:left w:val="single" w:sz="2" w:space="0" w:color="000000"/>
               <w:bottom w:val="single" w:sz="2" w:space="0" w:color="000000"/>
@@ -4379,7 +4371,7 @@
         </w:tc>
         <w:tc>
           <w:tcPr>
-            <w:tcW w:w="2742" w:type="dxa"/>
+            <w:tcW w:w="2743" w:type="dxa"/>
             <w:tcBorders>
               <w:left w:val="single" w:sz="2" w:space="0" w:color="000000"/>
               <w:bottom w:val="single" w:sz="2" w:space="0" w:color="000000"/>
@@ -4440,7 +4432,7 @@
         </w:tc>
         <w:tc>
           <w:tcPr>
-            <w:tcW w:w="5320" w:type="dxa"/>
+            <w:tcW w:w="5319" w:type="dxa"/>
             <w:tcBorders>
               <w:left w:val="single" w:sz="2" w:space="0" w:color="000000"/>
               <w:bottom w:val="single" w:sz="2" w:space="0" w:color="000000"/>
@@ -4469,7 +4461,7 @@
         </w:tc>
         <w:tc>
           <w:tcPr>
-            <w:tcW w:w="2742" w:type="dxa"/>
+            <w:tcW w:w="2743" w:type="dxa"/>
             <w:tcBorders>
               <w:left w:val="single" w:sz="2" w:space="0" w:color="000000"/>
               <w:bottom w:val="single" w:sz="2" w:space="0" w:color="000000"/>
@@ -4529,7 +4521,7 @@
         </w:tc>
         <w:tc>
           <w:tcPr>
-            <w:tcW w:w="5320" w:type="dxa"/>
+            <w:tcW w:w="5319" w:type="dxa"/>
             <w:tcBorders>
               <w:left w:val="single" w:sz="2" w:space="0" w:color="000000"/>
               <w:bottom w:val="single" w:sz="2" w:space="0" w:color="000000"/>
@@ -4558,7 +4550,7 @@
         </w:tc>
         <w:tc>
           <w:tcPr>
-            <w:tcW w:w="2742" w:type="dxa"/>
+            <w:tcW w:w="2743" w:type="dxa"/>
             <w:tcBorders>
               <w:left w:val="single" w:sz="2" w:space="0" w:color="000000"/>
               <w:bottom w:val="single" w:sz="2" w:space="0" w:color="000000"/>
@@ -4622,7 +4614,7 @@
         </w:tc>
         <w:tc>
           <w:tcPr>
-            <w:tcW w:w="5320" w:type="dxa"/>
+            <w:tcW w:w="5319" w:type="dxa"/>
             <w:tcBorders>
               <w:left w:val="single" w:sz="2" w:space="0" w:color="000000"/>
               <w:bottom w:val="single" w:sz="2" w:space="0" w:color="000000"/>
@@ -4652,7 +4644,7 @@
         </w:tc>
         <w:tc>
           <w:tcPr>
-            <w:tcW w:w="2742" w:type="dxa"/>
+            <w:tcW w:w="2743" w:type="dxa"/>
             <w:tcBorders>
               <w:left w:val="single" w:sz="2" w:space="0" w:color="000000"/>
               <w:bottom w:val="single" w:sz="2" w:space="0" w:color="000000"/>
@@ -4717,7 +4709,7 @@
         </w:tc>
         <w:tc>
           <w:tcPr>
-            <w:tcW w:w="5320" w:type="dxa"/>
+            <w:tcW w:w="5319" w:type="dxa"/>
             <w:tcBorders>
               <w:left w:val="single" w:sz="2" w:space="0" w:color="000000"/>
               <w:bottom w:val="single" w:sz="2" w:space="0" w:color="000000"/>
@@ -4747,7 +4739,7 @@
         </w:tc>
         <w:tc>
           <w:tcPr>
-            <w:tcW w:w="2742" w:type="dxa"/>
+            <w:tcW w:w="2743" w:type="dxa"/>
             <w:tcBorders>
               <w:left w:val="single" w:sz="2" w:space="0" w:color="000000"/>
               <w:bottom w:val="single" w:sz="2" w:space="0" w:color="000000"/>
@@ -4812,7 +4804,7 @@
         </w:tc>
         <w:tc>
           <w:tcPr>
-            <w:tcW w:w="5320" w:type="dxa"/>
+            <w:tcW w:w="5319" w:type="dxa"/>
             <w:tcBorders>
               <w:left w:val="single" w:sz="2" w:space="0" w:color="000000"/>
               <w:bottom w:val="single" w:sz="2" w:space="0" w:color="000000"/>
@@ -4842,7 +4834,7 @@
         </w:tc>
         <w:tc>
           <w:tcPr>
-            <w:tcW w:w="2742" w:type="dxa"/>
+            <w:tcW w:w="2743" w:type="dxa"/>
             <w:tcBorders>
               <w:left w:val="single" w:sz="2" w:space="0" w:color="000000"/>
               <w:bottom w:val="single" w:sz="2" w:space="0" w:color="000000"/>
@@ -4907,7 +4899,7 @@
         </w:tc>
         <w:tc>
           <w:tcPr>
-            <w:tcW w:w="5320" w:type="dxa"/>
+            <w:tcW w:w="5319" w:type="dxa"/>
             <w:tcBorders>
               <w:left w:val="single" w:sz="2" w:space="0" w:color="000000"/>
               <w:bottom w:val="single" w:sz="2" w:space="0" w:color="000000"/>
@@ -4937,7 +4929,7 @@
         </w:tc>
         <w:tc>
           <w:tcPr>
-            <w:tcW w:w="2742" w:type="dxa"/>
+            <w:tcW w:w="2743" w:type="dxa"/>
             <w:tcBorders>
               <w:left w:val="single" w:sz="2" w:space="0" w:color="000000"/>
               <w:bottom w:val="single" w:sz="2" w:space="0" w:color="000000"/>
@@ -5002,7 +4994,7 @@
         </w:tc>
         <w:tc>
           <w:tcPr>
-            <w:tcW w:w="5320" w:type="dxa"/>
+            <w:tcW w:w="5319" w:type="dxa"/>
             <w:tcBorders>
               <w:left w:val="single" w:sz="2" w:space="0" w:color="000000"/>
               <w:bottom w:val="single" w:sz="2" w:space="0" w:color="000000"/>
@@ -5032,7 +5024,7 @@
         </w:tc>
         <w:tc>
           <w:tcPr>
-            <w:tcW w:w="2742" w:type="dxa"/>
+            <w:tcW w:w="2743" w:type="dxa"/>
             <w:tcBorders>
               <w:left w:val="single" w:sz="2" w:space="0" w:color="000000"/>
               <w:bottom w:val="single" w:sz="2" w:space="0" w:color="000000"/>
@@ -5097,7 +5089,7 @@
         </w:tc>
         <w:tc>
           <w:tcPr>
-            <w:tcW w:w="5320" w:type="dxa"/>
+            <w:tcW w:w="5319" w:type="dxa"/>
             <w:tcBorders>
               <w:left w:val="single" w:sz="2" w:space="0" w:color="000000"/>
               <w:bottom w:val="single" w:sz="2" w:space="0" w:color="000000"/>
@@ -5127,7 +5119,7 @@
         </w:tc>
         <w:tc>
           <w:tcPr>
-            <w:tcW w:w="2742" w:type="dxa"/>
+            <w:tcW w:w="2743" w:type="dxa"/>
             <w:tcBorders>
               <w:left w:val="single" w:sz="2" w:space="0" w:color="000000"/>
               <w:bottom w:val="single" w:sz="2" w:space="0" w:color="000000"/>
@@ -5192,7 +5184,7 @@
         </w:tc>
         <w:tc>
           <w:tcPr>
-            <w:tcW w:w="5320" w:type="dxa"/>
+            <w:tcW w:w="5319" w:type="dxa"/>
             <w:tcBorders>
               <w:left w:val="single" w:sz="2" w:space="0" w:color="000000"/>
               <w:bottom w:val="single" w:sz="2" w:space="0" w:color="000000"/>
@@ -5222,7 +5214,7 @@
         </w:tc>
         <w:tc>
           <w:tcPr>
-            <w:tcW w:w="2742" w:type="dxa"/>
+            <w:tcW w:w="2743" w:type="dxa"/>
             <w:tcBorders>
               <w:left w:val="single" w:sz="2" w:space="0" w:color="000000"/>
               <w:bottom w:val="single" w:sz="2" w:space="0" w:color="000000"/>
@@ -5248,16 +5240,7 @@
                 <w:sz w:val="22"/>
                 <w:szCs w:val="22"/>
               </w:rPr>
-              <w:t xml:space="preserve">ALT + T + </w:t>
-            </w:r>
-            <w:r>
-              <w:rPr>
-                <w:rFonts w:ascii="Verdana" w:hAnsi="Verdana"/>
-                <w:color w:val="C9211E"/>
-                <w:sz w:val="22"/>
-                <w:szCs w:val="22"/>
-              </w:rPr>
-              <w:t>I</w:t>
+              <w:t>ALT + T + I</w:t>
             </w:r>
           </w:p>
         </w:tc>
@@ -5293,7 +5276,7 @@
         </w:tc>
         <w:tc>
           <w:tcPr>
-            <w:tcW w:w="5320" w:type="dxa"/>
+            <w:tcW w:w="5319" w:type="dxa"/>
             <w:tcBorders>
               <w:left w:val="single" w:sz="2" w:space="0" w:color="000000"/>
               <w:bottom w:val="single" w:sz="2" w:space="0" w:color="000000"/>
@@ -5336,7 +5319,7 @@
         </w:tc>
         <w:tc>
           <w:tcPr>
-            <w:tcW w:w="2742" w:type="dxa"/>
+            <w:tcW w:w="2743" w:type="dxa"/>
             <w:tcBorders>
               <w:left w:val="single" w:sz="2" w:space="0" w:color="000000"/>
               <w:bottom w:val="single" w:sz="2" w:space="0" w:color="000000"/>
@@ -5396,7 +5379,7 @@
         </w:tc>
         <w:tc>
           <w:tcPr>
-            <w:tcW w:w="5320" w:type="dxa"/>
+            <w:tcW w:w="5319" w:type="dxa"/>
             <w:tcBorders>
               <w:left w:val="single" w:sz="2" w:space="0" w:color="000000"/>
               <w:bottom w:val="single" w:sz="2" w:space="0" w:color="000000"/>
@@ -5439,7 +5422,7 @@
         </w:tc>
         <w:tc>
           <w:tcPr>
-            <w:tcW w:w="2742" w:type="dxa"/>
+            <w:tcW w:w="2743" w:type="dxa"/>
             <w:tcBorders>
               <w:left w:val="single" w:sz="2" w:space="0" w:color="000000"/>
               <w:bottom w:val="single" w:sz="2" w:space="0" w:color="000000"/>
@@ -5498,7 +5481,7 @@
         </w:tc>
         <w:tc>
           <w:tcPr>
-            <w:tcW w:w="5320" w:type="dxa"/>
+            <w:tcW w:w="5319" w:type="dxa"/>
             <w:tcBorders>
               <w:left w:val="single" w:sz="2" w:space="0" w:color="000000"/>
               <w:bottom w:val="single" w:sz="2" w:space="0" w:color="000000"/>
@@ -5541,7 +5524,7 @@
         </w:tc>
         <w:tc>
           <w:tcPr>
-            <w:tcW w:w="2742" w:type="dxa"/>
+            <w:tcW w:w="2743" w:type="dxa"/>
             <w:tcBorders>
               <w:left w:val="single" w:sz="2" w:space="0" w:color="000000"/>
               <w:bottom w:val="single" w:sz="2" w:space="0" w:color="000000"/>
@@ -5602,7 +5585,7 @@
         </w:tc>
         <w:tc>
           <w:tcPr>
-            <w:tcW w:w="5320" w:type="dxa"/>
+            <w:tcW w:w="5319" w:type="dxa"/>
             <w:tcBorders>
               <w:left w:val="single" w:sz="2" w:space="0" w:color="000000"/>
               <w:bottom w:val="single" w:sz="2" w:space="0" w:color="000000"/>
@@ -5645,7 +5628,7 @@
         </w:tc>
         <w:tc>
           <w:tcPr>
-            <w:tcW w:w="2742" w:type="dxa"/>
+            <w:tcW w:w="2743" w:type="dxa"/>
             <w:tcBorders>
               <w:left w:val="single" w:sz="2" w:space="0" w:color="000000"/>
               <w:bottom w:val="single" w:sz="2" w:space="0" w:color="000000"/>
@@ -5708,7 +5691,7 @@
         </w:tc>
         <w:tc>
           <w:tcPr>
-            <w:tcW w:w="5320" w:type="dxa"/>
+            <w:tcW w:w="5319" w:type="dxa"/>
             <w:tcBorders>
               <w:left w:val="single" w:sz="2" w:space="0" w:color="000000"/>
               <w:bottom w:val="single" w:sz="2" w:space="0" w:color="000000"/>
@@ -5738,7 +5721,7 @@
         </w:tc>
         <w:tc>
           <w:tcPr>
-            <w:tcW w:w="2742" w:type="dxa"/>
+            <w:tcW w:w="2743" w:type="dxa"/>
             <w:tcBorders>
               <w:left w:val="single" w:sz="2" w:space="0" w:color="000000"/>
               <w:bottom w:val="single" w:sz="2" w:space="0" w:color="000000"/>
@@ -5803,7 +5786,7 @@
         </w:tc>
         <w:tc>
           <w:tcPr>
-            <w:tcW w:w="5320" w:type="dxa"/>
+            <w:tcW w:w="5319" w:type="dxa"/>
             <w:tcBorders>
               <w:left w:val="single" w:sz="2" w:space="0" w:color="000000"/>
               <w:bottom w:val="single" w:sz="2" w:space="0" w:color="000000"/>
@@ -5833,7 +5816,7 @@
         </w:tc>
         <w:tc>
           <w:tcPr>
-            <w:tcW w:w="2742" w:type="dxa"/>
+            <w:tcW w:w="2743" w:type="dxa"/>
             <w:tcBorders>
               <w:left w:val="single" w:sz="2" w:space="0" w:color="000000"/>
               <w:bottom w:val="single" w:sz="2" w:space="0" w:color="000000"/>
@@ -5845,13 +5828,17 @@
             <w:pPr>
               <w:pStyle w:val="Tabelindhold"/>
               <w:snapToGrid w:val="false"/>
-              <w:rPr>
-                <w:rFonts w:ascii="Verdana" w:hAnsi="Verdana" w:cs="Verdana"/>
+              <w:rPr/>
+            </w:pPr>
+            <w:r>
+              <w:rPr>
+                <w:rFonts w:cs="Verdana" w:ascii="Verdana" w:hAnsi="Verdana"/>
                 <w:color w:val="C9211E"/>
                 <w:sz w:val="22"/>
                 <w:szCs w:val="22"/>
               </w:rPr>
-            </w:pPr>
+              <w:t xml:space="preserve">ALT + T + </w:t>
+            </w:r>
             <w:r>
               <w:rPr>
                 <w:rFonts w:cs="Verdana" w:ascii="Verdana" w:hAnsi="Verdana"/>
@@ -5859,7 +5846,7 @@
                 <w:sz w:val="22"/>
                 <w:szCs w:val="22"/>
               </w:rPr>
-              <w:t>ALT + T + B</w:t>
+              <w:t>E</w:t>
             </w:r>
           </w:p>
         </w:tc>
@@ -5895,7 +5882,7 @@
         </w:tc>
         <w:tc>
           <w:tcPr>
-            <w:tcW w:w="5320" w:type="dxa"/>
+            <w:tcW w:w="5319" w:type="dxa"/>
             <w:tcBorders>
               <w:left w:val="single" w:sz="2" w:space="0" w:color="000000"/>
               <w:bottom w:val="single" w:sz="2" w:space="0" w:color="000000"/>
@@ -5922,7 +5909,7 @@
         </w:tc>
         <w:tc>
           <w:tcPr>
-            <w:tcW w:w="2742" w:type="dxa"/>
+            <w:tcW w:w="2743" w:type="dxa"/>
             <w:tcBorders>
               <w:left w:val="single" w:sz="2" w:space="0" w:color="000000"/>
               <w:bottom w:val="single" w:sz="2" w:space="0" w:color="000000"/>
@@ -5982,7 +5969,7 @@
         </w:tc>
         <w:tc>
           <w:tcPr>
-            <w:tcW w:w="5320" w:type="dxa"/>
+            <w:tcW w:w="5319" w:type="dxa"/>
             <w:tcBorders>
               <w:left w:val="single" w:sz="2" w:space="0" w:color="000000"/>
               <w:bottom w:val="single" w:sz="2" w:space="0" w:color="000000"/>
@@ -6009,7 +5996,7 @@
         </w:tc>
         <w:tc>
           <w:tcPr>
-            <w:tcW w:w="2742" w:type="dxa"/>
+            <w:tcW w:w="2743" w:type="dxa"/>
             <w:tcBorders>
               <w:left w:val="single" w:sz="2" w:space="0" w:color="000000"/>
               <w:bottom w:val="single" w:sz="2" w:space="0" w:color="000000"/>
@@ -6052,15 +6039,18 @@
             <w:pPr>
               <w:pStyle w:val="Tabelindhold"/>
               <w:rPr>
-                <w:rFonts w:ascii="Verdana" w:hAnsi="Verdana" w:cs="Verdana"/>
-                <w:sz w:val="22"/>
-              </w:rPr>
-            </w:pPr>
-            <w:r>
-              <w:rPr>
-                <w:rFonts w:cs="Verdana" w:ascii="Verdana" w:hAnsi="Verdana"/>
-                <w:color w:val="000000"/>
-                <w:sz w:val="22"/>
+                <w:rFonts w:ascii="Verdana" w:hAnsi="Verdana"/>
+                <w:color w:val="C9211E"/>
+                <w:sz w:val="22"/>
+                <w:szCs w:val="22"/>
+              </w:rPr>
+            </w:pPr>
+            <w:r>
+              <w:rPr>
+                <w:rFonts w:cs="Verdana" w:ascii="Verdana" w:hAnsi="Verdana"/>
+                <w:color w:val="C9211E"/>
+                <w:sz w:val="22"/>
+                <w:szCs w:val="22"/>
               </w:rPr>
               <w:t>Værktøjer</w:t>
             </w:r>
@@ -6068,50 +6058,37 @@
         </w:tc>
         <w:tc>
           <w:tcPr>
-            <w:tcW w:w="5320" w:type="dxa"/>
-            <w:tcBorders>
-              <w:left w:val="single" w:sz="2" w:space="0" w:color="000000"/>
-              <w:bottom w:val="single" w:sz="2" w:space="0" w:color="000000"/>
-            </w:tcBorders>
-            <w:shd w:fill="auto" w:val="clear"/>
-          </w:tcPr>
-          <w:p>
-            <w:pPr>
-              <w:pStyle w:val="Tabelindhold"/>
-              <w:rPr>
-                <w:color w:val="000000"/>
-              </w:rPr>
-            </w:pPr>
-            <w:r>
-              <w:rPr>
-                <w:rFonts w:cs="Verdana" w:ascii="Verdana" w:hAnsi="Verdana"/>
-                <w:color w:val="000000"/>
-                <w:sz w:val="22"/>
-              </w:rPr>
-              <w:t>Vis valgte MusicXml</w:t>
-            </w:r>
-            <w:r>
-              <w:rPr>
-                <w:rFonts w:cs="Verdana" w:ascii="Verdana" w:hAnsi="Verdana"/>
-                <w:color w:val="000000"/>
-                <w:sz w:val="22"/>
-                <w:lang w:val="da-DK"/>
-              </w:rPr>
-              <w:t>-</w:t>
-            </w:r>
-            <w:r>
-              <w:rPr>
-                <w:rFonts w:cs="Verdana" w:ascii="Verdana" w:hAnsi="Verdana"/>
-                <w:color w:val="000000"/>
-                <w:sz w:val="22"/>
-              </w:rPr>
-              <w:t>fil som rå XML</w:t>
-            </w:r>
-          </w:p>
-        </w:tc>
-        <w:tc>
-          <w:tcPr>
-            <w:tcW w:w="2742" w:type="dxa"/>
+            <w:tcW w:w="5319" w:type="dxa"/>
+            <w:tcBorders>
+              <w:left w:val="single" w:sz="2" w:space="0" w:color="000000"/>
+              <w:bottom w:val="single" w:sz="2" w:space="0" w:color="000000"/>
+            </w:tcBorders>
+            <w:shd w:fill="auto" w:val="clear"/>
+          </w:tcPr>
+          <w:p>
+            <w:pPr>
+              <w:pStyle w:val="Tabelindhold"/>
+              <w:rPr>
+                <w:rFonts w:ascii="Verdana" w:hAnsi="Verdana"/>
+                <w:color w:val="C9211E"/>
+                <w:sz w:val="22"/>
+                <w:szCs w:val="22"/>
+              </w:rPr>
+            </w:pPr>
+            <w:r>
+              <w:rPr>
+                <w:rFonts w:ascii="Verdana" w:hAnsi="Verdana"/>
+                <w:color w:val="C9211E"/>
+                <w:sz w:val="22"/>
+                <w:szCs w:val="22"/>
+              </w:rPr>
+              <w:t>Åbn MusicXml fil placering i Stifinder</w:t>
+            </w:r>
+          </w:p>
+        </w:tc>
+        <w:tc>
+          <w:tcPr>
+            <w:tcW w:w="2743" w:type="dxa"/>
             <w:tcBorders>
               <w:left w:val="single" w:sz="2" w:space="0" w:color="000000"/>
               <w:bottom w:val="single" w:sz="2" w:space="0" w:color="000000"/>
@@ -6125,16 +6102,19 @@
               <w:snapToGrid w:val="false"/>
               <w:rPr>
                 <w:rFonts w:ascii="Verdana" w:hAnsi="Verdana" w:cs="Verdana"/>
-                <w:color w:val="000000"/>
-                <w:sz w:val="22"/>
-              </w:rPr>
-            </w:pPr>
-            <w:r>
-              <w:rPr>
-                <w:rFonts w:cs="Verdana" w:ascii="Verdana" w:hAnsi="Verdana"/>
-                <w:color w:val="000000"/>
-                <w:sz w:val="22"/>
-              </w:rPr>
+                <w:color w:val="C9211E"/>
+                <w:sz w:val="22"/>
+                <w:szCs w:val="22"/>
+              </w:rPr>
+            </w:pPr>
+            <w:r>
+              <w:rPr>
+                <w:rFonts w:cs="Verdana" w:ascii="Verdana" w:hAnsi="Verdana"/>
+                <w:color w:val="C9211E"/>
+                <w:sz w:val="22"/>
+                <w:szCs w:val="22"/>
+              </w:rPr>
+              <w:t>ALT + T + M</w:t>
             </w:r>
           </w:p>
         </w:tc>
@@ -6154,100 +6134,90 @@
             <w:pPr>
               <w:pStyle w:val="Tabelindhold"/>
               <w:rPr>
-                <w:rFonts w:ascii="Verdana" w:hAnsi="Verdana"/>
+                <w:rFonts w:ascii="Verdana" w:hAnsi="Verdana" w:cs="Verdana"/>
+                <w:sz w:val="22"/>
+              </w:rPr>
+            </w:pPr>
+            <w:r>
+              <w:rPr>
+                <w:rFonts w:cs="Verdana" w:ascii="Verdana" w:hAnsi="Verdana"/>
+                <w:color w:val="000000"/>
+                <w:sz w:val="22"/>
+              </w:rPr>
+              <w:t>Værktøjer</w:t>
+            </w:r>
+          </w:p>
+        </w:tc>
+        <w:tc>
+          <w:tcPr>
+            <w:tcW w:w="5319" w:type="dxa"/>
+            <w:tcBorders>
+              <w:left w:val="single" w:sz="2" w:space="0" w:color="000000"/>
+              <w:bottom w:val="single" w:sz="2" w:space="0" w:color="000000"/>
+            </w:tcBorders>
+            <w:shd w:fill="auto" w:val="clear"/>
+          </w:tcPr>
+          <w:p>
+            <w:pPr>
+              <w:pStyle w:val="Tabelindhold"/>
+              <w:rPr>
+                <w:color w:val="000000"/>
+              </w:rPr>
+            </w:pPr>
+            <w:r>
+              <w:rPr>
+                <w:rFonts w:cs="Verdana" w:ascii="Verdana" w:hAnsi="Verdana"/>
+                <w:color w:val="000000"/>
+                <w:sz w:val="22"/>
+              </w:rPr>
+              <w:t>Vis valgte MusicXml</w:t>
+            </w:r>
+            <w:r>
+              <w:rPr>
+                <w:rFonts w:cs="Verdana" w:ascii="Verdana" w:hAnsi="Verdana"/>
+                <w:color w:val="000000"/>
+                <w:sz w:val="22"/>
+                <w:lang w:val="da-DK"/>
+              </w:rPr>
+              <w:t>-</w:t>
+            </w:r>
+            <w:r>
+              <w:rPr>
+                <w:rFonts w:cs="Verdana" w:ascii="Verdana" w:hAnsi="Verdana"/>
+                <w:color w:val="000000"/>
+                <w:sz w:val="22"/>
+              </w:rPr>
+              <w:t>fil som rå XML</w:t>
+            </w:r>
+          </w:p>
+        </w:tc>
+        <w:tc>
+          <w:tcPr>
+            <w:tcW w:w="2743" w:type="dxa"/>
+            <w:tcBorders>
+              <w:left w:val="single" w:sz="2" w:space="0" w:color="000000"/>
+              <w:bottom w:val="single" w:sz="2" w:space="0" w:color="000000"/>
+              <w:right w:val="single" w:sz="2" w:space="0" w:color="000000"/>
+            </w:tcBorders>
+            <w:shd w:fill="auto" w:val="clear"/>
+          </w:tcPr>
+          <w:p>
+            <w:pPr>
+              <w:pStyle w:val="Tabelindhold"/>
+              <w:snapToGrid w:val="false"/>
+              <w:rPr>
+                <w:rFonts w:ascii="Verdana" w:hAnsi="Verdana" w:cs="Verdana"/>
                 <w:color w:val="C9211E"/>
                 <w:sz w:val="22"/>
-                <w:szCs w:val="22"/>
-              </w:rPr>
-            </w:pPr>
-            <w:r>
-              <w:rPr>
-                <w:rFonts w:ascii="Verdana" w:hAnsi="Verdana"/>
-                <w:color w:val="000000"/>
-                <w:sz w:val="22"/>
-                <w:szCs w:val="22"/>
-              </w:rPr>
-              <w:t>Værktøjer</w:t>
-            </w:r>
-          </w:p>
-        </w:tc>
-        <w:tc>
-          <w:tcPr>
-            <w:tcW w:w="5320" w:type="dxa"/>
-            <w:tcBorders>
-              <w:left w:val="single" w:sz="2" w:space="0" w:color="000000"/>
-              <w:bottom w:val="single" w:sz="2" w:space="0" w:color="000000"/>
-            </w:tcBorders>
-            <w:shd w:fill="auto" w:val="clear"/>
-          </w:tcPr>
-          <w:p>
-            <w:pPr>
-              <w:pStyle w:val="Tabelindhold"/>
-              <w:rPr>
-                <w:rFonts w:ascii="Verdana" w:hAnsi="Verdana"/>
+              </w:rPr>
+            </w:pPr>
+            <w:r>
+              <w:rPr>
+                <w:rFonts w:cs="Verdana" w:ascii="Verdana" w:hAnsi="Verdana"/>
                 <w:color w:val="C9211E"/>
                 <w:sz w:val="22"/>
-                <w:szCs w:val="22"/>
-              </w:rPr>
-            </w:pPr>
-            <w:r>
-              <w:rPr>
-                <w:rFonts w:cs="Verdana" w:ascii="Verdana" w:hAnsi="Verdana"/>
-                <w:color w:val="000000"/>
-                <w:sz w:val="22"/>
-                <w:szCs w:val="22"/>
-              </w:rPr>
-              <w:t>Vis valgte MusicXml</w:t>
-            </w:r>
-            <w:r>
-              <w:rPr>
-                <w:rFonts w:cs="Verdana" w:ascii="Verdana" w:hAnsi="Verdana"/>
-                <w:color w:val="000000"/>
-                <w:sz w:val="22"/>
-                <w:szCs w:val="22"/>
-                <w:lang w:val="da-DK"/>
-              </w:rPr>
-              <w:t>-</w:t>
-            </w:r>
-            <w:r>
-              <w:rPr>
-                <w:rFonts w:cs="Verdana" w:ascii="Verdana" w:hAnsi="Verdana"/>
-                <w:color w:val="000000"/>
-                <w:sz w:val="22"/>
-                <w:szCs w:val="22"/>
-              </w:rPr>
-              <w:t>fil som rå XML med Google Chrome</w:t>
-            </w:r>
-          </w:p>
-        </w:tc>
-        <w:tc>
-          <w:tcPr>
-            <w:tcW w:w="2742" w:type="dxa"/>
-            <w:tcBorders>
-              <w:left w:val="single" w:sz="2" w:space="0" w:color="000000"/>
-              <w:bottom w:val="single" w:sz="2" w:space="0" w:color="000000"/>
-              <w:right w:val="single" w:sz="2" w:space="0" w:color="000000"/>
-            </w:tcBorders>
-            <w:shd w:fill="auto" w:val="clear"/>
-          </w:tcPr>
-          <w:p>
-            <w:pPr>
-              <w:pStyle w:val="Tabelindhold"/>
-              <w:snapToGrid w:val="false"/>
-              <w:rPr>
-                <w:rFonts w:ascii="Verdana" w:hAnsi="Verdana" w:cs="Verdana"/>
-                <w:color w:val="000000"/>
-                <w:sz w:val="22"/>
-                <w:szCs w:val="22"/>
-              </w:rPr>
-            </w:pPr>
-            <w:r>
-              <w:rPr>
-                <w:rFonts w:cs="Verdana" w:ascii="Verdana" w:hAnsi="Verdana"/>
-                <w:color w:val="000000"/>
-                <w:sz w:val="22"/>
-                <w:szCs w:val="22"/>
-              </w:rPr>
+              </w:rPr>
+              <w:t>ALT + T + X</w:t>
             </w:r>
           </w:p>
         </w:tc>
@@ -6267,15 +6237,18 @@
             <w:pPr>
               <w:pStyle w:val="Tabelindhold"/>
               <w:rPr>
-                <w:rFonts w:ascii="Verdana" w:hAnsi="Verdana" w:cs="Verdana"/>
-                <w:sz w:val="22"/>
-              </w:rPr>
-            </w:pPr>
-            <w:r>
-              <w:rPr>
-                <w:rFonts w:cs="Verdana" w:ascii="Verdana" w:hAnsi="Verdana"/>
-                <w:color w:val="000000"/>
-                <w:sz w:val="22"/>
+                <w:rFonts w:ascii="Verdana" w:hAnsi="Verdana"/>
+                <w:color w:val="C9211E"/>
+                <w:sz w:val="22"/>
+                <w:szCs w:val="22"/>
+              </w:rPr>
+            </w:pPr>
+            <w:r>
+              <w:rPr>
+                <w:rFonts w:ascii="Verdana" w:hAnsi="Verdana"/>
+                <w:color w:val="000000"/>
+                <w:sz w:val="22"/>
+                <w:szCs w:val="22"/>
               </w:rPr>
               <w:t>Værktøjer</w:t>
             </w:r>
@@ -6283,33 +6256,56 @@
         </w:tc>
         <w:tc>
           <w:tcPr>
-            <w:tcW w:w="5320" w:type="dxa"/>
-            <w:tcBorders>
-              <w:left w:val="single" w:sz="2" w:space="0" w:color="000000"/>
-              <w:bottom w:val="single" w:sz="2" w:space="0" w:color="000000"/>
-            </w:tcBorders>
-            <w:shd w:fill="auto" w:val="clear"/>
-          </w:tcPr>
-          <w:p>
-            <w:pPr>
-              <w:pStyle w:val="Tabelindhold"/>
-              <w:rPr>
-                <w:color w:val="000000"/>
-              </w:rPr>
-            </w:pPr>
-            <w:r>
-              <w:rPr>
-                <w:rFonts w:cs="Verdana" w:ascii="Verdana" w:hAnsi="Verdana"/>
-                <w:color w:val="000000"/>
-                <w:sz w:val="22"/>
-              </w:rPr>
-              <w:t>Vis JAWS indstillinger for IBOS Nodelæser</w:t>
-            </w:r>
-          </w:p>
-        </w:tc>
-        <w:tc>
-          <w:tcPr>
-            <w:tcW w:w="2742" w:type="dxa"/>
+            <w:tcW w:w="5319" w:type="dxa"/>
+            <w:tcBorders>
+              <w:left w:val="single" w:sz="2" w:space="0" w:color="000000"/>
+              <w:bottom w:val="single" w:sz="2" w:space="0" w:color="000000"/>
+            </w:tcBorders>
+            <w:shd w:fill="auto" w:val="clear"/>
+          </w:tcPr>
+          <w:p>
+            <w:pPr>
+              <w:pStyle w:val="Tabelindhold"/>
+              <w:rPr>
+                <w:rFonts w:ascii="Verdana" w:hAnsi="Verdana"/>
+                <w:color w:val="C9211E"/>
+                <w:sz w:val="22"/>
+                <w:szCs w:val="22"/>
+              </w:rPr>
+            </w:pPr>
+            <w:r>
+              <w:rPr>
+                <w:rFonts w:cs="Verdana" w:ascii="Verdana" w:hAnsi="Verdana"/>
+                <w:color w:val="000000"/>
+                <w:sz w:val="22"/>
+                <w:szCs w:val="22"/>
+              </w:rPr>
+              <w:t>Vis valgte MusicXml</w:t>
+            </w:r>
+            <w:r>
+              <w:rPr>
+                <w:rFonts w:cs="Verdana" w:ascii="Verdana" w:hAnsi="Verdana"/>
+                <w:color w:val="000000"/>
+                <w:sz w:val="22"/>
+                <w:szCs w:val="22"/>
+                <w:lang w:val="da-DK"/>
+              </w:rPr>
+              <w:t>-</w:t>
+            </w:r>
+            <w:r>
+              <w:rPr>
+                <w:rFonts w:cs="Verdana" w:ascii="Verdana" w:hAnsi="Verdana"/>
+                <w:color w:val="000000"/>
+                <w:sz w:val="22"/>
+                <w:szCs w:val="22"/>
+              </w:rPr>
+              <w:t>fil som rå XML med Google Chrome</w:t>
+            </w:r>
+          </w:p>
+        </w:tc>
+        <w:tc>
+          <w:tcPr>
+            <w:tcW w:w="2743" w:type="dxa"/>
             <w:tcBorders>
               <w:left w:val="single" w:sz="2" w:space="0" w:color="000000"/>
               <w:bottom w:val="single" w:sz="2" w:space="0" w:color="000000"/>
@@ -6323,16 +6319,19 @@
               <w:snapToGrid w:val="false"/>
               <w:rPr>
                 <w:rFonts w:ascii="Verdana" w:hAnsi="Verdana" w:cs="Verdana"/>
-                <w:color w:val="000000"/>
-                <w:sz w:val="22"/>
-              </w:rPr>
-            </w:pPr>
-            <w:r>
-              <w:rPr>
-                <w:rFonts w:cs="Verdana" w:ascii="Verdana" w:hAnsi="Verdana"/>
-                <w:color w:val="000000"/>
-                <w:sz w:val="22"/>
-              </w:rPr>
+                <w:color w:val="C9211E"/>
+                <w:sz w:val="22"/>
+                <w:szCs w:val="22"/>
+              </w:rPr>
+            </w:pPr>
+            <w:r>
+              <w:rPr>
+                <w:rFonts w:cs="Verdana" w:ascii="Verdana" w:hAnsi="Verdana"/>
+                <w:color w:val="C9211E"/>
+                <w:sz w:val="22"/>
+                <w:szCs w:val="22"/>
+              </w:rPr>
+              <w:t>ALT + T + G</w:t>
             </w:r>
           </w:p>
         </w:tc>
@@ -6368,56 +6367,57 @@
         </w:tc>
         <w:tc>
           <w:tcPr>
-            <w:tcW w:w="5320" w:type="dxa"/>
-            <w:tcBorders>
-              <w:left w:val="single" w:sz="2" w:space="0" w:color="000000"/>
-              <w:bottom w:val="single" w:sz="2" w:space="0" w:color="000000"/>
-            </w:tcBorders>
-            <w:shd w:fill="auto" w:val="clear"/>
-          </w:tcPr>
-          <w:p>
-            <w:pPr>
-              <w:pStyle w:val="Tabelindhold"/>
-              <w:rPr>
+            <w:tcW w:w="5319" w:type="dxa"/>
+            <w:tcBorders>
+              <w:left w:val="single" w:sz="2" w:space="0" w:color="000000"/>
+              <w:bottom w:val="single" w:sz="2" w:space="0" w:color="000000"/>
+            </w:tcBorders>
+            <w:shd w:fill="auto" w:val="clear"/>
+          </w:tcPr>
+          <w:p>
+            <w:pPr>
+              <w:pStyle w:val="Tabelindhold"/>
+              <w:rPr>
+                <w:color w:val="000000"/>
+              </w:rPr>
+            </w:pPr>
+            <w:r>
+              <w:rPr>
+                <w:rFonts w:cs="Verdana" w:ascii="Verdana" w:hAnsi="Verdana"/>
+                <w:color w:val="000000"/>
+                <w:sz w:val="22"/>
+              </w:rPr>
+              <w:t>Vis JAWS indstillinger for IBOS Nodelæser</w:t>
+            </w:r>
+          </w:p>
+        </w:tc>
+        <w:tc>
+          <w:tcPr>
+            <w:tcW w:w="2743" w:type="dxa"/>
+            <w:tcBorders>
+              <w:left w:val="single" w:sz="2" w:space="0" w:color="000000"/>
+              <w:bottom w:val="single" w:sz="2" w:space="0" w:color="000000"/>
+              <w:right w:val="single" w:sz="2" w:space="0" w:color="000000"/>
+            </w:tcBorders>
+            <w:shd w:fill="auto" w:val="clear"/>
+          </w:tcPr>
+          <w:p>
+            <w:pPr>
+              <w:pStyle w:val="Tabelindhold"/>
+              <w:snapToGrid w:val="false"/>
+              <w:rPr>
+                <w:rFonts w:ascii="Verdana" w:hAnsi="Verdana" w:cs="Verdana"/>
                 <w:color w:val="C9211E"/>
-              </w:rPr>
-            </w:pPr>
-            <w:r>
-              <w:rPr>
-                <w:rFonts w:cs="Verdana" w:ascii="Verdana" w:hAnsi="Verdana"/>
-                <w:color w:val="000000"/>
-                <w:sz w:val="22"/>
-              </w:rPr>
-              <w:t>Vis Brugerindstillinger for denne MusicXml fil</w:t>
-            </w:r>
-          </w:p>
-        </w:tc>
-        <w:tc>
-          <w:tcPr>
-            <w:tcW w:w="2742" w:type="dxa"/>
-            <w:tcBorders>
-              <w:left w:val="single" w:sz="2" w:space="0" w:color="000000"/>
-              <w:bottom w:val="single" w:sz="2" w:space="0" w:color="000000"/>
-              <w:right w:val="single" w:sz="2" w:space="0" w:color="000000"/>
-            </w:tcBorders>
-            <w:shd w:fill="auto" w:val="clear"/>
-          </w:tcPr>
-          <w:p>
-            <w:pPr>
-              <w:pStyle w:val="Tabelindhold"/>
-              <w:snapToGrid w:val="false"/>
-              <w:rPr>
-                <w:rFonts w:ascii="Verdana" w:hAnsi="Verdana" w:cs="Verdana"/>
-                <w:color w:val="000000"/>
-                <w:sz w:val="22"/>
-              </w:rPr>
-            </w:pPr>
-            <w:r>
-              <w:rPr>
-                <w:rFonts w:cs="Verdana" w:ascii="Verdana" w:hAnsi="Verdana"/>
-                <w:color w:val="000000"/>
-                <w:sz w:val="22"/>
-              </w:rPr>
+                <w:sz w:val="22"/>
+              </w:rPr>
+            </w:pPr>
+            <w:r>
+              <w:rPr>
+                <w:rFonts w:cs="Verdana" w:ascii="Verdana" w:hAnsi="Verdana"/>
+                <w:color w:val="C9211E"/>
+                <w:sz w:val="22"/>
+              </w:rPr>
+              <w:t>ALT + T + J</w:t>
             </w:r>
           </w:p>
         </w:tc>
@@ -6447,13 +6447,99 @@
                 <w:color w:val="000000"/>
                 <w:sz w:val="22"/>
               </w:rPr>
+              <w:t>Værktøjer</w:t>
+            </w:r>
+          </w:p>
+        </w:tc>
+        <w:tc>
+          <w:tcPr>
+            <w:tcW w:w="5319" w:type="dxa"/>
+            <w:tcBorders>
+              <w:left w:val="single" w:sz="2" w:space="0" w:color="000000"/>
+              <w:bottom w:val="single" w:sz="2" w:space="0" w:color="000000"/>
+            </w:tcBorders>
+            <w:shd w:fill="auto" w:val="clear"/>
+          </w:tcPr>
+          <w:p>
+            <w:pPr>
+              <w:pStyle w:val="Tabelindhold"/>
+              <w:rPr>
+                <w:color w:val="C9211E"/>
+              </w:rPr>
+            </w:pPr>
+            <w:r>
+              <w:rPr>
+                <w:rFonts w:cs="Verdana" w:ascii="Verdana" w:hAnsi="Verdana"/>
+                <w:color w:val="000000"/>
+                <w:sz w:val="22"/>
+              </w:rPr>
+              <w:t>Vis Brugerindstillinger for denne MusicXml fil</w:t>
+            </w:r>
+          </w:p>
+        </w:tc>
+        <w:tc>
+          <w:tcPr>
+            <w:tcW w:w="2743" w:type="dxa"/>
+            <w:tcBorders>
+              <w:left w:val="single" w:sz="2" w:space="0" w:color="000000"/>
+              <w:bottom w:val="single" w:sz="2" w:space="0" w:color="000000"/>
+              <w:right w:val="single" w:sz="2" w:space="0" w:color="000000"/>
+            </w:tcBorders>
+            <w:shd w:fill="auto" w:val="clear"/>
+          </w:tcPr>
+          <w:p>
+            <w:pPr>
+              <w:pStyle w:val="Tabelindhold"/>
+              <w:snapToGrid w:val="false"/>
+              <w:rPr>
+                <w:rFonts w:ascii="Verdana" w:hAnsi="Verdana" w:cs="Verdana"/>
+                <w:color w:val="C9211E"/>
+                <w:sz w:val="22"/>
+              </w:rPr>
+            </w:pPr>
+            <w:r>
+              <w:rPr>
+                <w:rFonts w:cs="Verdana" w:ascii="Verdana" w:hAnsi="Verdana"/>
+                <w:color w:val="C9211E"/>
+                <w:sz w:val="22"/>
+              </w:rPr>
+              <w:t>ALT + T + B</w:t>
+            </w:r>
+          </w:p>
+        </w:tc>
+      </w:tr>
+      <w:tr>
+        <w:trPr/>
+        <w:tc>
+          <w:tcPr>
+            <w:tcW w:w="1585" w:type="dxa"/>
+            <w:tcBorders>
+              <w:left w:val="single" w:sz="2" w:space="0" w:color="000000"/>
+              <w:bottom w:val="single" w:sz="2" w:space="0" w:color="000000"/>
+            </w:tcBorders>
+            <w:shd w:fill="auto" w:val="clear"/>
+          </w:tcPr>
+          <w:p>
+            <w:pPr>
+              <w:pStyle w:val="Tabelindhold"/>
+              <w:rPr>
+                <w:rFonts w:ascii="Verdana" w:hAnsi="Verdana" w:cs="Verdana"/>
+                <w:sz w:val="22"/>
+              </w:rPr>
+            </w:pPr>
+            <w:r>
+              <w:rPr>
+                <w:rFonts w:cs="Verdana" w:ascii="Verdana" w:hAnsi="Verdana"/>
+                <w:color w:val="000000"/>
+                <w:sz w:val="22"/>
+              </w:rPr>
               <w:t>Nodearkiver</w:t>
             </w:r>
           </w:p>
         </w:tc>
         <w:tc>
           <w:tcPr>
-            <w:tcW w:w="5320" w:type="dxa"/>
+            <w:tcW w:w="5319" w:type="dxa"/>
             <w:tcBorders>
               <w:left w:val="single" w:sz="2" w:space="0" w:color="000000"/>
               <w:bottom w:val="single" w:sz="2" w:space="0" w:color="000000"/>
@@ -6534,13 +6620,29 @@
                 <w:color w:val="000000"/>
                 <w:sz w:val="22"/>
               </w:rPr>
-              <w:t xml:space="preserve">  er et godt sted at starte. Alt er i MusicXml, og alt er gratis.</w:t>
-            </w:r>
-          </w:p>
-        </w:tc>
-        <w:tc>
-          <w:tcPr>
-            <w:tcW w:w="2742" w:type="dxa"/>
+              <w:t xml:space="preserve">  er et godt sted at starte. Alt er i MusicXml, og </w:t>
+            </w:r>
+            <w:r>
+              <w:rPr>
+                <w:rFonts w:cs="Verdana" w:ascii="Verdana" w:hAnsi="Verdana"/>
+                <w:color w:val="C9211E"/>
+                <w:sz w:val="22"/>
+              </w:rPr>
+              <w:t xml:space="preserve">noget af det </w:t>
+            </w:r>
+            <w:r>
+              <w:rPr>
+                <w:rFonts w:cs="Verdana" w:ascii="Verdana" w:hAnsi="Verdana"/>
+                <w:color w:val="000000"/>
+                <w:sz w:val="22"/>
+              </w:rPr>
+              <w:t>er gratis.</w:t>
+            </w:r>
+          </w:p>
+        </w:tc>
+        <w:tc>
+          <w:tcPr>
+            <w:tcW w:w="2743" w:type="dxa"/>
             <w:tcBorders>
               <w:left w:val="single" w:sz="2" w:space="0" w:color="000000"/>
               <w:bottom w:val="single" w:sz="2" w:space="0" w:color="000000"/>
@@ -6554,16 +6656,17 @@
               <w:snapToGrid w:val="false"/>
               <w:rPr>
                 <w:rFonts w:ascii="Verdana" w:hAnsi="Verdana" w:cs="Verdana"/>
-                <w:color w:val="000000"/>
-                <w:sz w:val="22"/>
-              </w:rPr>
-            </w:pPr>
-            <w:r>
-              <w:rPr>
-                <w:rFonts w:cs="Verdana" w:ascii="Verdana" w:hAnsi="Verdana"/>
-                <w:color w:val="000000"/>
-                <w:sz w:val="22"/>
-              </w:rPr>
+                <w:color w:val="C9211E"/>
+                <w:sz w:val="22"/>
+              </w:rPr>
+            </w:pPr>
+            <w:r>
+              <w:rPr>
+                <w:rFonts w:cs="Verdana" w:ascii="Verdana" w:hAnsi="Verdana"/>
+                <w:color w:val="C9211E"/>
+                <w:sz w:val="22"/>
+              </w:rPr>
+              <w:t>ALT + N</w:t>
             </w:r>
           </w:p>
         </w:tc>
@@ -6599,7 +6702,7 @@
         </w:tc>
         <w:tc>
           <w:tcPr>
-            <w:tcW w:w="5320" w:type="dxa"/>
+            <w:tcW w:w="5319" w:type="dxa"/>
             <w:tcBorders>
               <w:left w:val="single" w:sz="2" w:space="0" w:color="000000"/>
               <w:bottom w:val="single" w:sz="2" w:space="0" w:color="000000"/>
@@ -6680,7 +6783,7 @@
         </w:tc>
         <w:tc>
           <w:tcPr>
-            <w:tcW w:w="2742" w:type="dxa"/>
+            <w:tcW w:w="2743" w:type="dxa"/>
             <w:tcBorders>
               <w:left w:val="single" w:sz="2" w:space="0" w:color="000000"/>
               <w:bottom w:val="single" w:sz="2" w:space="0" w:color="000000"/>
@@ -7163,14 +7266,14 @@
         </w:tblCellMar>
       </w:tblPr>
       <w:tblGrid>
-        <w:gridCol w:w="3059"/>
-        <w:gridCol w:w="6591"/>
+        <w:gridCol w:w="2610"/>
+        <w:gridCol w:w="7040"/>
       </w:tblGrid>
       <w:tr>
         <w:trPr/>
         <w:tc>
           <w:tcPr>
-            <w:tcW w:w="3059" w:type="dxa"/>
+            <w:tcW w:w="2610" w:type="dxa"/>
             <w:tcBorders>
               <w:top w:val="single" w:sz="2" w:space="0" w:color="000000"/>
               <w:left w:val="single" w:sz="2" w:space="0" w:color="000000"/>
@@ -7195,7 +7298,7 @@
         </w:tc>
         <w:tc>
           <w:tcPr>
-            <w:tcW w:w="6591" w:type="dxa"/>
+            <w:tcW w:w="7040" w:type="dxa"/>
             <w:tcBorders>
               <w:top w:val="single" w:sz="2" w:space="0" w:color="000000"/>
               <w:left w:val="single" w:sz="2" w:space="0" w:color="000000"/>
@@ -7224,7 +7327,7 @@
         <w:trPr/>
         <w:tc>
           <w:tcPr>
-            <w:tcW w:w="3059" w:type="dxa"/>
+            <w:tcW w:w="2610" w:type="dxa"/>
             <w:tcBorders>
               <w:left w:val="single" w:sz="2" w:space="0" w:color="000000"/>
               <w:bottom w:val="single" w:sz="2" w:space="0" w:color="000000"/>
@@ -7248,7 +7351,7 @@
         </w:tc>
         <w:tc>
           <w:tcPr>
-            <w:tcW w:w="6591" w:type="dxa"/>
+            <w:tcW w:w="7040" w:type="dxa"/>
             <w:tcBorders>
               <w:left w:val="single" w:sz="2" w:space="0" w:color="000000"/>
               <w:bottom w:val="single" w:sz="2" w:space="0" w:color="000000"/>
@@ -7276,31 +7379,35 @@
         <w:trPr/>
         <w:tc>
           <w:tcPr>
-            <w:tcW w:w="3059" w:type="dxa"/>
-            <w:tcBorders>
-              <w:left w:val="single" w:sz="2" w:space="0" w:color="000000"/>
-              <w:bottom w:val="single" w:sz="2" w:space="0" w:color="000000"/>
-            </w:tcBorders>
-            <w:shd w:fill="auto" w:val="clear"/>
-          </w:tcPr>
-          <w:p>
-            <w:pPr>
-              <w:pStyle w:val="Tabelindhold"/>
+            <w:tcW w:w="2610" w:type="dxa"/>
+            <w:tcBorders>
+              <w:left w:val="single" w:sz="2" w:space="0" w:color="000000"/>
+              <w:bottom w:val="single" w:sz="2" w:space="0" w:color="000000"/>
+            </w:tcBorders>
+            <w:shd w:fill="auto" w:val="clear"/>
+          </w:tcPr>
+          <w:p>
+            <w:pPr>
+              <w:pStyle w:val="Tabelindhold"/>
+              <w:rPr/>
+            </w:pPr>
+            <w:r>
+              <w:rPr>
+                <w:color w:val="000000"/>
+              </w:rPr>
+              <w:t xml:space="preserve">Seneste MusicXml </w:t>
+            </w:r>
+            <w:r>
               <w:rPr>
                 <w:color w:val="C9211E"/>
               </w:rPr>
-            </w:pPr>
-            <w:r>
-              <w:rPr>
-                <w:color w:val="000000"/>
-              </w:rPr>
-              <w:t>Seneste MusicXml mappe</w:t>
-            </w:r>
-          </w:p>
-        </w:tc>
-        <w:tc>
-          <w:tcPr>
-            <w:tcW w:w="6591" w:type="dxa"/>
+              <w:t>sti</w:t>
+            </w:r>
+          </w:p>
+        </w:tc>
+        <w:tc>
+          <w:tcPr>
+            <w:tcW w:w="7040" w:type="dxa"/>
             <w:tcBorders>
               <w:left w:val="single" w:sz="2" w:space="0" w:color="000000"/>
               <w:bottom w:val="single" w:sz="2" w:space="0" w:color="000000"/>
@@ -7328,31 +7435,35 @@
         <w:trPr/>
         <w:tc>
           <w:tcPr>
-            <w:tcW w:w="3059" w:type="dxa"/>
-            <w:tcBorders>
-              <w:left w:val="single" w:sz="2" w:space="0" w:color="000000"/>
-              <w:bottom w:val="single" w:sz="2" w:space="0" w:color="000000"/>
-            </w:tcBorders>
-            <w:shd w:fill="auto" w:val="clear"/>
-          </w:tcPr>
-          <w:p>
-            <w:pPr>
-              <w:pStyle w:val="Tabelindhold"/>
+            <w:tcW w:w="2610" w:type="dxa"/>
+            <w:tcBorders>
+              <w:left w:val="single" w:sz="2" w:space="0" w:color="000000"/>
+              <w:bottom w:val="single" w:sz="2" w:space="0" w:color="000000"/>
+            </w:tcBorders>
+            <w:shd w:fill="auto" w:val="clear"/>
+          </w:tcPr>
+          <w:p>
+            <w:pPr>
+              <w:pStyle w:val="Tabelindhold"/>
+              <w:rPr/>
+            </w:pPr>
+            <w:r>
+              <w:rPr>
+                <w:color w:val="000000"/>
+              </w:rPr>
+              <w:t xml:space="preserve">Seneste punktnode </w:t>
+            </w:r>
+            <w:r>
               <w:rPr>
                 <w:color w:val="C9211E"/>
               </w:rPr>
-            </w:pPr>
-            <w:r>
-              <w:rPr>
-                <w:color w:val="000000"/>
-              </w:rPr>
-              <w:t>Seneste punktnode mappe</w:t>
-            </w:r>
-          </w:p>
-        </w:tc>
-        <w:tc>
-          <w:tcPr>
-            <w:tcW w:w="6591" w:type="dxa"/>
+              <w:t>sti</w:t>
+            </w:r>
+          </w:p>
+        </w:tc>
+        <w:tc>
+          <w:tcPr>
+            <w:tcW w:w="7040" w:type="dxa"/>
             <w:tcBorders>
               <w:left w:val="single" w:sz="2" w:space="0" w:color="000000"/>
               <w:bottom w:val="single" w:sz="2" w:space="0" w:color="000000"/>
@@ -7380,31 +7491,35 @@
         <w:trPr/>
         <w:tc>
           <w:tcPr>
-            <w:tcW w:w="3059" w:type="dxa"/>
-            <w:tcBorders>
-              <w:left w:val="single" w:sz="2" w:space="0" w:color="000000"/>
-              <w:bottom w:val="single" w:sz="2" w:space="0" w:color="000000"/>
-            </w:tcBorders>
-            <w:shd w:fill="auto" w:val="clear"/>
-          </w:tcPr>
-          <w:p>
-            <w:pPr>
-              <w:pStyle w:val="Tabelindhold"/>
+            <w:tcW w:w="2610" w:type="dxa"/>
+            <w:tcBorders>
+              <w:left w:val="single" w:sz="2" w:space="0" w:color="000000"/>
+              <w:bottom w:val="single" w:sz="2" w:space="0" w:color="000000"/>
+            </w:tcBorders>
+            <w:shd w:fill="auto" w:val="clear"/>
+          </w:tcPr>
+          <w:p>
+            <w:pPr>
+              <w:pStyle w:val="Tabelindhold"/>
+              <w:rPr/>
+            </w:pPr>
+            <w:r>
+              <w:rPr>
+                <w:color w:val="000000"/>
+              </w:rPr>
+              <w:t xml:space="preserve">MuseScore </w:t>
+            </w:r>
+            <w:r>
               <w:rPr>
                 <w:color w:val="C9211E"/>
               </w:rPr>
-            </w:pPr>
-            <w:r>
-              <w:rPr>
-                <w:color w:val="000000"/>
-              </w:rPr>
-              <w:t>MuseScore placering</w:t>
-            </w:r>
-          </w:p>
-        </w:tc>
-        <w:tc>
-          <w:tcPr>
-            <w:tcW w:w="6591" w:type="dxa"/>
+              <w:t>sti</w:t>
+            </w:r>
+          </w:p>
+        </w:tc>
+        <w:tc>
+          <w:tcPr>
+            <w:tcW w:w="7040" w:type="dxa"/>
             <w:tcBorders>
               <w:left w:val="single" w:sz="2" w:space="0" w:color="000000"/>
               <w:bottom w:val="single" w:sz="2" w:space="0" w:color="000000"/>
@@ -7415,15 +7530,19 @@
           <w:p>
             <w:pPr>
               <w:pStyle w:val="Tabelindhold"/>
-              <w:rPr>
-                <w:color w:val="C9211E"/>
-              </w:rPr>
-            </w:pPr>
-            <w:r>
-              <w:rPr>
-                <w:color w:val="000000"/>
-              </w:rPr>
-              <w:t xml:space="preserve">Placering af .exe filen for den installerede version af Musescore </w:t>
+              <w:rPr/>
+            </w:pPr>
+            <w:r>
+              <w:rPr>
+                <w:color w:val="000000"/>
+              </w:rPr>
+              <w:t>Sti til</w:t>
+            </w:r>
+            <w:r>
+              <w:rPr>
+                <w:color w:val="000000"/>
+              </w:rPr>
+              <w:t xml:space="preserve"> .exe filen for den installerede version af Musescore </w:t>
             </w:r>
           </w:p>
         </w:tc>
@@ -7432,31 +7551,35 @@
         <w:trPr/>
         <w:tc>
           <w:tcPr>
-            <w:tcW w:w="3059" w:type="dxa"/>
-            <w:tcBorders>
-              <w:left w:val="single" w:sz="2" w:space="0" w:color="000000"/>
-              <w:bottom w:val="single" w:sz="2" w:space="0" w:color="000000"/>
-            </w:tcBorders>
-            <w:shd w:fill="auto" w:val="clear"/>
-          </w:tcPr>
-          <w:p>
-            <w:pPr>
-              <w:pStyle w:val="Tabelindhold"/>
+            <w:tcW w:w="2610" w:type="dxa"/>
+            <w:tcBorders>
+              <w:left w:val="single" w:sz="2" w:space="0" w:color="000000"/>
+              <w:bottom w:val="single" w:sz="2" w:space="0" w:color="000000"/>
+            </w:tcBorders>
+            <w:shd w:fill="auto" w:val="clear"/>
+          </w:tcPr>
+          <w:p>
+            <w:pPr>
+              <w:pStyle w:val="Tabelindhold"/>
+              <w:rPr/>
+            </w:pPr>
+            <w:r>
+              <w:rPr>
+                <w:color w:val="000000"/>
+              </w:rPr>
+              <w:t xml:space="preserve">Sibelius </w:t>
+            </w:r>
+            <w:r>
               <w:rPr>
                 <w:color w:val="C9211E"/>
               </w:rPr>
-            </w:pPr>
-            <w:r>
-              <w:rPr>
-                <w:color w:val="000000"/>
-              </w:rPr>
-              <w:t>Sibelius placering</w:t>
-            </w:r>
-          </w:p>
-        </w:tc>
-        <w:tc>
-          <w:tcPr>
-            <w:tcW w:w="6591" w:type="dxa"/>
+              <w:t>sti</w:t>
+            </w:r>
+          </w:p>
+        </w:tc>
+        <w:tc>
+          <w:tcPr>
+            <w:tcW w:w="7040" w:type="dxa"/>
             <w:tcBorders>
               <w:left w:val="single" w:sz="2" w:space="0" w:color="000000"/>
               <w:bottom w:val="single" w:sz="2" w:space="0" w:color="000000"/>
@@ -7467,15 +7590,19 @@
           <w:p>
             <w:pPr>
               <w:pStyle w:val="Tabelindhold"/>
-              <w:rPr>
-                <w:color w:val="C9211E"/>
-              </w:rPr>
-            </w:pPr>
-            <w:r>
-              <w:rPr>
-                <w:color w:val="000000"/>
-              </w:rPr>
-              <w:t xml:space="preserve">Placering af .exe filen for den installerede version af Sibelius </w:t>
+              <w:rPr/>
+            </w:pPr>
+            <w:r>
+              <w:rPr>
+                <w:color w:val="000000"/>
+              </w:rPr>
+              <w:t>Sti til</w:t>
+            </w:r>
+            <w:r>
+              <w:rPr>
+                <w:color w:val="000000"/>
+              </w:rPr>
+              <w:t xml:space="preserve"> .exe filen for den installerede version af Sibelius </w:t>
             </w:r>
           </w:p>
         </w:tc>
@@ -7484,31 +7611,35 @@
         <w:trPr/>
         <w:tc>
           <w:tcPr>
-            <w:tcW w:w="3059" w:type="dxa"/>
-            <w:tcBorders>
-              <w:left w:val="single" w:sz="2" w:space="0" w:color="000000"/>
-              <w:bottom w:val="single" w:sz="2" w:space="0" w:color="000000"/>
-            </w:tcBorders>
-            <w:shd w:fill="auto" w:val="clear"/>
-          </w:tcPr>
-          <w:p>
-            <w:pPr>
-              <w:pStyle w:val="Tabelindhold"/>
+            <w:tcW w:w="2610" w:type="dxa"/>
+            <w:tcBorders>
+              <w:left w:val="single" w:sz="2" w:space="0" w:color="000000"/>
+              <w:bottom w:val="single" w:sz="2" w:space="0" w:color="000000"/>
+            </w:tcBorders>
+            <w:shd w:fill="auto" w:val="clear"/>
+          </w:tcPr>
+          <w:p>
+            <w:pPr>
+              <w:pStyle w:val="Tabelindhold"/>
+              <w:rPr/>
+            </w:pPr>
+            <w:r>
+              <w:rPr>
+                <w:color w:val="000000"/>
+              </w:rPr>
+              <w:t xml:space="preserve">Capella </w:t>
+            </w:r>
+            <w:r>
               <w:rPr>
                 <w:color w:val="C9211E"/>
               </w:rPr>
-            </w:pPr>
-            <w:r>
-              <w:rPr>
-                <w:color w:val="000000"/>
-              </w:rPr>
-              <w:t>Capella placering</w:t>
-            </w:r>
-          </w:p>
-        </w:tc>
-        <w:tc>
-          <w:tcPr>
-            <w:tcW w:w="6591" w:type="dxa"/>
+              <w:t>sti</w:t>
+            </w:r>
+          </w:p>
+        </w:tc>
+        <w:tc>
+          <w:tcPr>
+            <w:tcW w:w="7040" w:type="dxa"/>
             <w:tcBorders>
               <w:left w:val="single" w:sz="2" w:space="0" w:color="000000"/>
               <w:bottom w:val="single" w:sz="2" w:space="0" w:color="000000"/>
@@ -7519,15 +7650,123 @@
           <w:p>
             <w:pPr>
               <w:pStyle w:val="Tabelindhold"/>
+              <w:rPr/>
+            </w:pPr>
+            <w:r>
+              <w:rPr>
+                <w:color w:val="000000"/>
+              </w:rPr>
+              <w:t>Sti til</w:t>
+            </w:r>
+            <w:r>
+              <w:rPr>
+                <w:color w:val="000000"/>
+              </w:rPr>
+              <w:t xml:space="preserve"> .exe filen for den installerede version af Capella </w:t>
+            </w:r>
+          </w:p>
+        </w:tc>
+      </w:tr>
+      <w:tr>
+        <w:trPr/>
+        <w:tc>
+          <w:tcPr>
+            <w:tcW w:w="2610" w:type="dxa"/>
+            <w:tcBorders>
+              <w:left w:val="single" w:sz="2" w:space="0" w:color="000000"/>
+              <w:bottom w:val="single" w:sz="2" w:space="0" w:color="000000"/>
+            </w:tcBorders>
+            <w:shd w:fill="auto" w:val="clear"/>
+          </w:tcPr>
+          <w:p>
+            <w:pPr>
+              <w:pStyle w:val="Tabelindhold"/>
               <w:rPr>
                 <w:color w:val="C9211E"/>
               </w:rPr>
             </w:pPr>
             <w:r>
               <w:rPr>
-                <w:color w:val="000000"/>
-              </w:rPr>
-              <w:t xml:space="preserve">Placering af .exe filen for den installerede version af Capella </w:t>
+                <w:color w:val="C9211E"/>
+              </w:rPr>
+              <w:t>PhotoScore sti</w:t>
+            </w:r>
+          </w:p>
+        </w:tc>
+        <w:tc>
+          <w:tcPr>
+            <w:tcW w:w="7040" w:type="dxa"/>
+            <w:tcBorders>
+              <w:left w:val="single" w:sz="2" w:space="0" w:color="000000"/>
+              <w:bottom w:val="single" w:sz="2" w:space="0" w:color="000000"/>
+              <w:right w:val="single" w:sz="2" w:space="0" w:color="000000"/>
+            </w:tcBorders>
+            <w:shd w:fill="auto" w:val="clear"/>
+          </w:tcPr>
+          <w:p>
+            <w:pPr>
+              <w:pStyle w:val="Tabelindhold"/>
+              <w:rPr>
+                <w:color w:val="C9211E"/>
+              </w:rPr>
+            </w:pPr>
+            <w:r>
+              <w:rPr>
+                <w:color w:val="C9211E"/>
+              </w:rPr>
+              <w:t>Sti til .exe filen for den installerede version af PhotoScore</w:t>
+            </w:r>
+          </w:p>
+        </w:tc>
+      </w:tr>
+      <w:tr>
+        <w:trPr/>
+        <w:tc>
+          <w:tcPr>
+            <w:tcW w:w="2610" w:type="dxa"/>
+            <w:tcBorders>
+              <w:left w:val="single" w:sz="2" w:space="0" w:color="000000"/>
+              <w:bottom w:val="single" w:sz="2" w:space="0" w:color="000000"/>
+            </w:tcBorders>
+            <w:shd w:fill="auto" w:val="clear"/>
+          </w:tcPr>
+          <w:p>
+            <w:pPr>
+              <w:pStyle w:val="Tabelindhold"/>
+              <w:rPr>
+                <w:color w:val="C9211E"/>
+              </w:rPr>
+            </w:pPr>
+            <w:r>
+              <w:rPr>
+                <w:color w:val="C9211E"/>
+              </w:rPr>
+              <w:t>Braille Music Editor 2 sti</w:t>
+            </w:r>
+          </w:p>
+        </w:tc>
+        <w:tc>
+          <w:tcPr>
+            <w:tcW w:w="7040" w:type="dxa"/>
+            <w:tcBorders>
+              <w:left w:val="single" w:sz="2" w:space="0" w:color="000000"/>
+              <w:bottom w:val="single" w:sz="2" w:space="0" w:color="000000"/>
+              <w:right w:val="single" w:sz="2" w:space="0" w:color="000000"/>
+            </w:tcBorders>
+            <w:shd w:fill="auto" w:val="clear"/>
+          </w:tcPr>
+          <w:p>
+            <w:pPr>
+              <w:pStyle w:val="Tabelindhold"/>
+              <w:rPr>
+                <w:color w:val="C9211E"/>
+              </w:rPr>
+            </w:pPr>
+            <w:r>
+              <w:rPr>
+                <w:color w:val="C9211E"/>
+              </w:rPr>
+              <w:t>Sti til .exe filen for den installerede version af Braille Music Editor 2</w:t>
             </w:r>
           </w:p>
         </w:tc>
@@ -7588,9 +7827,7 @@
           <w:ilvl w:val="2"/>
           <w:numId w:val="4"/>
         </w:numPr>
-        <w:rPr>
-          <w:color w:val="000000"/>
-        </w:rPr>
+        <w:rPr/>
       </w:pPr>
       <w:bookmarkStart w:id="8" w:name="__RefHeading___Toc531076551"/>
       <w:bookmarkEnd w:id="8"/>
@@ -7605,16 +7842,85 @@
     <w:p>
       <w:pPr>
         <w:pStyle w:val="Brdtekst"/>
-        <w:rPr>
-          <w:color w:val="000000"/>
-        </w:rPr>
-      </w:pPr>
-      <w:r>
-        <w:rPr>
-          <w:rFonts w:cs="Verdana" w:ascii="Verdana" w:hAnsi="Verdana"/>
-          <w:color w:val="000000"/>
-        </w:rPr>
-        <w:t xml:space="preserve">Punkterne "MuseScore",  "Sibelius", "Capella" og "Finale" under </w:t>
+        <w:rPr/>
+      </w:pPr>
+      <w:r>
+        <w:rPr>
+          <w:rFonts w:cs="Verdana" w:ascii="Verdana" w:hAnsi="Verdana"/>
+          <w:color w:val="C9211E"/>
+        </w:rPr>
+        <w:t xml:space="preserve">Punktet "IBOS Punktnodelæser" under </w:t>
+      </w:r>
+      <w:r>
+        <w:rPr>
+          <w:rFonts w:cs="Verdana" w:ascii="Verdana" w:hAnsi="Verdana"/>
+          <w:b/>
+          <w:bCs/>
+          <w:color w:val="C9211E"/>
+        </w:rPr>
+        <w:t>"Værktøjer"</w:t>
+      </w:r>
+      <w:r>
+        <w:rPr>
+          <w:rFonts w:cs="Verdana" w:ascii="Verdana" w:hAnsi="Verdana"/>
+          <w:color w:val="C9211E"/>
+        </w:rPr>
+        <w:t xml:space="preserve"> starter det integrerede værktøj "IBOS Punktnodelæser". Herfra kan man åbne eksisterende NOTA punktnodefiler eller punktnodefiler, som netop genereret og eksporteret af  "IBOS Nodelæser". Indholdet af punktnodefiler vises i en listbox, som fortolket tekst. </w:t>
+      </w:r>
+    </w:p>
+    <w:p>
+      <w:pPr>
+        <w:pStyle w:val="Brdtekst"/>
+        <w:rPr/>
+      </w:pPr>
+      <w:r>
+        <w:rPr>
+          <w:rFonts w:cs="Verdana" w:ascii="Verdana" w:hAnsi="Verdana"/>
+          <w:color w:val="000000"/>
+        </w:rPr>
+        <w:t>Punkterne "MuseScore",  "Sibelius", "Capella"</w:t>
+      </w:r>
+      <w:r>
+        <w:rPr>
+          <w:rFonts w:cs="Verdana" w:ascii="Verdana" w:hAnsi="Verdana"/>
+          <w:color w:val="C9211E"/>
+        </w:rPr>
+        <w:t>, "Finale", "</w:t>
+      </w:r>
+      <w:r>
+        <w:rPr>
+          <w:rFonts w:cs="Verdana" w:ascii="Verdana" w:hAnsi="Verdana"/>
+          <w:color w:val="C9211E"/>
+        </w:rPr>
+        <w:t>PhotoScore"</w:t>
+      </w:r>
+      <w:r>
+        <w:rPr>
+          <w:rFonts w:cs="Verdana" w:ascii="Verdana" w:hAnsi="Verdana"/>
+          <w:color w:val="C9211E"/>
+        </w:rPr>
+        <w:t xml:space="preserve"> </w:t>
+      </w:r>
+      <w:r>
+        <w:rPr>
+          <w:rFonts w:cs="Verdana" w:ascii="Verdana" w:hAnsi="Verdana"/>
+          <w:color w:val="C9211E"/>
+        </w:rPr>
+        <w:t>og "Braille MusicEditor 2"</w:t>
+      </w:r>
+      <w:r>
+        <w:rPr>
+          <w:rFonts w:cs="Verdana" w:ascii="Verdana" w:hAnsi="Verdana"/>
+          <w:color w:val="C9211E"/>
+        </w:rPr>
+        <w:t xml:space="preserve"> </w:t>
+      </w:r>
+      <w:r>
+        <w:rPr>
+          <w:rFonts w:cs="Verdana" w:ascii="Verdana" w:hAnsi="Verdana"/>
+          <w:color w:val="000000"/>
+        </w:rPr>
+        <w:t xml:space="preserve">under </w:t>
       </w:r>
       <w:r>
         <w:rPr>
@@ -8307,15 +8613,15 @@
         </w:tblCellMar>
       </w:tblPr>
       <w:tblGrid>
-        <w:gridCol w:w="3228"/>
+        <w:gridCol w:w="3227"/>
         <w:gridCol w:w="2309"/>
-        <w:gridCol w:w="4110"/>
+        <w:gridCol w:w="4111"/>
       </w:tblGrid>
       <w:tr>
         <w:trPr/>
         <w:tc>
           <w:tcPr>
-            <w:tcW w:w="3228" w:type="dxa"/>
+            <w:tcW w:w="3227" w:type="dxa"/>
             <w:tcBorders>
               <w:top w:val="single" w:sz="2" w:space="0" w:color="000000"/>
               <w:left w:val="single" w:sz="2" w:space="0" w:color="000000"/>
@@ -8367,7 +8673,7 @@
         </w:tc>
         <w:tc>
           <w:tcPr>
-            <w:tcW w:w="4110" w:type="dxa"/>
+            <w:tcW w:w="4111" w:type="dxa"/>
             <w:tcBorders>
               <w:top w:val="single" w:sz="2" w:space="0" w:color="000000"/>
               <w:left w:val="single" w:sz="2" w:space="0" w:color="000000"/>
@@ -8397,7 +8703,7 @@
         <w:trPr/>
         <w:tc>
           <w:tcPr>
-            <w:tcW w:w="3228" w:type="dxa"/>
+            <w:tcW w:w="3227" w:type="dxa"/>
             <w:tcBorders>
               <w:left w:val="single" w:sz="2" w:space="0" w:color="000000"/>
               <w:bottom w:val="single" w:sz="2" w:space="0" w:color="000000"/>
@@ -8462,7 +8768,7 @@
         </w:tc>
         <w:tc>
           <w:tcPr>
-            <w:tcW w:w="4110" w:type="dxa"/>
+            <w:tcW w:w="4111" w:type="dxa"/>
             <w:tcBorders>
               <w:left w:val="single" w:sz="2" w:space="0" w:color="000000"/>
               <w:bottom w:val="single" w:sz="2" w:space="0" w:color="000000"/>
@@ -8513,7 +8819,7 @@
         <w:trPr/>
         <w:tc>
           <w:tcPr>
-            <w:tcW w:w="3228" w:type="dxa"/>
+            <w:tcW w:w="3227" w:type="dxa"/>
             <w:tcBorders>
               <w:left w:val="single" w:sz="2" w:space="0" w:color="000000"/>
               <w:bottom w:val="single" w:sz="2" w:space="0" w:color="000000"/>
@@ -8593,7 +8899,7 @@
         </w:tc>
         <w:tc>
           <w:tcPr>
-            <w:tcW w:w="4110" w:type="dxa"/>
+            <w:tcW w:w="4111" w:type="dxa"/>
             <w:tcBorders>
               <w:left w:val="single" w:sz="2" w:space="0" w:color="000000"/>
               <w:bottom w:val="single" w:sz="2" w:space="0" w:color="000000"/>
@@ -8637,7 +8943,7 @@
         <w:trPr/>
         <w:tc>
           <w:tcPr>
-            <w:tcW w:w="3228" w:type="dxa"/>
+            <w:tcW w:w="3227" w:type="dxa"/>
             <w:tcBorders>
               <w:left w:val="single" w:sz="2" w:space="0" w:color="000000"/>
               <w:bottom w:val="single" w:sz="2" w:space="0" w:color="000000"/>
@@ -8691,7 +8997,7 @@
         </w:tc>
         <w:tc>
           <w:tcPr>
-            <w:tcW w:w="4110" w:type="dxa"/>
+            <w:tcW w:w="4111" w:type="dxa"/>
             <w:tcBorders>
               <w:left w:val="single" w:sz="2" w:space="0" w:color="000000"/>
               <w:bottom w:val="single" w:sz="2" w:space="0" w:color="000000"/>
@@ -8721,7 +9027,7 @@
         <w:trPr/>
         <w:tc>
           <w:tcPr>
-            <w:tcW w:w="3228" w:type="dxa"/>
+            <w:tcW w:w="3227" w:type="dxa"/>
             <w:tcBorders>
               <w:left w:val="single" w:sz="2" w:space="0" w:color="000000"/>
               <w:bottom w:val="single" w:sz="2" w:space="0" w:color="000000"/>
@@ -8775,7 +9081,7 @@
         </w:tc>
         <w:tc>
           <w:tcPr>
-            <w:tcW w:w="4110" w:type="dxa"/>
+            <w:tcW w:w="4111" w:type="dxa"/>
             <w:tcBorders>
               <w:left w:val="single" w:sz="2" w:space="0" w:color="000000"/>
               <w:bottom w:val="single" w:sz="2" w:space="0" w:color="000000"/>
@@ -8805,7 +9111,7 @@
         <w:trPr/>
         <w:tc>
           <w:tcPr>
-            <w:tcW w:w="3228" w:type="dxa"/>
+            <w:tcW w:w="3227" w:type="dxa"/>
             <w:tcBorders>
               <w:left w:val="single" w:sz="2" w:space="0" w:color="000000"/>
               <w:bottom w:val="single" w:sz="2" w:space="0" w:color="000000"/>
@@ -8855,7 +9161,7 @@
         </w:tc>
         <w:tc>
           <w:tcPr>
-            <w:tcW w:w="4110" w:type="dxa"/>
+            <w:tcW w:w="4111" w:type="dxa"/>
             <w:tcBorders>
               <w:left w:val="single" w:sz="2" w:space="0" w:color="000000"/>
               <w:bottom w:val="single" w:sz="2" w:space="0" w:color="000000"/>
@@ -8978,15 +9284,15 @@
         </w:tblCellMar>
       </w:tblPr>
       <w:tblGrid>
-        <w:gridCol w:w="3228"/>
+        <w:gridCol w:w="3227"/>
         <w:gridCol w:w="2338"/>
-        <w:gridCol w:w="4081"/>
+        <w:gridCol w:w="4082"/>
       </w:tblGrid>
       <w:tr>
         <w:trPr/>
         <w:tc>
           <w:tcPr>
-            <w:tcW w:w="3228" w:type="dxa"/>
+            <w:tcW w:w="3227" w:type="dxa"/>
             <w:tcBorders>
               <w:top w:val="single" w:sz="2" w:space="0" w:color="000000"/>
               <w:left w:val="single" w:sz="2" w:space="0" w:color="000000"/>
@@ -9038,7 +9344,7 @@
         </w:tc>
         <w:tc>
           <w:tcPr>
-            <w:tcW w:w="4081" w:type="dxa"/>
+            <w:tcW w:w="4082" w:type="dxa"/>
             <w:tcBorders>
               <w:top w:val="single" w:sz="2" w:space="0" w:color="000000"/>
               <w:left w:val="single" w:sz="2" w:space="0" w:color="000000"/>
@@ -9068,7 +9374,7 @@
         <w:trPr/>
         <w:tc>
           <w:tcPr>
-            <w:tcW w:w="3228" w:type="dxa"/>
+            <w:tcW w:w="3227" w:type="dxa"/>
             <w:tcBorders>
               <w:left w:val="single" w:sz="2" w:space="0" w:color="000000"/>
               <w:bottom w:val="single" w:sz="2" w:space="0" w:color="000000"/>
@@ -9118,7 +9424,7 @@
         </w:tc>
         <w:tc>
           <w:tcPr>
-            <w:tcW w:w="4081" w:type="dxa"/>
+            <w:tcW w:w="4082" w:type="dxa"/>
             <w:tcBorders>
               <w:left w:val="single" w:sz="2" w:space="0" w:color="000000"/>
               <w:bottom w:val="single" w:sz="2" w:space="0" w:color="000000"/>
@@ -9798,7 +10104,7 @@
           <w:numId w:val="0"/>
         </w:numPr>
         <w:suppressAutoHyphens w:val="true"/>
-        <w:overflowPunct w:val="true"/>
+        <w:overflowPunct w:val="false"/>
         <w:jc w:val="left"/>
         <w:outlineLvl w:val="1"/>
         <w:rPr>
@@ -11110,8 +11416,8 @@
         </w:tblCellMar>
       </w:tblPr>
       <w:tblGrid>
-        <w:gridCol w:w="2380"/>
-        <w:gridCol w:w="7266"/>
+        <w:gridCol w:w="2379"/>
+        <w:gridCol w:w="7267"/>
       </w:tblGrid>
       <w:tr>
         <w:trPr>
@@ -11119,7 +11425,7 @@
         </w:trPr>
         <w:tc>
           <w:tcPr>
-            <w:tcW w:w="2380" w:type="dxa"/>
+            <w:tcW w:w="2379" w:type="dxa"/>
             <w:tcBorders>
               <w:top w:val="single" w:sz="2" w:space="0" w:color="000000"/>
               <w:left w:val="single" w:sz="2" w:space="0" w:color="000000"/>
@@ -11147,7 +11453,7 @@
         </w:tc>
         <w:tc>
           <w:tcPr>
-            <w:tcW w:w="7266" w:type="dxa"/>
+            <w:tcW w:w="7267" w:type="dxa"/>
             <w:tcBorders>
               <w:top w:val="single" w:sz="2" w:space="0" w:color="000000"/>
               <w:left w:val="single" w:sz="2" w:space="0" w:color="000000"/>
@@ -11178,7 +11484,7 @@
         <w:trPr/>
         <w:tc>
           <w:tcPr>
-            <w:tcW w:w="2380" w:type="dxa"/>
+            <w:tcW w:w="2379" w:type="dxa"/>
             <w:tcBorders>
               <w:left w:val="single" w:sz="2" w:space="0" w:color="000000"/>
               <w:bottom w:val="single" w:sz="2" w:space="0" w:color="000000"/>
@@ -11204,7 +11510,7 @@
         </w:tc>
         <w:tc>
           <w:tcPr>
-            <w:tcW w:w="7266" w:type="dxa"/>
+            <w:tcW w:w="7267" w:type="dxa"/>
             <w:tcBorders>
               <w:left w:val="single" w:sz="2" w:space="0" w:color="000000"/>
               <w:bottom w:val="single" w:sz="2" w:space="0" w:color="000000"/>
@@ -11233,7 +11539,7 @@
         <w:trPr/>
         <w:tc>
           <w:tcPr>
-            <w:tcW w:w="2380" w:type="dxa"/>
+            <w:tcW w:w="2379" w:type="dxa"/>
             <w:tcBorders>
               <w:left w:val="single" w:sz="2" w:space="0" w:color="000000"/>
               <w:bottom w:val="single" w:sz="2" w:space="0" w:color="000000"/>
@@ -11259,7 +11565,7 @@
         </w:tc>
         <w:tc>
           <w:tcPr>
-            <w:tcW w:w="7266" w:type="dxa"/>
+            <w:tcW w:w="7267" w:type="dxa"/>
             <w:tcBorders>
               <w:left w:val="single" w:sz="2" w:space="0" w:color="000000"/>
               <w:bottom w:val="single" w:sz="2" w:space="0" w:color="000000"/>
@@ -11288,7 +11594,7 @@
         <w:trPr/>
         <w:tc>
           <w:tcPr>
-            <w:tcW w:w="2380" w:type="dxa"/>
+            <w:tcW w:w="2379" w:type="dxa"/>
             <w:tcBorders>
               <w:left w:val="single" w:sz="2" w:space="0" w:color="000000"/>
               <w:bottom w:val="single" w:sz="2" w:space="0" w:color="000000"/>
@@ -11314,7 +11620,7 @@
         </w:tc>
         <w:tc>
           <w:tcPr>
-            <w:tcW w:w="7266" w:type="dxa"/>
+            <w:tcW w:w="7267" w:type="dxa"/>
             <w:tcBorders>
               <w:left w:val="single" w:sz="2" w:space="0" w:color="000000"/>
               <w:bottom w:val="single" w:sz="2" w:space="0" w:color="000000"/>
@@ -11358,7 +11664,7 @@
         <w:trPr/>
         <w:tc>
           <w:tcPr>
-            <w:tcW w:w="2380" w:type="dxa"/>
+            <w:tcW w:w="2379" w:type="dxa"/>
             <w:tcBorders>
               <w:left w:val="single" w:sz="2" w:space="0" w:color="000000"/>
               <w:bottom w:val="single" w:sz="2" w:space="0" w:color="000000"/>
@@ -11384,7 +11690,7 @@
         </w:tc>
         <w:tc>
           <w:tcPr>
-            <w:tcW w:w="7266" w:type="dxa"/>
+            <w:tcW w:w="7267" w:type="dxa"/>
             <w:tcBorders>
               <w:left w:val="single" w:sz="2" w:space="0" w:color="000000"/>
               <w:bottom w:val="single" w:sz="2" w:space="0" w:color="000000"/>
@@ -11413,7 +11719,7 @@
         <w:trPr/>
         <w:tc>
           <w:tcPr>
-            <w:tcW w:w="2380" w:type="dxa"/>
+            <w:tcW w:w="2379" w:type="dxa"/>
             <w:tcBorders>
               <w:left w:val="single" w:sz="2" w:space="0" w:color="000000"/>
               <w:bottom w:val="single" w:sz="2" w:space="0" w:color="000000"/>
@@ -11439,7 +11745,7 @@
         </w:tc>
         <w:tc>
           <w:tcPr>
-            <w:tcW w:w="7266" w:type="dxa"/>
+            <w:tcW w:w="7267" w:type="dxa"/>
             <w:tcBorders>
               <w:left w:val="single" w:sz="2" w:space="0" w:color="000000"/>
               <w:bottom w:val="single" w:sz="2" w:space="0" w:color="000000"/>
@@ -11468,7 +11774,7 @@
         <w:trPr/>
         <w:tc>
           <w:tcPr>
-            <w:tcW w:w="2380" w:type="dxa"/>
+            <w:tcW w:w="2379" w:type="dxa"/>
             <w:tcBorders>
               <w:left w:val="single" w:sz="2" w:space="0" w:color="000000"/>
               <w:bottom w:val="single" w:sz="2" w:space="0" w:color="000000"/>
@@ -11494,7 +11800,7 @@
         </w:tc>
         <w:tc>
           <w:tcPr>
-            <w:tcW w:w="7266" w:type="dxa"/>
+            <w:tcW w:w="7267" w:type="dxa"/>
             <w:tcBorders>
               <w:left w:val="single" w:sz="2" w:space="0" w:color="000000"/>
               <w:bottom w:val="single" w:sz="2" w:space="0" w:color="000000"/>
@@ -11523,7 +11829,7 @@
         <w:trPr/>
         <w:tc>
           <w:tcPr>
-            <w:tcW w:w="2380" w:type="dxa"/>
+            <w:tcW w:w="2379" w:type="dxa"/>
             <w:tcBorders>
               <w:left w:val="single" w:sz="2" w:space="0" w:color="000000"/>
               <w:bottom w:val="single" w:sz="2" w:space="0" w:color="000000"/>
@@ -11549,7 +11855,7 @@
         </w:tc>
         <w:tc>
           <w:tcPr>
-            <w:tcW w:w="7266" w:type="dxa"/>
+            <w:tcW w:w="7267" w:type="dxa"/>
             <w:tcBorders>
               <w:left w:val="single" w:sz="2" w:space="0" w:color="000000"/>
               <w:bottom w:val="single" w:sz="2" w:space="0" w:color="000000"/>
@@ -11578,7 +11884,7 @@
         <w:trPr/>
         <w:tc>
           <w:tcPr>
-            <w:tcW w:w="2380" w:type="dxa"/>
+            <w:tcW w:w="2379" w:type="dxa"/>
             <w:tcBorders>
               <w:left w:val="single" w:sz="2" w:space="0" w:color="000000"/>
               <w:bottom w:val="single" w:sz="2" w:space="0" w:color="000000"/>
@@ -11606,7 +11912,7 @@
         </w:tc>
         <w:tc>
           <w:tcPr>
-            <w:tcW w:w="7266" w:type="dxa"/>
+            <w:tcW w:w="7267" w:type="dxa"/>
             <w:tcBorders>
               <w:left w:val="single" w:sz="2" w:space="0" w:color="000000"/>
               <w:bottom w:val="single" w:sz="2" w:space="0" w:color="000000"/>
@@ -13875,7 +14181,39 @@
           <w:color w:val="000000"/>
           <w:lang w:val="da-DK"/>
         </w:rPr>
-        <w:t>Version 4.0 understøtter ”ASCII”, ”OctoBraille 1252” og ”Unicode”.</w:t>
+        <w:t xml:space="preserve">Version 4.0 understøtter ”ASCII”, ”OctoBraille 1252”, </w:t>
+      </w:r>
+      <w:r>
+        <w:rPr>
+          <w:rFonts w:cs="Verdana" w:ascii="Verdana" w:hAnsi="Verdana"/>
+          <w:color w:val="C9211E"/>
+          <w:lang w:val="da-DK"/>
+        </w:rPr>
+        <w:t>”</w:t>
+      </w:r>
+      <w:r>
+        <w:rPr>
+          <w:rFonts w:cs="Verdana" w:ascii="Verdana" w:hAnsi="Verdana"/>
+          <w:color w:val="C9211E"/>
+          <w:lang w:val="da-DK"/>
+        </w:rPr>
+        <w:t>PEF</w:t>
+      </w:r>
+      <w:r>
+        <w:rPr>
+          <w:rFonts w:cs="Verdana" w:ascii="Verdana" w:hAnsi="Verdana"/>
+          <w:color w:val="C9211E"/>
+          <w:lang w:val="da-DK"/>
+        </w:rPr>
+        <w:t>”</w:t>
+      </w:r>
+      <w:r>
+        <w:rPr>
+          <w:rFonts w:cs="Verdana" w:ascii="Verdana" w:hAnsi="Verdana"/>
+          <w:color w:val="000000"/>
+          <w:lang w:val="da-DK"/>
+        </w:rPr>
+        <w:t xml:space="preserve"> og ”Unicode”.</w:t>
       </w:r>
     </w:p>
     <w:p>
@@ -13902,9 +14240,7 @@
           <w:ilvl w:val="2"/>
           <w:numId w:val="2"/>
         </w:numPr>
-        <w:rPr>
-          <w:color w:val="C9211E"/>
-        </w:rPr>
+        <w:rPr/>
       </w:pPr>
       <w:bookmarkStart w:id="26" w:name="__RefHeading___Toc1948_1354692515"/>
       <w:bookmarkEnd w:id="26"/>
@@ -13912,23 +14248,75 @@
         <w:rPr>
           <w:color w:val="000000"/>
         </w:rPr>
-        <w:t>Punktskrift-apparat-type</w:t>
-      </w:r>
-    </w:p>
-    <w:p>
-      <w:pPr>
-        <w:pStyle w:val="Brdtekst"/>
-        <w:rPr>
+        <w:t>Punktskrift-apparat-</w:t>
+      </w:r>
+      <w:r>
+        <w:rPr>
+          <w:color w:val="000000"/>
+        </w:rPr>
+        <w:t>navn</w:t>
+      </w:r>
+    </w:p>
+    <w:p>
+      <w:pPr>
+        <w:pStyle w:val="Brdtekst"/>
+        <w:rPr/>
+      </w:pPr>
+      <w:r>
+        <w:rPr>
+          <w:rFonts w:cs="Verdana" w:ascii="Verdana" w:hAnsi="Verdana"/>
+          <w:color w:val="000000"/>
+          <w:lang w:val="da-DK"/>
+        </w:rPr>
+        <w:t xml:space="preserve">Her understøttes ”Punktprinter” , ”Notatapparat”, </w:t>
+      </w:r>
+      <w:r>
+        <w:rPr>
+          <w:rFonts w:cs="Verdana" w:ascii="Verdana" w:hAnsi="Verdana"/>
           <w:color w:val="C9211E"/>
-        </w:rPr>
-      </w:pPr>
-      <w:r>
-        <w:rPr>
-          <w:rFonts w:cs="Verdana" w:ascii="Verdana" w:hAnsi="Verdana"/>
-          <w:color w:val="000000"/>
-          <w:lang w:val="da-DK"/>
-        </w:rPr>
-        <w:t>Her understøttes ”Punktprinter” , ”Notatapparat” og ”Universelt apparat”.</w:t>
+          <w:lang w:val="da-DK"/>
+        </w:rPr>
+        <w:t>”</w:t>
+      </w:r>
+      <w:r>
+        <w:rPr>
+          <w:rFonts w:cs="Verdana" w:ascii="Verdana" w:hAnsi="Verdana"/>
+          <w:color w:val="C9211E"/>
+          <w:lang w:val="da-DK"/>
+        </w:rPr>
+        <w:t>Braillo 650 SF</w:t>
+      </w:r>
+      <w:r>
+        <w:rPr>
+          <w:rFonts w:cs="Verdana" w:ascii="Verdana" w:hAnsi="Verdana"/>
+          <w:color w:val="C9211E"/>
+          <w:lang w:val="da-DK"/>
+        </w:rPr>
+        <w:t>”</w:t>
+      </w:r>
+      <w:r>
+        <w:rPr>
+          <w:rFonts w:cs="Verdana" w:ascii="Verdana" w:hAnsi="Verdana"/>
+          <w:color w:val="000000"/>
+          <w:lang w:val="da-DK"/>
+        </w:rPr>
+        <w:t xml:space="preserve"> og ”Universelt apparat”.</w:t>
+      </w:r>
+    </w:p>
+    <w:p>
+      <w:pPr>
+        <w:pStyle w:val="Brdtekst"/>
+        <w:rPr>
+          <w:color w:val="C9211E"/>
+        </w:rPr>
+      </w:pPr>
+      <w:r>
+        <w:rPr>
+          <w:rFonts w:cs="Verdana" w:ascii="Verdana" w:hAnsi="Verdana"/>
+          <w:color w:val="C9211E"/>
+          <w:lang w:val="da-DK"/>
+        </w:rPr>
+        <w:t xml:space="preserve">Brugeren kan selv omdøbe apparaterne, for eksempel til navnet på brugerens egene, specifikke punktprinter. </w:t>
       </w:r>
     </w:p>
     <w:p>
@@ -13936,14 +14324,14 @@
         <w:pStyle w:val="Brdtekst"/>
         <w:rPr>
           <w:rFonts w:ascii="Verdana" w:hAnsi="Verdana" w:cs="Verdana"/>
-          <w:color w:val="000000"/>
-          <w:lang w:val="da-DK"/>
-        </w:rPr>
-      </w:pPr>
-      <w:r>
-        <w:rPr>
-          <w:rFonts w:cs="Verdana" w:ascii="Verdana" w:hAnsi="Verdana"/>
-          <w:color w:val="000000"/>
+          <w:color w:val="C9211E"/>
+          <w:lang w:val="da-DK"/>
+        </w:rPr>
+      </w:pPr>
+      <w:r>
+        <w:rPr>
+          <w:rFonts w:cs="Verdana" w:ascii="Verdana" w:hAnsi="Verdana"/>
+          <w:color w:val="C9211E"/>
           <w:lang w:val="da-DK"/>
         </w:rPr>
       </w:r>
@@ -14203,16 +14591,20 @@
               <w:pStyle w:val="Brdtekst"/>
               <w:spacing w:before="0" w:after="140"/>
               <w:rPr>
+                <w:rFonts w:ascii="Verdana" w:hAnsi="Verdana"/>
                 <w:color w:val="C9211E"/>
-              </w:rPr>
-            </w:pPr>
-            <w:r>
-              <w:rPr>
-                <w:rFonts w:cs="Verdana" w:ascii="Verdana" w:hAnsi="Verdana"/>
-                <w:color w:val="000000"/>
-                <w:lang w:val="da-DK"/>
-              </w:rPr>
-              <w:t>Universelt punktapparat</w:t>
+                <w:sz w:val="22"/>
+                <w:szCs w:val="22"/>
+              </w:rPr>
+            </w:pPr>
+            <w:r>
+              <w:rPr>
+                <w:rFonts w:ascii="Verdana" w:hAnsi="Verdana"/>
+                <w:color w:val="C9211E"/>
+                <w:sz w:val="22"/>
+                <w:szCs w:val="22"/>
+              </w:rPr>
+              <w:t>Højhastigheds punktprinter</w:t>
             </w:r>
           </w:p>
         </w:tc>
@@ -14231,6 +14623,90 @@
               <w:pStyle w:val="Brdtekst"/>
               <w:spacing w:before="0" w:after="140"/>
               <w:rPr>
+                <w:rFonts w:ascii="Verdana" w:hAnsi="Verdana"/>
+                <w:color w:val="C9211E"/>
+                <w:sz w:val="22"/>
+                <w:szCs w:val="22"/>
+              </w:rPr>
+            </w:pPr>
+            <w:r>
+              <w:rPr>
+                <w:rFonts w:ascii="Verdana" w:hAnsi="Verdana"/>
+                <w:color w:val="C9211E"/>
+                <w:sz w:val="22"/>
+                <w:szCs w:val="22"/>
+              </w:rPr>
+              <w:t>Typiske indstillinger for en højhastigheds punktprinter.</w:t>
+            </w:r>
+          </w:p>
+          <w:p>
+            <w:pPr>
+              <w:pStyle w:val="Brdtekst"/>
+              <w:spacing w:before="0" w:after="140"/>
+              <w:rPr>
+                <w:rFonts w:ascii="Verdana" w:hAnsi="Verdana"/>
+                <w:color w:val="C9211E"/>
+                <w:sz w:val="22"/>
+                <w:szCs w:val="22"/>
+              </w:rPr>
+            </w:pPr>
+            <w:r>
+              <w:rPr>
+                <w:rFonts w:cs="Verdana" w:ascii="Verdana" w:hAnsi="Verdana"/>
+                <w:color w:val="C9211E"/>
+                <w:sz w:val="22"/>
+                <w:szCs w:val="22"/>
+                <w:lang w:val="da-DK"/>
+              </w:rPr>
+              <w:t>Navnet ”Braille 650 SF” er således navnet på den højhastigheds punktprinter, som benyttes hos NOTA.</w:t>
+            </w:r>
+          </w:p>
+        </w:tc>
+      </w:tr>
+      <w:tr>
+        <w:trPr/>
+        <w:tc>
+          <w:tcPr>
+            <w:tcW w:w="3179" w:type="dxa"/>
+            <w:tcBorders>
+              <w:left w:val="single" w:sz="2" w:space="0" w:color="000000"/>
+              <w:bottom w:val="single" w:sz="2" w:space="0" w:color="000000"/>
+            </w:tcBorders>
+            <w:shd w:fill="auto" w:val="clear"/>
+          </w:tcPr>
+          <w:p>
+            <w:pPr>
+              <w:pStyle w:val="Brdtekst"/>
+              <w:spacing w:before="0" w:after="140"/>
+              <w:rPr>
+                <w:color w:val="C9211E"/>
+              </w:rPr>
+            </w:pPr>
+            <w:r>
+              <w:rPr>
+                <w:rFonts w:cs="Verdana" w:ascii="Verdana" w:hAnsi="Verdana"/>
+                <w:color w:val="000000"/>
+                <w:lang w:val="da-DK"/>
+              </w:rPr>
+              <w:t>Universelt punktapparat</w:t>
+            </w:r>
+          </w:p>
+        </w:tc>
+        <w:tc>
+          <w:tcPr>
+            <w:tcW w:w="6471" w:type="dxa"/>
+            <w:tcBorders>
+              <w:left w:val="single" w:sz="2" w:space="0" w:color="000000"/>
+              <w:bottom w:val="single" w:sz="2" w:space="0" w:color="000000"/>
+              <w:right w:val="single" w:sz="2" w:space="0" w:color="000000"/>
+            </w:tcBorders>
+            <w:shd w:fill="auto" w:val="clear"/>
+          </w:tcPr>
+          <w:p>
+            <w:pPr>
+              <w:pStyle w:val="Brdtekst"/>
+              <w:spacing w:before="0" w:after="140"/>
+              <w:rPr>
                 <w:color w:val="C9211E"/>
               </w:rPr>
             </w:pPr>
@@ -14298,17 +14774,31 @@
     <w:p>
       <w:pPr>
         <w:pStyle w:val="Brdtekst"/>
-        <w:rPr>
-          <w:color w:val="C9211E"/>
-        </w:rPr>
-      </w:pPr>
-      <w:r>
-        <w:rPr>
-          <w:rFonts w:cs="Verdana" w:ascii="Verdana" w:hAnsi="Verdana"/>
-          <w:color w:val="000000"/>
-          <w:lang w:val="da-DK"/>
-        </w:rPr>
-        <w:t>Som standard gemmes punktnode filerne i undermapper ved siden af den tilhørende MusicXml fil, men det vil ofte være praktisk at gemme filerne direkte på en USB memory stick, som derefter kan flyttes over i et notatapparat.</w:t>
+        <w:rPr/>
+      </w:pPr>
+      <w:r>
+        <w:rPr>
+          <w:rFonts w:cs="Verdana" w:ascii="Verdana" w:hAnsi="Verdana"/>
+          <w:color w:val="000000"/>
+          <w:lang w:val="da-DK"/>
+        </w:rPr>
+        <w:t xml:space="preserve">Som standard gemmes punktnode filerne i undermapper ved siden af den tilhørende MusicXml fil, men det vil ofte være praktisk at gemme filerne direkte på en USB </w:t>
+      </w:r>
+      <w:r>
+        <w:rPr>
+          <w:rFonts w:cs="Verdana" w:ascii="Verdana" w:hAnsi="Verdana"/>
+          <w:color w:val="000000"/>
+          <w:lang w:val="da-DK"/>
+        </w:rPr>
+        <w:t>memory</w:t>
+      </w:r>
+      <w:r>
+        <w:rPr>
+          <w:rFonts w:cs="Verdana" w:ascii="Verdana" w:hAnsi="Verdana"/>
+          <w:color w:val="000000"/>
+          <w:lang w:val="da-DK"/>
+        </w:rPr>
+        <w:t xml:space="preserve"> stick, som derefter kan flyttes over i et notatapparat.</w:t>
       </w:r>
       <w:r>
         <w:br w:type="page"/>
@@ -14643,9 +15133,7 @@
     <w:p>
       <w:pPr>
         <w:pStyle w:val="Brdtekst"/>
-        <w:rPr>
-          <w:color w:val="000000"/>
-        </w:rPr>
+        <w:rPr/>
       </w:pPr>
       <w:r>
         <w:rPr>
@@ -14662,6 +15150,35 @@
           <w:lang w:val="da-DK"/>
         </w:rPr>
         <w:t>Filer” → ”Kopiér punktnodefil til Braille apparat ved hjælp af Stifinder”</w:t>
+      </w:r>
+    </w:p>
+    <w:p>
+      <w:pPr>
+        <w:pStyle w:val="Brdtekst"/>
+        <w:rPr>
+          <w:rFonts w:ascii="Verdana" w:hAnsi="Verdana" w:cs="Verdana"/>
+          <w:color w:val="000000"/>
+          <w:lang w:val="da-DK"/>
+        </w:rPr>
+      </w:pPr>
+      <w:r>
+        <w:rPr/>
+      </w:r>
+    </w:p>
+    <w:p>
+      <w:pPr>
+        <w:pStyle w:val="Brdtekst"/>
+        <w:rPr>
+          <w:color w:val="C9211E"/>
+        </w:rPr>
+      </w:pPr>
+      <w:r>
+        <w:rPr>
+          <w:rFonts w:cs="Verdana" w:ascii="Verdana" w:hAnsi="Verdana"/>
+          <w:color w:val="C9211E"/>
+          <w:lang w:val="da-DK"/>
+        </w:rPr>
+        <w:t>Fra og med version 5.0.0.0 kan brugeren desuden straks inspicere indeholdet af de genererede punktnodefiler ved at åbne den én ad gangen i ”IBOS Punktnodelæser”</w:t>
       </w:r>
     </w:p>
     <w:p>
@@ -14789,14 +15306,14 @@
         </w:tblCellMar>
       </w:tblPr>
       <w:tblGrid>
-        <w:gridCol w:w="1639"/>
-        <w:gridCol w:w="8011"/>
+        <w:gridCol w:w="1638"/>
+        <w:gridCol w:w="8012"/>
       </w:tblGrid>
       <w:tr>
         <w:trPr/>
         <w:tc>
           <w:tcPr>
-            <w:tcW w:w="1639" w:type="dxa"/>
+            <w:tcW w:w="1638" w:type="dxa"/>
             <w:tcBorders>
               <w:top w:val="single" w:sz="2" w:space="0" w:color="000000"/>
               <w:left w:val="single" w:sz="2" w:space="0" w:color="000000"/>
@@ -14844,7 +15361,7 @@
         </w:tc>
         <w:tc>
           <w:tcPr>
-            <w:tcW w:w="8011" w:type="dxa"/>
+            <w:tcW w:w="8012" w:type="dxa"/>
             <w:tcBorders>
               <w:top w:val="single" w:sz="2" w:space="0" w:color="000000"/>
               <w:left w:val="single" w:sz="2" w:space="0" w:color="000000"/>
@@ -14904,7 +15421,7 @@
         <w:trPr/>
         <w:tc>
           <w:tcPr>
-            <w:tcW w:w="1639" w:type="dxa"/>
+            <w:tcW w:w="1638" w:type="dxa"/>
             <w:tcBorders>
               <w:left w:val="single" w:sz="2" w:space="0" w:color="000000"/>
               <w:bottom w:val="single" w:sz="2" w:space="0" w:color="000000"/>
@@ -14944,7 +15461,7 @@
         </w:tc>
         <w:tc>
           <w:tcPr>
-            <w:tcW w:w="8011" w:type="dxa"/>
+            <w:tcW w:w="8012" w:type="dxa"/>
             <w:tcBorders>
               <w:left w:val="single" w:sz="2" w:space="0" w:color="000000"/>
               <w:bottom w:val="single" w:sz="2" w:space="0" w:color="000000"/>
@@ -15043,7 +15560,7 @@
           <w:numId w:val="3"/>
         </w:numPr>
         <w:suppressAutoHyphens w:val="true"/>
-        <w:overflowPunct w:val="true"/>
+        <w:overflowPunct w:val="false"/>
         <w:bidi w:val="0"/>
         <w:spacing w:before="200" w:after="120"/>
         <w:ind w:left="510" w:right="0" w:hanging="578"/>
@@ -16438,14 +16955,14 @@
         </w:tblCellMar>
       </w:tblPr>
       <w:tblGrid>
-        <w:gridCol w:w="3390"/>
-        <w:gridCol w:w="6256"/>
+        <w:gridCol w:w="3389"/>
+        <w:gridCol w:w="6257"/>
       </w:tblGrid>
       <w:tr>
         <w:trPr/>
         <w:tc>
           <w:tcPr>
-            <w:tcW w:w="3390" w:type="dxa"/>
+            <w:tcW w:w="3389" w:type="dxa"/>
             <w:tcBorders>
               <w:top w:val="single" w:sz="2" w:space="0" w:color="000000"/>
               <w:left w:val="single" w:sz="2" w:space="0" w:color="000000"/>
@@ -16473,7 +16990,7 @@
         </w:tc>
         <w:tc>
           <w:tcPr>
-            <w:tcW w:w="6256" w:type="dxa"/>
+            <w:tcW w:w="6257" w:type="dxa"/>
             <w:tcBorders>
               <w:top w:val="single" w:sz="2" w:space="0" w:color="000000"/>
               <w:left w:val="single" w:sz="2" w:space="0" w:color="000000"/>
@@ -16505,7 +17022,7 @@
         <w:trPr/>
         <w:tc>
           <w:tcPr>
-            <w:tcW w:w="3390" w:type="dxa"/>
+            <w:tcW w:w="3389" w:type="dxa"/>
             <w:tcBorders>
               <w:left w:val="single" w:sz="2" w:space="0" w:color="000000"/>
               <w:bottom w:val="single" w:sz="2" w:space="0" w:color="000000"/>
@@ -16530,7 +17047,7 @@
         </w:tc>
         <w:tc>
           <w:tcPr>
-            <w:tcW w:w="6256" w:type="dxa"/>
+            <w:tcW w:w="6257" w:type="dxa"/>
             <w:tcBorders>
               <w:left w:val="single" w:sz="2" w:space="0" w:color="000000"/>
               <w:bottom w:val="single" w:sz="2" w:space="0" w:color="000000"/>
@@ -16559,7 +17076,7 @@
         <w:trPr/>
         <w:tc>
           <w:tcPr>
-            <w:tcW w:w="3390" w:type="dxa"/>
+            <w:tcW w:w="3389" w:type="dxa"/>
             <w:tcBorders>
               <w:left w:val="single" w:sz="2" w:space="0" w:color="000000"/>
               <w:bottom w:val="single" w:sz="2" w:space="0" w:color="000000"/>
@@ -16584,7 +17101,7 @@
         </w:tc>
         <w:tc>
           <w:tcPr>
-            <w:tcW w:w="6256" w:type="dxa"/>
+            <w:tcW w:w="6257" w:type="dxa"/>
             <w:tcBorders>
               <w:left w:val="single" w:sz="2" w:space="0" w:color="000000"/>
               <w:bottom w:val="single" w:sz="2" w:space="0" w:color="000000"/>
@@ -16613,7 +17130,7 @@
         <w:trPr/>
         <w:tc>
           <w:tcPr>
-            <w:tcW w:w="3390" w:type="dxa"/>
+            <w:tcW w:w="3389" w:type="dxa"/>
             <w:tcBorders>
               <w:left w:val="single" w:sz="2" w:space="0" w:color="000000"/>
               <w:bottom w:val="single" w:sz="2" w:space="0" w:color="000000"/>
@@ -16639,7 +17156,7 @@
         </w:tc>
         <w:tc>
           <w:tcPr>
-            <w:tcW w:w="6256" w:type="dxa"/>
+            <w:tcW w:w="6257" w:type="dxa"/>
             <w:tcBorders>
               <w:left w:val="single" w:sz="2" w:space="0" w:color="000000"/>
               <w:bottom w:val="single" w:sz="2" w:space="0" w:color="000000"/>
@@ -16670,7 +17187,7 @@
         <w:trPr/>
         <w:tc>
           <w:tcPr>
-            <w:tcW w:w="3390" w:type="dxa"/>
+            <w:tcW w:w="3389" w:type="dxa"/>
             <w:tcBorders>
               <w:left w:val="single" w:sz="2" w:space="0" w:color="000000"/>
               <w:bottom w:val="single" w:sz="2" w:space="0" w:color="000000"/>
@@ -16697,7 +17214,7 @@
         </w:tc>
         <w:tc>
           <w:tcPr>
-            <w:tcW w:w="6256" w:type="dxa"/>
+            <w:tcW w:w="6257" w:type="dxa"/>
             <w:tcBorders>
               <w:left w:val="single" w:sz="2" w:space="0" w:color="000000"/>
               <w:bottom w:val="single" w:sz="2" w:space="0" w:color="000000"/>
@@ -16728,7 +17245,7 @@
         <w:trPr/>
         <w:tc>
           <w:tcPr>
-            <w:tcW w:w="3390" w:type="dxa"/>
+            <w:tcW w:w="3389" w:type="dxa"/>
             <w:tcBorders>
               <w:left w:val="single" w:sz="2" w:space="0" w:color="000000"/>
               <w:bottom w:val="single" w:sz="2" w:space="0" w:color="000000"/>
@@ -16753,7 +17270,7 @@
         </w:tc>
         <w:tc>
           <w:tcPr>
-            <w:tcW w:w="6256" w:type="dxa"/>
+            <w:tcW w:w="6257" w:type="dxa"/>
             <w:tcBorders>
               <w:left w:val="single" w:sz="2" w:space="0" w:color="000000"/>
               <w:bottom w:val="single" w:sz="2" w:space="0" w:color="000000"/>
@@ -16782,7 +17299,7 @@
         <w:trPr/>
         <w:tc>
           <w:tcPr>
-            <w:tcW w:w="3390" w:type="dxa"/>
+            <w:tcW w:w="3389" w:type="dxa"/>
             <w:tcBorders>
               <w:left w:val="single" w:sz="2" w:space="0" w:color="000000"/>
               <w:bottom w:val="single" w:sz="2" w:space="0" w:color="000000"/>
@@ -16807,7 +17324,7 @@
         </w:tc>
         <w:tc>
           <w:tcPr>
-            <w:tcW w:w="6256" w:type="dxa"/>
+            <w:tcW w:w="6257" w:type="dxa"/>
             <w:tcBorders>
               <w:left w:val="single" w:sz="2" w:space="0" w:color="000000"/>
               <w:bottom w:val="single" w:sz="2" w:space="0" w:color="000000"/>
@@ -16836,7 +17353,7 @@
         <w:trPr/>
         <w:tc>
           <w:tcPr>
-            <w:tcW w:w="3390" w:type="dxa"/>
+            <w:tcW w:w="3389" w:type="dxa"/>
             <w:tcBorders>
               <w:left w:val="single" w:sz="2" w:space="0" w:color="000000"/>
               <w:bottom w:val="single" w:sz="2" w:space="0" w:color="000000"/>
@@ -16861,7 +17378,7 @@
         </w:tc>
         <w:tc>
           <w:tcPr>
-            <w:tcW w:w="6256" w:type="dxa"/>
+            <w:tcW w:w="6257" w:type="dxa"/>
             <w:tcBorders>
               <w:left w:val="single" w:sz="2" w:space="0" w:color="000000"/>
               <w:bottom w:val="single" w:sz="2" w:space="0" w:color="000000"/>
@@ -16905,7 +17422,7 @@
         <w:trPr/>
         <w:tc>
           <w:tcPr>
-            <w:tcW w:w="3390" w:type="dxa"/>
+            <w:tcW w:w="3389" w:type="dxa"/>
             <w:tcBorders>
               <w:left w:val="single" w:sz="2" w:space="0" w:color="000000"/>
               <w:bottom w:val="single" w:sz="2" w:space="0" w:color="000000"/>
@@ -16930,7 +17447,7 @@
         </w:tc>
         <w:tc>
           <w:tcPr>
-            <w:tcW w:w="6256" w:type="dxa"/>
+            <w:tcW w:w="6257" w:type="dxa"/>
             <w:tcBorders>
               <w:left w:val="single" w:sz="2" w:space="0" w:color="000000"/>
               <w:bottom w:val="single" w:sz="2" w:space="0" w:color="000000"/>
@@ -16974,7 +17491,7 @@
         <w:trPr/>
         <w:tc>
           <w:tcPr>
-            <w:tcW w:w="3390" w:type="dxa"/>
+            <w:tcW w:w="3389" w:type="dxa"/>
             <w:tcBorders>
               <w:left w:val="single" w:sz="2" w:space="0" w:color="000000"/>
               <w:bottom w:val="single" w:sz="2" w:space="0" w:color="000000"/>
@@ -17001,7 +17518,7 @@
         </w:tc>
         <w:tc>
           <w:tcPr>
-            <w:tcW w:w="6256" w:type="dxa"/>
+            <w:tcW w:w="6257" w:type="dxa"/>
             <w:tcBorders>
               <w:left w:val="single" w:sz="2" w:space="0" w:color="000000"/>
               <w:bottom w:val="single" w:sz="2" w:space="0" w:color="000000"/>
@@ -17032,7 +17549,7 @@
         <w:trPr/>
         <w:tc>
           <w:tcPr>
-            <w:tcW w:w="3390" w:type="dxa"/>
+            <w:tcW w:w="3389" w:type="dxa"/>
             <w:tcBorders>
               <w:left w:val="single" w:sz="2" w:space="0" w:color="000000"/>
               <w:bottom w:val="single" w:sz="2" w:space="0" w:color="000000"/>
@@ -17059,7 +17576,7 @@
         </w:tc>
         <w:tc>
           <w:tcPr>
-            <w:tcW w:w="6256" w:type="dxa"/>
+            <w:tcW w:w="6257" w:type="dxa"/>
             <w:tcBorders>
               <w:left w:val="single" w:sz="2" w:space="0" w:color="000000"/>
               <w:bottom w:val="single" w:sz="2" w:space="0" w:color="000000"/>
@@ -17090,7 +17607,7 @@
         <w:trPr/>
         <w:tc>
           <w:tcPr>
-            <w:tcW w:w="3390" w:type="dxa"/>
+            <w:tcW w:w="3389" w:type="dxa"/>
             <w:tcBorders>
               <w:left w:val="single" w:sz="2" w:space="0" w:color="000000"/>
               <w:bottom w:val="single" w:sz="2" w:space="0" w:color="000000"/>
@@ -17117,7 +17634,7 @@
         </w:tc>
         <w:tc>
           <w:tcPr>
-            <w:tcW w:w="6256" w:type="dxa"/>
+            <w:tcW w:w="6257" w:type="dxa"/>
             <w:tcBorders>
               <w:left w:val="single" w:sz="2" w:space="0" w:color="000000"/>
               <w:bottom w:val="single" w:sz="2" w:space="0" w:color="000000"/>
@@ -17148,7 +17665,7 @@
         <w:trPr/>
         <w:tc>
           <w:tcPr>
-            <w:tcW w:w="3390" w:type="dxa"/>
+            <w:tcW w:w="3389" w:type="dxa"/>
             <w:tcBorders>
               <w:left w:val="single" w:sz="2" w:space="0" w:color="000000"/>
               <w:bottom w:val="single" w:sz="2" w:space="0" w:color="000000"/>
@@ -17175,7 +17692,7 @@
         </w:tc>
         <w:tc>
           <w:tcPr>
-            <w:tcW w:w="6256" w:type="dxa"/>
+            <w:tcW w:w="6257" w:type="dxa"/>
             <w:tcBorders>
               <w:left w:val="single" w:sz="2" w:space="0" w:color="000000"/>
               <w:bottom w:val="single" w:sz="2" w:space="0" w:color="000000"/>
@@ -17206,7 +17723,7 @@
         <w:trPr/>
         <w:tc>
           <w:tcPr>
-            <w:tcW w:w="3390" w:type="dxa"/>
+            <w:tcW w:w="3389" w:type="dxa"/>
             <w:tcBorders>
               <w:left w:val="single" w:sz="2" w:space="0" w:color="000000"/>
               <w:bottom w:val="single" w:sz="2" w:space="0" w:color="000000"/>
@@ -17231,7 +17748,7 @@
         </w:tc>
         <w:tc>
           <w:tcPr>
-            <w:tcW w:w="6256" w:type="dxa"/>
+            <w:tcW w:w="6257" w:type="dxa"/>
             <w:tcBorders>
               <w:left w:val="single" w:sz="2" w:space="0" w:color="000000"/>
               <w:bottom w:val="single" w:sz="2" w:space="0" w:color="000000"/>
@@ -17260,7 +17777,7 @@
         <w:trPr/>
         <w:tc>
           <w:tcPr>
-            <w:tcW w:w="3390" w:type="dxa"/>
+            <w:tcW w:w="3389" w:type="dxa"/>
             <w:tcBorders>
               <w:left w:val="single" w:sz="2" w:space="0" w:color="000000"/>
               <w:bottom w:val="single" w:sz="2" w:space="0" w:color="000000"/>
@@ -17300,7 +17817,7 @@
         </w:tc>
         <w:tc>
           <w:tcPr>
-            <w:tcW w:w="6256" w:type="dxa"/>
+            <w:tcW w:w="6257" w:type="dxa"/>
             <w:tcBorders>
               <w:left w:val="single" w:sz="2" w:space="0" w:color="000000"/>
               <w:bottom w:val="single" w:sz="2" w:space="0" w:color="000000"/>
@@ -17329,7 +17846,7 @@
         <w:trPr/>
         <w:tc>
           <w:tcPr>
-            <w:tcW w:w="3390" w:type="dxa"/>
+            <w:tcW w:w="3389" w:type="dxa"/>
             <w:tcBorders>
               <w:left w:val="single" w:sz="2" w:space="0" w:color="000000"/>
               <w:bottom w:val="single" w:sz="2" w:space="0" w:color="000000"/>
@@ -17369,7 +17886,7 @@
         </w:tc>
         <w:tc>
           <w:tcPr>
-            <w:tcW w:w="6256" w:type="dxa"/>
+            <w:tcW w:w="6257" w:type="dxa"/>
             <w:tcBorders>
               <w:left w:val="single" w:sz="2" w:space="0" w:color="000000"/>
               <w:bottom w:val="single" w:sz="2" w:space="0" w:color="000000"/>
@@ -17398,7 +17915,7 @@
         <w:trPr/>
         <w:tc>
           <w:tcPr>
-            <w:tcW w:w="3390" w:type="dxa"/>
+            <w:tcW w:w="3389" w:type="dxa"/>
             <w:tcBorders>
               <w:left w:val="single" w:sz="2" w:space="0" w:color="000000"/>
               <w:bottom w:val="single" w:sz="2" w:space="0" w:color="000000"/>
@@ -17423,7 +17940,7 @@
         </w:tc>
         <w:tc>
           <w:tcPr>
-            <w:tcW w:w="6256" w:type="dxa"/>
+            <w:tcW w:w="6257" w:type="dxa"/>
             <w:tcBorders>
               <w:left w:val="single" w:sz="2" w:space="0" w:color="000000"/>
               <w:bottom w:val="single" w:sz="2" w:space="0" w:color="000000"/>
@@ -17452,7 +17969,7 @@
         <w:trPr/>
         <w:tc>
           <w:tcPr>
-            <w:tcW w:w="3390" w:type="dxa"/>
+            <w:tcW w:w="3389" w:type="dxa"/>
             <w:tcBorders>
               <w:left w:val="single" w:sz="2" w:space="0" w:color="000000"/>
               <w:bottom w:val="single" w:sz="2" w:space="0" w:color="000000"/>
@@ -17477,7 +17994,7 @@
         </w:tc>
         <w:tc>
           <w:tcPr>
-            <w:tcW w:w="6256" w:type="dxa"/>
+            <w:tcW w:w="6257" w:type="dxa"/>
             <w:tcBorders>
               <w:left w:val="single" w:sz="2" w:space="0" w:color="000000"/>
               <w:bottom w:val="single" w:sz="2" w:space="0" w:color="000000"/>
@@ -17506,7 +18023,7 @@
         <w:trPr/>
         <w:tc>
           <w:tcPr>
-            <w:tcW w:w="3390" w:type="dxa"/>
+            <w:tcW w:w="3389" w:type="dxa"/>
             <w:tcBorders>
               <w:left w:val="single" w:sz="2" w:space="0" w:color="000000"/>
               <w:bottom w:val="single" w:sz="2" w:space="0" w:color="000000"/>
@@ -17531,7 +18048,7 @@
         </w:tc>
         <w:tc>
           <w:tcPr>
-            <w:tcW w:w="6256" w:type="dxa"/>
+            <w:tcW w:w="6257" w:type="dxa"/>
             <w:tcBorders>
               <w:left w:val="single" w:sz="2" w:space="0" w:color="000000"/>
               <w:bottom w:val="single" w:sz="2" w:space="0" w:color="000000"/>
@@ -17560,7 +18077,7 @@
         <w:trPr/>
         <w:tc>
           <w:tcPr>
-            <w:tcW w:w="3390" w:type="dxa"/>
+            <w:tcW w:w="3389" w:type="dxa"/>
             <w:tcBorders>
               <w:left w:val="single" w:sz="2" w:space="0" w:color="000000"/>
               <w:bottom w:val="single" w:sz="2" w:space="0" w:color="000000"/>
@@ -17585,7 +18102,7 @@
         </w:tc>
         <w:tc>
           <w:tcPr>
-            <w:tcW w:w="6256" w:type="dxa"/>
+            <w:tcW w:w="6257" w:type="dxa"/>
             <w:tcBorders>
               <w:left w:val="single" w:sz="2" w:space="0" w:color="000000"/>
               <w:bottom w:val="single" w:sz="2" w:space="0" w:color="000000"/>
@@ -17614,7 +18131,7 @@
         <w:trPr/>
         <w:tc>
           <w:tcPr>
-            <w:tcW w:w="3390" w:type="dxa"/>
+            <w:tcW w:w="3389" w:type="dxa"/>
             <w:tcBorders>
               <w:left w:val="single" w:sz="2" w:space="0" w:color="000000"/>
               <w:bottom w:val="single" w:sz="2" w:space="0" w:color="000000"/>
@@ -17639,7 +18156,7 @@
         </w:tc>
         <w:tc>
           <w:tcPr>
-            <w:tcW w:w="6256" w:type="dxa"/>
+            <w:tcW w:w="6257" w:type="dxa"/>
             <w:tcBorders>
               <w:left w:val="single" w:sz="2" w:space="0" w:color="000000"/>
               <w:bottom w:val="single" w:sz="2" w:space="0" w:color="000000"/>
@@ -17668,7 +18185,7 @@
         <w:trPr/>
         <w:tc>
           <w:tcPr>
-            <w:tcW w:w="3390" w:type="dxa"/>
+            <w:tcW w:w="3389" w:type="dxa"/>
             <w:tcBorders>
               <w:left w:val="single" w:sz="2" w:space="0" w:color="000000"/>
               <w:bottom w:val="single" w:sz="2" w:space="0" w:color="000000"/>
@@ -17694,7 +18211,7 @@
         </w:tc>
         <w:tc>
           <w:tcPr>
-            <w:tcW w:w="6256" w:type="dxa"/>
+            <w:tcW w:w="6257" w:type="dxa"/>
             <w:tcBorders>
               <w:left w:val="single" w:sz="2" w:space="0" w:color="000000"/>
               <w:bottom w:val="single" w:sz="2" w:space="0" w:color="000000"/>
@@ -17725,7 +18242,7 @@
         <w:trPr/>
         <w:tc>
           <w:tcPr>
-            <w:tcW w:w="3390" w:type="dxa"/>
+            <w:tcW w:w="3389" w:type="dxa"/>
             <w:tcBorders>
               <w:left w:val="single" w:sz="2" w:space="0" w:color="000000"/>
               <w:bottom w:val="single" w:sz="2" w:space="0" w:color="000000"/>
@@ -17752,7 +18269,7 @@
         </w:tc>
         <w:tc>
           <w:tcPr>
-            <w:tcW w:w="6256" w:type="dxa"/>
+            <w:tcW w:w="6257" w:type="dxa"/>
             <w:tcBorders>
               <w:left w:val="single" w:sz="2" w:space="0" w:color="000000"/>
               <w:bottom w:val="single" w:sz="2" w:space="0" w:color="000000"/>
@@ -18957,16 +19474,42 @@
     <w:p>
       <w:pPr>
         <w:pStyle w:val="Brdtekst"/>
-        <w:rPr>
+        <w:rPr/>
+      </w:pPr>
+      <w:r>
+        <w:rPr>
+          <w:rFonts w:cs="Verdana" w:ascii="Verdana" w:hAnsi="Verdana"/>
+          <w:color w:val="000000"/>
+        </w:rPr>
+        <w:t>Fra og med version</w:t>
+      </w:r>
+      <w:r>
+        <w:rPr>
+          <w:rFonts w:cs="Verdana" w:ascii="Verdana" w:hAnsi="Verdana"/>
           <w:color w:val="C9211E"/>
         </w:rPr>
-      </w:pPr>
-      <w:r>
-        <w:rPr>
-          <w:rFonts w:cs="Verdana" w:ascii="Verdana" w:hAnsi="Verdana"/>
-          <w:color w:val="000000"/>
-        </w:rPr>
-        <w:t>Fra og med version 5.0.0.0 er IBOS Nodelæser desuden lokaliseret til hollandsk!</w:t>
+        <w:t xml:space="preserve"> </w:t>
+      </w:r>
+      <w:r>
+        <w:rPr>
+          <w:rFonts w:cs="Verdana" w:ascii="Verdana" w:hAnsi="Verdana"/>
+          <w:color w:val="C9211E"/>
+        </w:rPr>
+        <w:t>4</w:t>
+      </w:r>
+      <w:r>
+        <w:rPr>
+          <w:rFonts w:cs="Verdana" w:ascii="Verdana" w:hAnsi="Verdana"/>
+          <w:color w:val="C9211E"/>
+        </w:rPr>
+        <w:t xml:space="preserve">.0.0.0 </w:t>
+      </w:r>
+      <w:r>
+        <w:rPr>
+          <w:rFonts w:cs="Verdana" w:ascii="Verdana" w:hAnsi="Verdana"/>
+          <w:color w:val="000000"/>
+        </w:rPr>
+        <w:t>er IBOS Nodelæser desuden lokaliseret til hollandsk!</w:t>
       </w:r>
     </w:p>
     <w:p>
@@ -19318,7 +19861,7 @@
     </w:r>
     <w:r>
       <w:rPr/>
-      <w:t>26</w:t>
+      <w:t>7</w:t>
     </w:r>
     <w:r>
       <w:rPr/>
@@ -20657,7 +21200,7 @@
     <w:qFormat/>
     <w:pPr>
       <w:widowControl/>
-      <w:overflowPunct w:val="true"/>
+      <w:overflowPunct w:val="false"/>
       <w:bidi w:val="0"/>
       <w:jc w:val="left"/>
     </w:pPr>

</xml_diff>